<commit_message>
fix(finiquitos): ajusta plantilla PDF, fecha de pago habil, ISR separado y firma
</commit_message>
<xml_diff>
--- a/docx_templates/FINIQUITO FORMATO.docx
+++ b/docx_templates/FINIQUITO FORMATO.docx
@@ -6,11 +6,48 @@
       <w:pPr>
         <w:pStyle w:val="Textoindependiente"/>
         <w:spacing w:before="12"/>
-        <w:ind w:right="340"/>
-        <w:jc w:val="right"/>
+        <w:ind w:left="4320"/>
       </w:pPr>
       <w:r>
-        <w:t>{lugar_emision}, {estado_emision} a {fecha_emision_larga}.</w:t>
+        <w:t xml:space="preserve">             </w:t>
+      </w:r>
+      <w:r>
+        <w:t>{</w:t>
+      </w:r>
+      <w:proofErr w:type="spellStart"/>
+      <w:r>
+        <w:t>lugar_emision</w:t>
+      </w:r>
+      <w:proofErr w:type="spellEnd"/>
+      <w:r>
+        <w:t>}, {</w:t>
+      </w:r>
+      <w:proofErr w:type="spellStart"/>
+      <w:r>
+        <w:t>estado_emision</w:t>
+      </w:r>
+      <w:proofErr w:type="spellEnd"/>
+      <w:r>
+        <w:t>} a {</w:t>
+      </w:r>
+      <w:proofErr w:type="spellStart"/>
+      <w:r>
+        <w:t>fecha_emision_larga</w:t>
+      </w:r>
+      <w:proofErr w:type="spellEnd"/>
+      <w:r>
+        <w:t>}.</w:t>
+      </w:r>
+    </w:p>
+    <w:p>
+      <w:pPr>
+        <w:pStyle w:val="Textoindependiente"/>
+        <w:spacing w:before="120"/>
+        <w:ind w:left="513" w:right="873"/>
+        <w:jc w:val="both"/>
+      </w:pPr>
+      <w:r>
+        <w:t xml:space="preserve">Las partes acuerdan que dicha cantidad será cubierta a más tardar el día {fecha_limite_pago}.</w:t>
       </w:r>
     </w:p>
     <w:p>
@@ -25,11 +62,78 @@
     <w:p>
       <w:pPr>
         <w:pStyle w:val="Textoindependiente"/>
-        <w:ind w:left="170" w:right="397"/>
+        <w:ind w:left="465" w:right="873"/>
         <w:jc w:val="both"/>
       </w:pPr>
       <w:r>
-        <w:t xml:space="preserve">La empresa RAFAEL ALEJANDRO VILLALOBOS GARZA, con domicilio en CALLE CASSINO 1216, CUMBRES SAN AGUSTÍN 2DO SECTOR 2DA ETAPA, reconoce adeudar a la persona trabajadora la cantidad de </w:t>
+        <w:t>Recibí de la</w:t>
+      </w:r>
+      <w:r>
+        <w:rPr>
+          <w:spacing w:val="-2"/>
+        </w:rPr>
+        <w:t xml:space="preserve"> </w:t>
+      </w:r>
+      <w:r>
+        <w:t xml:space="preserve">empresa </w:t>
+      </w:r>
+      <w:r>
+        <w:rPr>
+          <w:b/>
+          <w:bCs/>
+        </w:rPr>
+        <w:t>RAFAEL</w:t>
+      </w:r>
+      <w:r>
+        <w:rPr>
+          <w:b/>
+          <w:bCs/>
+          <w:spacing w:val="-7"/>
+        </w:rPr>
+        <w:t xml:space="preserve"> </w:t>
+      </w:r>
+      <w:r>
+        <w:rPr>
+          <w:b/>
+          <w:bCs/>
+        </w:rPr>
+        <w:t>ALEJANDRO VILLALOBOS GARZA</w:t>
+      </w:r>
+      <w:r>
+        <w:rPr>
+          <w:spacing w:val="-10"/>
+        </w:rPr>
+        <w:t xml:space="preserve"> </w:t>
+      </w:r>
+      <w:r>
+        <w:t>con domicilio en</w:t>
+      </w:r>
+      <w:r>
+        <w:rPr>
+          <w:spacing w:val="40"/>
+        </w:rPr>
+        <w:t xml:space="preserve"> </w:t>
+      </w:r>
+      <w:r>
+        <w:t>CALLE CASSINO 1216 CUMBRES SAN AGUSTIN 2DO SECTOR 2DA</w:t>
+      </w:r>
+      <w:r>
+        <w:rPr>
+          <w:spacing w:val="-1"/>
+        </w:rPr>
+        <w:t xml:space="preserve"> </w:t>
+      </w:r>
+      <w:r>
+        <w:t>ETAPA</w:t>
+      </w:r>
+      <w:r>
+        <w:rPr>
+          <w:spacing w:val="-3"/>
+        </w:rPr>
+        <w:t xml:space="preserve"> </w:t>
+      </w:r>
+      <w:r>
+        <w:t xml:space="preserve">la cantidad de </w:t>
       </w:r>
       <w:r>
         <w:rPr>
@@ -37,41 +141,93 @@
           <w:bCs/>
           <w:u w:val="single"/>
         </w:rPr>
-        <w:t>${neto_p}</w:t>
-      </w:r>
-      <w:r>
-        <w:t xml:space="preserve"> {neto_pagar_letra} por concepto de finiquito, </w:t>
-      </w:r>
-      <w:r>
-        <w:t>l</w:t>
-      </w:r>
-      <w:r>
-        <w:t xml:space="preserve">as partes acuerdan que dicha cantidad </w:t>
-      </w:r>
-      <w:r>
-        <w:t>será cubierta a más tardar el día {fecha_limite_pago}</w:t>
-      </w:r>
-      <w:r>
-        <w:t>, teniéndose por cumplida la obligación de pago</w:t>
-      </w:r>
-      <w:r>
-        <w:t xml:space="preserve"> por medio de transferencia electrónica</w:t>
-      </w:r>
-      <w:r>
-        <w:t xml:space="preserve"> una vez que el importe quede efectivamente depositado o entregado a la persona trabajadora</w:t>
-      </w:r>
-      <w:r>
+        <w:t>$</w:t>
+      </w:r>
+      <w:r>
+        <w:rPr>
+          <w:rFonts w:ascii="Arial"/>
+          <w:b/>
+          <w:spacing w:val="-2"/>
+          <w:position w:val="2"/>
+          <w:sz w:val="18"/>
+        </w:rPr>
+        <w:t>{</w:t>
+      </w:r>
+      <w:proofErr w:type="spellStart"/>
+      <w:r>
+        <w:rPr>
+          <w:rFonts w:ascii="Arial"/>
+          <w:b/>
+          <w:spacing w:val="-2"/>
+          <w:position w:val="2"/>
+          <w:sz w:val="18"/>
+        </w:rPr>
+        <w:t>neto_p</w:t>
+      </w:r>
+      <w:proofErr w:type="spellEnd"/>
+      <w:r>
+        <w:rPr>
+          <w:rFonts w:ascii="Arial"/>
+          <w:b/>
+          <w:spacing w:val="-2"/>
+          <w:position w:val="2"/>
+          <w:sz w:val="18"/>
+        </w:rPr>
+        <w:t>}</w:t>
+      </w:r>
+      <w:r>
+        <w:rPr>
+          <w:rFonts w:ascii="Arial"/>
+          <w:b/>
+          <w:spacing w:val="-2"/>
+          <w:position w:val="2"/>
+          <w:sz w:val="18"/>
+        </w:rPr>
         <w:t xml:space="preserve"> </w:t>
       </w:r>
       <w:r>
-        <w:t xml:space="preserve">con motivo de la terminación de la relación laboral con fecha </w:t>
-      </w:r>
-      <w:r>
-        <w:t xml:space="preserve">del día </w:t>
-      </w:r>
-      <w:r>
-        <w:t>{fecha_letra}, importe que resulta de los conceptos que se desglosan a continuación.</w:t>
-      </w:r>
+        <w:t>{</w:t>
+      </w:r>
+      <w:proofErr w:type="spellStart"/>
+      <w:r>
+        <w:t>neto_pagar_letra</w:t>
+      </w:r>
+      <w:proofErr w:type="spellEnd"/>
+      <w:r>
+        <w:t>}</w:t>
+      </w:r>
+      <w:r>
+        <w:t xml:space="preserve"> </w:t>
+      </w:r>
+      <w:r>
+        <w:t>por</w:t>
+      </w:r>
+      <w:r>
+        <w:rPr>
+          <w:spacing w:val="40"/>
+        </w:rPr>
+        <w:t xml:space="preserve"> </w:t>
+      </w:r>
+      <w:r>
+        <w:t xml:space="preserve">concepto de mi finiquito, con motivo de la terminación de mi relación laboral con la empresa con fecha </w:t>
+      </w:r>
+      <w:r>
+        <w:t xml:space="preserve">del jueves </w:t>
+      </w:r>
+      <w:r>
+        <w:t xml:space="preserve">26 de </w:t>
+      </w:r>
+      <w:r>
+        <w:t>m</w:t>
+      </w:r>
+      <w:r>
+        <w:t>arzo de 2026, cantidad que resulta de los siguientes conceptos:</w:t>
+      </w:r>
+    </w:p>
+    <w:p>
+      <w:pPr>
+        <w:pStyle w:val="Textoindependiente"/>
+      </w:pPr>
     </w:p>
     <w:p>
       <w:pPr>
@@ -503,7 +659,23 @@
                 <w:color w:val="808080"/>
                 <w:sz w:val="18"/>
               </w:rPr>
-              <w:t>{c_isa}</w:t>
+              <w:t>{</w:t>
+            </w:r>
+            <w:proofErr w:type="spellStart"/>
+            <w:r>
+              <w:rPr>
+                <w:color w:val="808080"/>
+                <w:sz w:val="18"/>
+              </w:rPr>
+              <w:t>c_isa</w:t>
+            </w:r>
+            <w:proofErr w:type="spellEnd"/>
+            <w:r>
+              <w:rPr>
+                <w:color w:val="808080"/>
+                <w:sz w:val="18"/>
+              </w:rPr>
+              <w:t>}</w:t>
             </w:r>
           </w:p>
         </w:tc>
@@ -883,7 +1055,23 @@
                 <w:color w:val="808080"/>
                 <w:sz w:val="18"/>
               </w:rPr>
-              <w:t>{c_imes}</w:t>
+              <w:t>{</w:t>
+            </w:r>
+            <w:proofErr w:type="spellStart"/>
+            <w:r>
+              <w:rPr>
+                <w:color w:val="808080"/>
+                <w:sz w:val="18"/>
+              </w:rPr>
+              <w:t>c_imes</w:t>
+            </w:r>
+            <w:proofErr w:type="spellEnd"/>
+            <w:r>
+              <w:rPr>
+                <w:color w:val="808080"/>
+                <w:sz w:val="18"/>
+              </w:rPr>
+              <w:t>}</w:t>
             </w:r>
           </w:p>
         </w:tc>
@@ -910,6 +1098,139 @@
                 <w:sz w:val="18"/>
               </w:rPr>
               <w:t>{t10}</w:t>
+            </w:r>
+          </w:p>
+        </w:tc>
+      </w:tr>
+      <w:tr>
+        <w:trPr>
+          <w:trHeight w:val="252"/>
+        </w:trPr>
+        <w:tc>
+          <w:tcPr>
+            <w:tcW w:w="981" w:type="dxa"/>
+            <w:tcBorders>
+              <w:left w:val="single" w:sz="4" w:space="0" w:color="000000"/>
+            </w:tcBorders>
+          </w:tcPr>
+          <w:p>
+            <w:pPr>
+              <w:pStyle w:val="TableParagraph"/>
+              <w:spacing w:before="0" w:line="199" w:lineRule="exact"/>
+              <w:ind w:left="596"/>
+              <w:rPr>
+                <w:sz w:val="18"/>
+              </w:rPr>
+            </w:pPr>
+          </w:p>
+        </w:tc>
+        <w:tc>
+          <w:tcPr>
+            <w:tcW w:w="3042" w:type="dxa"/>
+          </w:tcPr>
+          <w:p>
+            <w:pPr>
+              <w:pStyle w:val="TableParagraph"/>
+              <w:spacing w:before="0" w:line="199" w:lineRule="exact"/>
+              <w:ind w:left="88"/>
+              <w:rPr>
+                <w:sz w:val="18"/>
+              </w:rPr>
+            </w:pPr>
+          </w:p>
+        </w:tc>
+        <w:tc>
+          <w:tcPr>
+            <w:tcW w:w="1765" w:type="dxa"/>
+            <w:tcBorders>
+              <w:right w:val="single" w:sz="4" w:space="0" w:color="000000"/>
+            </w:tcBorders>
+          </w:tcPr>
+          <w:p>
+            <w:pPr>
+              <w:pStyle w:val="TableParagraph"/>
+              <w:spacing w:before="0" w:line="199" w:lineRule="exact"/>
+              <w:ind w:right="21"/>
+              <w:jc w:val="right"/>
+              <w:rPr>
+                <w:sz w:val="18"/>
+              </w:rPr>
+            </w:pPr>
+          </w:p>
+        </w:tc>
+        <w:tc>
+          <w:tcPr>
+            <w:tcW w:w="715" w:type="dxa"/>
+            <w:tcBorders>
+              <w:left w:val="single" w:sz="4" w:space="0" w:color="000000"/>
+            </w:tcBorders>
+          </w:tcPr>
+          <w:p>
+            <w:pPr>
+              <w:pStyle w:val="TableParagraph"/>
+              <w:spacing w:before="0" w:line="199" w:lineRule="exact"/>
+              <w:ind w:right="177"/>
+              <w:jc w:val="right"/>
+              <w:rPr>
+                <w:sz w:val="18"/>
+              </w:rPr>
+            </w:pPr>
+            <w:r>
+              <w:rPr>
+                <w:color w:val="808080"/>
+                <w:spacing w:val="-5"/>
+                <w:sz w:val="18"/>
+              </w:rPr>
+              <w:t>{n_sep}</w:t>
+            </w:r>
+          </w:p>
+        </w:tc>
+        <w:tc>
+          <w:tcPr>
+            <w:tcW w:w="2801" w:type="dxa"/>
+          </w:tcPr>
+          <w:p>
+            <w:pPr>
+              <w:pStyle w:val="TableParagraph"/>
+              <w:spacing w:before="0" w:line="199" w:lineRule="exact"/>
+              <w:ind w:left="89"/>
+              <w:rPr>
+                <w:sz w:val="18"/>
+              </w:rPr>
+            </w:pPr>
+            <w:r>
+              <w:rPr>
+                <w:color w:val="808080"/>
+                <w:sz w:val="18"/>
+              </w:rPr>
+              <w:t>{c_sep}</w:t>
+            </w:r>
+          </w:p>
+        </w:tc>
+        <w:tc>
+          <w:tcPr>
+            <w:tcW w:w="1344" w:type="dxa"/>
+            <w:tcBorders>
+              <w:right w:val="single" w:sz="4" w:space="0" w:color="000000"/>
+            </w:tcBorders>
+          </w:tcPr>
+          <w:p>
+            <w:pPr>
+              <w:pStyle w:val="TableParagraph"/>
+              <w:spacing w:before="0" w:line="199" w:lineRule="exact"/>
+              <w:ind w:right="26"/>
+              <w:jc w:val="right"/>
+              <w:rPr>
+                <w:sz w:val="18"/>
+              </w:rPr>
+            </w:pPr>
+            <w:r>
+              <w:rPr>
+                <w:color w:val="808080"/>
+                <w:spacing w:val="-2"/>
+                <w:sz w:val="18"/>
+              </w:rPr>
+              <w:t>{t_sep}</w:t>
             </w:r>
           </w:p>
         </w:tc>
@@ -1058,23 +1379,7 @@
                 <w:spacing w:val="-5"/>
                 <w:sz w:val="18"/>
               </w:rPr>
-              <w:t>{n</w:t>
-            </w:r>
-            <w:r>
-              <w:rPr>
-                <w:color w:val="808080"/>
-                <w:spacing w:val="-5"/>
-                <w:sz w:val="18"/>
-              </w:rPr>
-              <w:t>d</w:t>
-            </w:r>
-            <w:r>
-              <w:rPr>
-                <w:color w:val="808080"/>
-                <w:spacing w:val="-5"/>
-                <w:sz w:val="18"/>
-              </w:rPr>
-              <w:t>}</w:t>
+              <w:t>99</w:t>
             </w:r>
           </w:p>
         </w:tc>
@@ -1095,21 +1400,38 @@
                 <w:color w:val="808080"/>
                 <w:sz w:val="18"/>
               </w:rPr>
-              <w:t>{c</w:t>
-            </w:r>
-            <w:r>
-              <w:rPr>
-                <w:color w:val="808080"/>
-                <w:sz w:val="18"/>
-              </w:rPr>
-              <w:t>d</w:t>
-            </w:r>
-            <w:r>
-              <w:rPr>
-                <w:color w:val="808080"/>
-                <w:sz w:val="18"/>
-              </w:rPr>
-              <w:t>}</w:t>
+              <w:t>Ajuste</w:t>
+            </w:r>
+            <w:r>
+              <w:rPr>
+                <w:color w:val="808080"/>
+                <w:spacing w:val="-1"/>
+                <w:sz w:val="18"/>
+              </w:rPr>
+              <w:t xml:space="preserve"> </w:t>
+            </w:r>
+            <w:r>
+              <w:rPr>
+                <w:color w:val="808080"/>
+                <w:sz w:val="18"/>
+              </w:rPr>
+              <w:t>al</w:t>
+            </w:r>
+            <w:r>
+              <w:rPr>
+                <w:color w:val="808080"/>
+                <w:spacing w:val="-2"/>
+                <w:sz w:val="18"/>
+              </w:rPr>
+              <w:t xml:space="preserve"> </w:t>
+            </w:r>
+            <w:r>
+              <w:rPr>
+                <w:color w:val="808080"/>
+                <w:spacing w:val="-4"/>
+                <w:sz w:val="18"/>
+              </w:rPr>
+              <w:t>neto</w:t>
             </w:r>
           </w:p>
         </w:tc>
@@ -1135,7 +1457,7 @@
                 <w:spacing w:val="-4"/>
                 <w:sz w:val="18"/>
               </w:rPr>
-              <w:t>{t11d}</w:t>
+              <w:t>{t11}</w:t>
             </w:r>
           </w:p>
         </w:tc>
@@ -1327,7 +1649,23 @@
                 <w:color w:val="808080"/>
                 <w:sz w:val="18"/>
               </w:rPr>
-              <w:t>{c_pant}</w:t>
+              <w:t>{</w:t>
+            </w:r>
+            <w:proofErr w:type="spellStart"/>
+            <w:r>
+              <w:rPr>
+                <w:color w:val="808080"/>
+                <w:sz w:val="18"/>
+              </w:rPr>
+              <w:t>c_pant</w:t>
+            </w:r>
+            <w:proofErr w:type="spellEnd"/>
+            <w:r>
+              <w:rPr>
+                <w:color w:val="808080"/>
+                <w:sz w:val="18"/>
+              </w:rPr>
+              <w:t>}</w:t>
             </w:r>
           </w:p>
         </w:tc>
@@ -1437,14 +1775,6 @@
                 <w:sz w:val="18"/>
               </w:rPr>
             </w:pPr>
-            <w:r>
-              <w:rPr>
-                <w:color w:val="808080"/>
-                <w:spacing w:val="-5"/>
-                <w:sz w:val="18"/>
-              </w:rPr>
-              <w:t>{np}</w:t>
-            </w:r>
           </w:p>
         </w:tc>
         <w:tc>
@@ -1462,13 +1792,6 @@
                 <w:sz w:val="18"/>
               </w:rPr>
             </w:pPr>
-            <w:r>
-              <w:rPr>
-                <w:color w:val="808080"/>
-                <w:sz w:val="18"/>
-              </w:rPr>
-              <w:t>{cp}</w:t>
-            </w:r>
           </w:p>
         </w:tc>
         <w:tc>
@@ -1488,14 +1811,6 @@
                 <w:sz w:val="18"/>
               </w:rPr>
             </w:pPr>
-            <w:r>
-              <w:rPr>
-                <w:color w:val="808080"/>
-                <w:spacing w:val="-4"/>
-                <w:sz w:val="18"/>
-              </w:rPr>
-              <w:t>{t11p}</w:t>
-            </w:r>
           </w:p>
         </w:tc>
         <w:tc>
@@ -1551,7 +1866,7 @@
       </w:tr>
       <w:tr>
         <w:trPr>
-          <w:trHeight w:val="3303"/>
+          <w:trHeight w:val="2600"/>
         </w:trPr>
         <w:tc>
           <w:tcPr>
@@ -1583,11 +1898,36 @@
           <w:p>
             <w:pPr>
               <w:pStyle w:val="TableParagraph"/>
-              <w:ind w:left="87"/>
-              <w:rPr>
-                <w:sz w:val="18"/>
-              </w:rPr>
-            </w:pPr>
+              <w:spacing w:before="240"/>
+              <w:ind w:left="0"/>
+              <w:jc w:val="center"/>
+              <w:rPr>
+                <w:sz w:val="18"/>
+              </w:rPr>
+            </w:pPr>
+            <w:r>
+              <w:rPr>
+                <w:sz w:val="18"/>
+              </w:rPr>
+              <w:t xml:space="preserve">________________________________________</w:t>
+            </w:r>
+          </w:p>
+          <w:p>
+            <w:pPr>
+              <w:pStyle w:val="TableParagraph"/>
+              <w:spacing w:before="200" w:after="0" w:line="276" w:lineRule="atLeast"/>
+              <w:ind w:left="0"/>
+              <w:jc w:val="center"/>
+              <w:rPr>
+                <w:sz w:val="17"/>
+              </w:rPr>
+            </w:pPr>
+            <w:r>
+              <w:rPr>
+                <w:sz w:val="17"/>
+              </w:rPr>
+              <w:t>{empleado_nombre_completo}</w:t>
+            </w:r>
           </w:p>
         </w:tc>
         <w:tc>
@@ -1799,7 +2139,29 @@
                 <w:position w:val="3"/>
                 <w:sz w:val="18"/>
               </w:rPr>
-              <w:t>{suma_p}</w:t>
+              <w:t>{</w:t>
+            </w:r>
+            <w:proofErr w:type="spellStart"/>
+            <w:r>
+              <w:rPr>
+                <w:rFonts w:ascii="Arial"/>
+                <w:b/>
+                <w:spacing w:val="-2"/>
+                <w:position w:val="3"/>
+                <w:sz w:val="18"/>
+              </w:rPr>
+              <w:t>suma_p</w:t>
+            </w:r>
+            <w:proofErr w:type="spellEnd"/>
+            <w:r>
+              <w:rPr>
+                <w:rFonts w:ascii="Arial"/>
+                <w:b/>
+                <w:spacing w:val="-2"/>
+                <w:position w:val="3"/>
+                <w:sz w:val="18"/>
+              </w:rPr>
+              <w:t>}</w:t>
             </w:r>
           </w:p>
         </w:tc>
@@ -1815,7 +2177,7 @@
             <w:pPr>
               <w:pStyle w:val="TableParagraph"/>
               <w:tabs>
-                <w:tab w:val="left" w:pos="3638"/>
+                <w:tab w:val="left" w:pos="4786"/>
               </w:tabs>
               <w:spacing w:before="45"/>
               <w:ind w:right="120"/>
@@ -1903,7 +2265,29 @@
                 <w:position w:val="2"/>
                 <w:sz w:val="18"/>
               </w:rPr>
-              <w:t>{suma_d}</w:t>
+              <w:t>{</w:t>
+            </w:r>
+            <w:proofErr w:type="spellStart"/>
+            <w:r>
+              <w:rPr>
+                <w:rFonts w:ascii="Arial"/>
+                <w:b/>
+                <w:spacing w:val="-2"/>
+                <w:position w:val="2"/>
+                <w:sz w:val="18"/>
+              </w:rPr>
+              <w:t>suma_d</w:t>
+            </w:r>
+            <w:proofErr w:type="spellEnd"/>
+            <w:r>
+              <w:rPr>
+                <w:rFonts w:ascii="Arial"/>
+                <w:b/>
+                <w:spacing w:val="-2"/>
+                <w:position w:val="2"/>
+                <w:sz w:val="18"/>
+              </w:rPr>
+              <w:t>}</w:t>
             </w:r>
           </w:p>
         </w:tc>
@@ -1942,7 +2326,7 @@
             <w:pPr>
               <w:pStyle w:val="TableParagraph"/>
               <w:tabs>
-                <w:tab w:val="left" w:pos="2611"/>
+                <w:tab w:val="left" w:pos="4786"/>
               </w:tabs>
               <w:spacing w:before="83"/>
               <w:ind w:right="126"/>
@@ -1954,6 +2338,7 @@
                 <w:sz w:val="18"/>
               </w:rPr>
             </w:pPr>
+            <w:proofErr w:type="gramStart"/>
             <w:r>
               <w:rPr>
                 <w:rFonts w:ascii="Arial"/>
@@ -1996,6 +2381,7 @@
               </w:rPr>
               <w:t>Pagar</w:t>
             </w:r>
+            <w:proofErr w:type="gramEnd"/>
             <w:r>
               <w:rPr>
                 <w:rFonts w:ascii="Arial"/>
@@ -2030,7 +2416,29 @@
                 <w:position w:val="2"/>
                 <w:sz w:val="18"/>
               </w:rPr>
-              <w:t>{neto_p}</w:t>
+              <w:t>{</w:t>
+            </w:r>
+            <w:proofErr w:type="spellStart"/>
+            <w:r>
+              <w:rPr>
+                <w:rFonts w:ascii="Arial"/>
+                <w:b/>
+                <w:spacing w:val="-2"/>
+                <w:position w:val="2"/>
+                <w:sz w:val="18"/>
+              </w:rPr>
+              <w:t>neto_p</w:t>
+            </w:r>
+            <w:proofErr w:type="spellEnd"/>
+            <w:r>
+              <w:rPr>
+                <w:rFonts w:ascii="Arial"/>
+                <w:b/>
+                <w:spacing w:val="-2"/>
+                <w:position w:val="2"/>
+                <w:sz w:val="18"/>
+              </w:rPr>
+              <w:t>}</w:t>
             </w:r>
           </w:p>
         </w:tc>
@@ -2039,28 +2447,237 @@
     <w:p>
       <w:pPr>
         <w:pStyle w:val="Textoindependiente"/>
-        <w:spacing w:before="180"/>
-        <w:ind w:left="170" w:right="340"/>
+        <w:ind w:left="513" w:right="873"/>
         <w:jc w:val="both"/>
       </w:pPr>
-      <w:r>
-        <w:t>Así mismo, una vez cubierto en su totalidad el importe antes señalado, la persona trabajadora manifiesta que no se le adeuda cantidad alguna por concepto de salarios devengados, diferencias de salario, participación de utilidades, comisiones, horas extras, vacaciones, séptimos días, días festivos, prima dominical, prima vacacional, prima de antigüedad y demás prestaciones que deriven de la relación laboral, al haber quedado comprendidas y liquidadas en los términos del presente finiquito.</w:t>
-      </w:r>
-      <w:r>
-        <w:t xml:space="preserve"> </w:t>
-      </w:r>
-      <w:r>
-        <w:t>De igual forma, para todos los efectos legales conducentes, la persona trabajadora manifiesta que durante la vigencia de la relación laboral no fue objeto de riesgo profesional alguno no reportado, por lo que, una vez realizado el pago total del finiquito, otorga el más amplio recibo y finiquito que en derecho proceda respecto de las obligaciones laborales y de seguridad social derivadas de dicha relación.</w:t>
-      </w:r>
     </w:p>
     <w:p>
       <w:pPr>
         <w:pStyle w:val="Textoindependiente"/>
-        <w:ind w:right="195"/>
-        <w:jc w:val="center"/>
+        <w:ind w:left="513" w:right="873"/>
+        <w:jc w:val="both"/>
+      </w:pPr>
+    </w:p>
+    <w:p>
+      <w:pPr>
+        <w:pStyle w:val="Textoindependiente"/>
+        <w:ind w:left="513" w:right="873"/>
+        <w:jc w:val="both"/>
+      </w:pPr>
+      <w:r>
+        <w:t xml:space="preserve">Así mismo manifiesto que hasta el momento en que se da por terminada la relación laboral no se me adeuda ninguna cantidad de dinero por concepto de salarios devengados, diferencia de </w:t>
+      </w:r>
+      <w:proofErr w:type="gramStart"/>
+      <w:r>
+        <w:t>los mismos</w:t>
+      </w:r>
+      <w:proofErr w:type="gramEnd"/>
+      <w:r>
+        <w:t>, participación de utilidades, comisiones, horas extras, vacaciones, séptimos días, días festivos, prima dominical, vacacional y de antigüedad, y</w:t>
+      </w:r>
+      <w:r>
         <w:rPr>
-          <w:spacing w:val="-2"/>
+          <w:spacing w:val="-4"/>
         </w:rPr>
+        <w:t xml:space="preserve"> </w:t>
+      </w:r>
+      <w:r>
+        <w:t>demás prestaciones que otorga la Ley</w:t>
+      </w:r>
+      <w:r>
+        <w:rPr>
+          <w:spacing w:val="40"/>
+        </w:rPr>
+        <w:t xml:space="preserve"> </w:t>
+      </w:r>
+      <w:r>
+        <w:t>Federal Del Trabajo, ya que las mismas siempre me fueron</w:t>
+      </w:r>
+      <w:r>
+        <w:rPr>
+          <w:spacing w:val="-1"/>
+        </w:rPr>
+        <w:t xml:space="preserve"> </w:t>
+      </w:r>
+      <w:r>
+        <w:t>íntegramente</w:t>
+      </w:r>
+      <w:r>
+        <w:rPr>
+          <w:spacing w:val="-1"/>
+        </w:rPr>
+        <w:t xml:space="preserve"> </w:t>
+      </w:r>
+      <w:r>
+        <w:t>cubiertas en los términos de</w:t>
+      </w:r>
+      <w:r>
+        <w:rPr>
+          <w:spacing w:val="-1"/>
+        </w:rPr>
+        <w:t xml:space="preserve"> </w:t>
+      </w:r>
+      <w:r>
+        <w:t>la</w:t>
+      </w:r>
+      <w:r>
+        <w:rPr>
+          <w:spacing w:val="-1"/>
+        </w:rPr>
+        <w:t xml:space="preserve"> </w:t>
+      </w:r>
+      <w:r>
+        <w:t>ley. También hago constar para</w:t>
+      </w:r>
+      <w:r>
+        <w:rPr>
+          <w:spacing w:val="-1"/>
+        </w:rPr>
+        <w:t xml:space="preserve"> </w:t>
+      </w:r>
+      <w:r>
+        <w:t>todos los efectos legales conducentes,</w:t>
+      </w:r>
+      <w:r>
+        <w:rPr>
+          <w:spacing w:val="40"/>
+        </w:rPr>
+        <w:t xml:space="preserve"> </w:t>
+      </w:r>
+      <w:r>
+        <w:t>que durante</w:t>
+      </w:r>
+      <w:r>
+        <w:rPr>
+          <w:spacing w:val="40"/>
+        </w:rPr>
+        <w:t xml:space="preserve"> </w:t>
+      </w:r>
+      <w:r>
+        <w:t>la vigencia de</w:t>
+      </w:r>
+      <w:r>
+        <w:rPr>
+          <w:spacing w:val="40"/>
+        </w:rPr>
+        <w:t xml:space="preserve"> </w:t>
+      </w:r>
+      <w:r>
+        <w:t>mi relación</w:t>
+      </w:r>
+      <w:r>
+        <w:rPr>
+          <w:spacing w:val="40"/>
+        </w:rPr>
+        <w:t xml:space="preserve"> </w:t>
+      </w:r>
+      <w:r>
+        <w:t>obrero-patronal</w:t>
+      </w:r>
+      <w:r>
+        <w:rPr>
+          <w:spacing w:val="40"/>
+        </w:rPr>
+        <w:t xml:space="preserve"> </w:t>
+      </w:r>
+      <w:r>
+        <w:t>no</w:t>
+      </w:r>
+      <w:r>
+        <w:rPr>
+          <w:spacing w:val="40"/>
+        </w:rPr>
+        <w:t xml:space="preserve"> </w:t>
+      </w:r>
+      <w:r>
+        <w:t>fui</w:t>
+      </w:r>
+      <w:r>
+        <w:rPr>
+          <w:spacing w:val="40"/>
+        </w:rPr>
+        <w:t xml:space="preserve"> </w:t>
+      </w:r>
+      <w:r>
+        <w:t>objeto de riesgo</w:t>
+      </w:r>
+      <w:r>
+        <w:rPr>
+          <w:spacing w:val="40"/>
+        </w:rPr>
+        <w:t xml:space="preserve"> </w:t>
+      </w:r>
+      <w:r>
+        <w:t>profesional alguno,</w:t>
+      </w:r>
+      <w:r>
+        <w:rPr>
+          <w:spacing w:val="40"/>
+        </w:rPr>
+        <w:t xml:space="preserve"> </w:t>
+      </w:r>
+      <w:r>
+        <w:t>motivo por el</w:t>
+      </w:r>
+      <w:r>
+        <w:rPr>
+          <w:spacing w:val="40"/>
+        </w:rPr>
+        <w:t xml:space="preserve"> </w:t>
+      </w:r>
+      <w:r>
+        <w:t>cual libero a mi</w:t>
+      </w:r>
+      <w:r>
+        <w:rPr>
+          <w:spacing w:val="40"/>
+        </w:rPr>
+        <w:t xml:space="preserve"> </w:t>
+      </w:r>
+      <w:r>
+        <w:t>patrón de</w:t>
+      </w:r>
+      <w:r>
+        <w:rPr>
+          <w:spacing w:val="40"/>
+        </w:rPr>
+        <w:t xml:space="preserve"> </w:t>
+      </w:r>
+      <w:r>
+        <w:t>toda responsabilidad</w:t>
+      </w:r>
+      <w:r>
+        <w:rPr>
+          <w:spacing w:val="40"/>
+        </w:rPr>
+        <w:t xml:space="preserve"> </w:t>
+      </w:r>
+      <w:r>
+        <w:t>laboral</w:t>
+      </w:r>
+      <w:r>
+        <w:rPr>
+          <w:spacing w:val="40"/>
+        </w:rPr>
+        <w:t xml:space="preserve"> </w:t>
+      </w:r>
+      <w:r>
+        <w:t>y de seguridad social o de cualquier</w:t>
+      </w:r>
+      <w:r>
+        <w:rPr>
+          <w:spacing w:val="40"/>
+        </w:rPr>
+        <w:t xml:space="preserve"> </w:t>
+      </w:r>
+      <w:r>
+        <w:t>otro concepto derivado del contrato de trabajo.</w:t>
+      </w:r>
+    </w:p>
+    <w:p>
+      <w:pPr>
+        <w:pStyle w:val="Textoindependiente"/>
+        <w:spacing w:before="180"/>
       </w:pPr>
     </w:p>
     <w:p>
@@ -2068,30 +2685,20 @@
         <w:pStyle w:val="Textoindependiente"/>
         <w:ind w:right="195"/>
         <w:jc w:val="center"/>
+      </w:pPr>
+      <w:r>
         <w:rPr>
-          <w:b/>
-          <w:bCs/>
-        </w:rPr>
-      </w:pPr>
-      <w:r>
-        <w:rPr>
-          <w:b/>
-          <w:bCs/>
           <w:spacing w:val="-2"/>
         </w:rPr>
         <w:t>ATENTAMENTE</w:t>
       </w:r>
     </w:p>
     <w:sectPr>
-      <w:headerReference w:type="even" r:id="rId6"/>
-      <w:headerReference w:type="default" r:id="rId7"/>
-      <w:footerReference w:type="even" r:id="rId8"/>
-      <w:footerReference w:type="default" r:id="rId9"/>
-      <w:headerReference w:type="first" r:id="rId10"/>
-      <w:footerReference w:type="first" r:id="rId11"/>
+      <w:headerReference w:type="default" r:id="rId6"/>
+      <w:footerReference w:type="default" r:id="rId7"/>
       <w:type w:val="continuous"/>
       <w:pgSz w:w="12240" w:h="15840"/>
-      <w:pgMar w:top="1880" w:right="360" w:bottom="1020" w:left="720" w:header="912" w:footer="827" w:gutter="0"/>
+      <w:pgMar w:top="1440" w:right="360" w:bottom="1020" w:left="720" w:header="708" w:footer="827" w:gutter="0"/>
       <w:pgNumType w:start="1"/>
       <w:cols w:space="720"/>
     </w:sectPr>
@@ -2119,16 +2726,6 @@
 </file>
 
 <file path=word/footer1.xml><?xml version="1.0" encoding="utf-8"?>
-<w:ftr xmlns:wpc="http://schemas.microsoft.com/office/word/2010/wordprocessingCanvas" xmlns:cx="http://schemas.microsoft.com/office/drawing/2014/chartex" xmlns:cx1="http://schemas.microsoft.com/office/drawing/2015/9/8/chartex" xmlns:cx2="http://schemas.microsoft.com/office/drawing/2015/10/21/chartex" xmlns:cx3="http://schemas.microsoft.com/office/drawing/2016/5/9/chartex" xmlns:cx4="http://schemas.microsoft.com/office/drawing/2016/5/10/chartex" xmlns:cx5="http://schemas.microsoft.com/office/drawing/2016/5/11/chartex" xmlns:cx6="http://schemas.microsoft.com/office/drawing/2016/5/12/chartex" xmlns:cx7="http://schemas.microsoft.com/office/drawing/2016/5/13/chartex" xmlns:cx8="http://schemas.microsoft.com/office/drawing/2016/5/14/chartex" xmlns:mc="http://schemas.openxmlformats.org/markup-compatibility/2006" xmlns:aink="http://schemas.microsoft.com/office/drawing/2016/ink" xmlns:am3d="http://schemas.microsoft.com/office/drawing/2017/model3d" xmlns:o="urn:schemas-microsoft-com:office:office" xmlns:oel="http://schemas.microsoft.com/office/2019/extlst" xmlns:r="http://schemas.openxmlformats.org/officeDocument/2006/relationships" xmlns:m="http://schemas.openxmlformats.org/officeDocument/2006/math" xmlns:v="urn:schemas-microsoft-com:vml" xmlns:wp14="http://schemas.microsoft.com/office/word/2010/wordprocessingDrawing" xmlns:wp="http://schemas.openxmlformats.org/drawingml/2006/wordprocessingDrawing" xmlns:w10="urn:schemas-microsoft-com:office:word" xmlns:w="http://schemas.openxmlformats.org/wordprocessingml/2006/main" xmlns:w14="http://schemas.microsoft.com/office/word/2010/wordml" xmlns:w15="http://schemas.microsoft.com/office/word/2012/wordml" xmlns:w16cex="http://schemas.microsoft.com/office/word/2018/wordml/cex" xmlns:w16cid="http://schemas.microsoft.com/office/word/2016/wordml/cid" xmlns:w16="http://schemas.microsoft.com/office/word/2018/wordml" xmlns:w16du="http://schemas.microsoft.com/office/word/2023/wordml/word16du" xmlns:w16sdtdh="http://schemas.microsoft.com/office/word/2020/wordml/sdtdatahash" xmlns:w16sdtfl="http://schemas.microsoft.com/office/word/2024/wordml/sdtformatlock" xmlns:w16se="http://schemas.microsoft.com/office/word/2015/wordml/symex" xmlns:wpg="http://schemas.microsoft.com/office/word/2010/wordprocessingGroup" xmlns:wpi="http://schemas.microsoft.com/office/word/2010/wordprocessingInk" xmlns:wne="http://schemas.microsoft.com/office/word/2006/wordml" xmlns:wps="http://schemas.microsoft.com/office/word/2010/wordprocessingShape" mc:Ignorable="w14 w15 w16se w16cid w16 w16cex w16sdtdh w16sdtfl w16du wp14">
-  <w:p>
-    <w:pPr>
-      <w:pStyle w:val="Piedepgina"/>
-    </w:pPr>
-  </w:p>
-</w:ftr>
-</file>
-
-<file path=word/footer2.xml><?xml version="1.0" encoding="utf-8"?>
 <w:ftr xmlns:wpc="http://schemas.microsoft.com/office/word/2010/wordprocessingCanvas" xmlns:cx="http://schemas.microsoft.com/office/drawing/2014/chartex" xmlns:cx1="http://schemas.microsoft.com/office/drawing/2015/9/8/chartex" xmlns:cx2="http://schemas.microsoft.com/office/drawing/2015/10/21/chartex" xmlns:cx3="http://schemas.microsoft.com/office/drawing/2016/5/9/chartex" xmlns:cx4="http://schemas.microsoft.com/office/drawing/2016/5/10/chartex" xmlns:cx5="http://schemas.microsoft.com/office/drawing/2016/5/11/chartex" xmlns:cx6="http://schemas.microsoft.com/office/drawing/2016/5/12/chartex" xmlns:cx7="http://schemas.microsoft.com/office/drawing/2016/5/13/chartex" xmlns:cx8="http://schemas.microsoft.com/office/drawing/2016/5/14/chartex" xmlns:mc="http://schemas.openxmlformats.org/markup-compatibility/2006" xmlns:aink="http://schemas.microsoft.com/office/drawing/2016/ink" xmlns:am3d="http://schemas.microsoft.com/office/drawing/2017/model3d" xmlns:o="urn:schemas-microsoft-com:office:office" xmlns:oel="http://schemas.microsoft.com/office/2019/extlst" xmlns:r="http://schemas.openxmlformats.org/officeDocument/2006/relationships" xmlns:m="http://schemas.openxmlformats.org/officeDocument/2006/math" xmlns:v="urn:schemas-microsoft-com:vml" xmlns:wp14="http://schemas.microsoft.com/office/word/2010/wordprocessingDrawing" xmlns:wp="http://schemas.openxmlformats.org/drawingml/2006/wordprocessingDrawing" xmlns:w10="urn:schemas-microsoft-com:office:word" xmlns:w="http://schemas.openxmlformats.org/wordprocessingml/2006/main" xmlns:w14="http://schemas.microsoft.com/office/word/2010/wordml" xmlns:w15="http://schemas.microsoft.com/office/word/2012/wordml" xmlns:w16cex="http://schemas.microsoft.com/office/word/2018/wordml/cex" xmlns:w16cid="http://schemas.microsoft.com/office/word/2016/wordml/cid" xmlns:w16="http://schemas.microsoft.com/office/word/2018/wordml" xmlns:w16du="http://schemas.microsoft.com/office/word/2023/wordml/word16du" xmlns:w16sdtdh="http://schemas.microsoft.com/office/word/2020/wordml/sdtdatahash" xmlns:w16sdtfl="http://schemas.microsoft.com/office/word/2024/wordml/sdtformatlock" xmlns:w16se="http://schemas.microsoft.com/office/word/2015/wordml/symex" xmlns:wpg="http://schemas.microsoft.com/office/word/2010/wordprocessingGroup" xmlns:wpi="http://schemas.microsoft.com/office/word/2010/wordprocessingInk" xmlns:wne="http://schemas.microsoft.com/office/word/2006/wordml" xmlns:wps="http://schemas.microsoft.com/office/word/2010/wordprocessingShape" mc:Ignorable="w14 w15 w16se w16cid w16 w16cex w16sdtdh w16sdtfl w16du wp14">
   <w:p>
     <w:pPr>
@@ -2142,15 +2739,15 @@
       <mc:AlternateContent>
         <mc:Choice Requires="wps">
           <w:drawing>
-            <wp:anchor distT="0" distB="0" distL="0" distR="0" simplePos="0" relativeHeight="251658240" behindDoc="1" locked="0" layoutInCell="1" allowOverlap="1" wp14:anchorId="03A76DAF" wp14:editId="0B09F9B8">
+            <wp:anchor distT="0" distB="0" distL="0" distR="0" simplePos="0" relativeHeight="251658240" behindDoc="1" locked="0" layoutInCell="1" allowOverlap="1" wp14:anchorId="03A76DAF" wp14:editId="786E5A54">
               <wp:simplePos x="0" y="0"/>
               <wp:positionH relativeFrom="page">
-                <wp:align>left</wp:align>
+                <wp:posOffset>2838450</wp:posOffset>
               </wp:positionH>
               <wp:positionV relativeFrom="page">
-                <wp:posOffset>9485644</wp:posOffset>
+                <wp:posOffset>9486901</wp:posOffset>
               </wp:positionV>
-              <wp:extent cx="7757327" cy="152400"/>
+              <wp:extent cx="2266950" cy="152400"/>
               <wp:effectExtent l="0" t="0" r="0" b="0"/>
               <wp:wrapNone/>
               <wp:docPr id="3" name="Textbox 3"/>
@@ -2166,7 +2763,7 @@
                     <wps:spPr>
                       <a:xfrm>
                         <a:off x="0" y="0"/>
-                        <a:ext cx="7757327" cy="152400"/>
+                        <a:ext cx="2266950" cy="152400"/>
                       </a:xfrm>
                       <a:prstGeom prst="rect">
                         <a:avLst/>
@@ -2191,7 +2788,25 @@
                               <w:bCs/>
                               <w:spacing w:val="-2"/>
                             </w:rPr>
-                            <w:t>{empleado_nombre_completo}</w:t>
+                            <w:t>{</w:t>
+                          </w:r>
+                          <w:proofErr w:type="spellStart"/>
+                          <w:r>
+                            <w:rPr>
+                              <w:b/>
+                              <w:bCs/>
+                              <w:spacing w:val="-2"/>
+                            </w:rPr>
+                            <w:t>empleado_nombre_completo</w:t>
+                          </w:r>
+                          <w:proofErr w:type="spellEnd"/>
+                          <w:r>
+                            <w:rPr>
+                              <w:b/>
+                              <w:bCs/>
+                              <w:spacing w:val="-2"/>
+                            </w:rPr>
+                            <w:t>}</w:t>
                           </w:r>
                         </w:p>
                       </w:txbxContent>
@@ -2217,7 +2832,7 @@
               <v:stroke joinstyle="miter"/>
               <v:path gradientshapeok="t" o:connecttype="rect"/>
             </v:shapetype>
-            <v:shape id="Textbox 3" o:spid="_x0000_s1027" type="#_x0000_t202" style="position:absolute;margin-left:0;margin-top:746.9pt;width:610.8pt;height:12pt;z-index:-251658240;visibility:visible;mso-wrap-style:square;mso-width-percent:0;mso-height-percent:0;mso-wrap-distance-left:0;mso-wrap-distance-top:0;mso-wrap-distance-right:0;mso-wrap-distance-bottom:0;mso-position-horizontal:left;mso-position-horizontal-relative:page;mso-position-vertical:absolute;mso-position-vertical-relative:page;mso-width-percent:0;mso-height-percent:0;mso-width-relative:margin;mso-height-relative:margin;v-text-anchor:top" o:gfxdata="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" filled="f" stroked="f">
+            <v:shape id="Textbox 3" o:spid="_x0000_s1027" type="#_x0000_t202" style="position:absolute;margin-left:223.5pt;margin-top:747pt;width:178.5pt;height:12pt;z-index:-251658240;visibility:visible;mso-wrap-style:square;mso-width-percent:0;mso-height-percent:0;mso-wrap-distance-left:0;mso-wrap-distance-top:0;mso-wrap-distance-right:0;mso-wrap-distance-bottom:0;mso-position-horizontal:absolute;mso-position-horizontal-relative:page;mso-position-vertical:absolute;mso-position-vertical-relative:page;mso-width-percent:0;mso-height-percent:0;mso-width-relative:margin;mso-height-relative:margin;v-text-anchor:top" o:gfxdata="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" filled="f" stroked="f">
               <v:textbox inset="0,0,0,0">
                 <w:txbxContent>
                   <w:p>
@@ -2237,7 +2852,25 @@
                         <w:bCs/>
                         <w:spacing w:val="-2"/>
                       </w:rPr>
-                      <w:t>{empleado_nombre_completo}</w:t>
+                      <w:t>{</w:t>
+                    </w:r>
+                    <w:proofErr w:type="spellStart"/>
+                    <w:r>
+                      <w:rPr>
+                        <w:b/>
+                        <w:bCs/>
+                        <w:spacing w:val="-2"/>
+                      </w:rPr>
+                      <w:t>empleado_nombre_completo</w:t>
+                    </w:r>
+                    <w:proofErr w:type="spellEnd"/>
+                    <w:r>
+                      <w:rPr>
+                        <w:b/>
+                        <w:bCs/>
+                        <w:spacing w:val="-2"/>
+                      </w:rPr>
+                      <w:t>}</w:t>
                     </w:r>
                   </w:p>
                 </w:txbxContent>
@@ -2338,16 +2971,6 @@
 </w:ftr>
 </file>
 
-<file path=word/footer3.xml><?xml version="1.0" encoding="utf-8"?>
-<w:ftr xmlns:wpc="http://schemas.microsoft.com/office/word/2010/wordprocessingCanvas" xmlns:cx="http://schemas.microsoft.com/office/drawing/2014/chartex" xmlns:cx1="http://schemas.microsoft.com/office/drawing/2015/9/8/chartex" xmlns:cx2="http://schemas.microsoft.com/office/drawing/2015/10/21/chartex" xmlns:cx3="http://schemas.microsoft.com/office/drawing/2016/5/9/chartex" xmlns:cx4="http://schemas.microsoft.com/office/drawing/2016/5/10/chartex" xmlns:cx5="http://schemas.microsoft.com/office/drawing/2016/5/11/chartex" xmlns:cx6="http://schemas.microsoft.com/office/drawing/2016/5/12/chartex" xmlns:cx7="http://schemas.microsoft.com/office/drawing/2016/5/13/chartex" xmlns:cx8="http://schemas.microsoft.com/office/drawing/2016/5/14/chartex" xmlns:mc="http://schemas.openxmlformats.org/markup-compatibility/2006" xmlns:aink="http://schemas.microsoft.com/office/drawing/2016/ink" xmlns:am3d="http://schemas.microsoft.com/office/drawing/2017/model3d" xmlns:o="urn:schemas-microsoft-com:office:office" xmlns:oel="http://schemas.microsoft.com/office/2019/extlst" xmlns:r="http://schemas.openxmlformats.org/officeDocument/2006/relationships" xmlns:m="http://schemas.openxmlformats.org/officeDocument/2006/math" xmlns:v="urn:schemas-microsoft-com:vml" xmlns:wp14="http://schemas.microsoft.com/office/word/2010/wordprocessingDrawing" xmlns:wp="http://schemas.openxmlformats.org/drawingml/2006/wordprocessingDrawing" xmlns:w10="urn:schemas-microsoft-com:office:word" xmlns:w="http://schemas.openxmlformats.org/wordprocessingml/2006/main" xmlns:w14="http://schemas.microsoft.com/office/word/2010/wordml" xmlns:w15="http://schemas.microsoft.com/office/word/2012/wordml" xmlns:w16cex="http://schemas.microsoft.com/office/word/2018/wordml/cex" xmlns:w16cid="http://schemas.microsoft.com/office/word/2016/wordml/cid" xmlns:w16="http://schemas.microsoft.com/office/word/2018/wordml" xmlns:w16du="http://schemas.microsoft.com/office/word/2023/wordml/word16du" xmlns:w16sdtdh="http://schemas.microsoft.com/office/word/2020/wordml/sdtdatahash" xmlns:w16sdtfl="http://schemas.microsoft.com/office/word/2024/wordml/sdtformatlock" xmlns:w16se="http://schemas.microsoft.com/office/word/2015/wordml/symex" xmlns:wpg="http://schemas.microsoft.com/office/word/2010/wordprocessingGroup" xmlns:wpi="http://schemas.microsoft.com/office/word/2010/wordprocessingInk" xmlns:wne="http://schemas.microsoft.com/office/word/2006/wordml" xmlns:wps="http://schemas.microsoft.com/office/word/2010/wordprocessingShape" mc:Ignorable="w14 w15 w16se w16cid w16 w16cex w16sdtdh w16sdtfl w16du wp14">
-  <w:p>
-    <w:pPr>
-      <w:pStyle w:val="Piedepgina"/>
-    </w:pPr>
-  </w:p>
-</w:ftr>
-</file>
-
 <file path=word/footnotes.xml><?xml version="1.0" encoding="utf-8"?>
 <w:footnotes xmlns:wpc="http://schemas.microsoft.com/office/word/2010/wordprocessingCanvas" xmlns:cx="http://schemas.microsoft.com/office/drawing/2014/chartex" xmlns:cx1="http://schemas.microsoft.com/office/drawing/2015/9/8/chartex" xmlns:cx2="http://schemas.microsoft.com/office/drawing/2015/10/21/chartex" xmlns:cx3="http://schemas.microsoft.com/office/drawing/2016/5/9/chartex" xmlns:cx4="http://schemas.microsoft.com/office/drawing/2016/5/10/chartex" xmlns:cx5="http://schemas.microsoft.com/office/drawing/2016/5/11/chartex" xmlns:cx6="http://schemas.microsoft.com/office/drawing/2016/5/12/chartex" xmlns:cx7="http://schemas.microsoft.com/office/drawing/2016/5/13/chartex" xmlns:cx8="http://schemas.microsoft.com/office/drawing/2016/5/14/chartex" xmlns:mc="http://schemas.openxmlformats.org/markup-compatibility/2006" xmlns:aink="http://schemas.microsoft.com/office/drawing/2016/ink" xmlns:am3d="http://schemas.microsoft.com/office/drawing/2017/model3d" xmlns:o="urn:schemas-microsoft-com:office:office" xmlns:oel="http://schemas.microsoft.com/office/2019/extlst" xmlns:r="http://schemas.openxmlformats.org/officeDocument/2006/relationships" xmlns:m="http://schemas.openxmlformats.org/officeDocument/2006/math" xmlns:v="urn:schemas-microsoft-com:vml" xmlns:wp14="http://schemas.microsoft.com/office/word/2010/wordprocessingDrawing" xmlns:wp="http://schemas.openxmlformats.org/drawingml/2006/wordprocessingDrawing" xmlns:w10="urn:schemas-microsoft-com:office:word" xmlns:w="http://schemas.openxmlformats.org/wordprocessingml/2006/main" xmlns:w14="http://schemas.microsoft.com/office/word/2010/wordml" xmlns:w15="http://schemas.microsoft.com/office/word/2012/wordml" xmlns:w16cex="http://schemas.microsoft.com/office/word/2018/wordml/cex" xmlns:w16cid="http://schemas.microsoft.com/office/word/2016/wordml/cid" xmlns:w16="http://schemas.microsoft.com/office/word/2018/wordml" xmlns:w16du="http://schemas.microsoft.com/office/word/2023/wordml/word16du" xmlns:w16sdtdh="http://schemas.microsoft.com/office/word/2020/wordml/sdtdatahash" xmlns:w16sdtfl="http://schemas.microsoft.com/office/word/2024/wordml/sdtformatlock" xmlns:w16se="http://schemas.microsoft.com/office/word/2015/wordml/symex" xmlns:wpg="http://schemas.microsoft.com/office/word/2010/wordprocessingGroup" xmlns:wpi="http://schemas.microsoft.com/office/word/2010/wordprocessingInk" xmlns:wne="http://schemas.microsoft.com/office/word/2006/wordml" xmlns:wps="http://schemas.microsoft.com/office/word/2010/wordprocessingShape" mc:Ignorable="w14 w15 w16se w16cid w16 w16cex w16sdtdh w16sdtfl w16du wp14">
   <w:footnote w:type="separator" w:id="-1">
@@ -2368,16 +2991,6 @@
 </file>
 
 <file path=word/header1.xml><?xml version="1.0" encoding="utf-8"?>
-<w:hdr xmlns:wpc="http://schemas.microsoft.com/office/word/2010/wordprocessingCanvas" xmlns:cx="http://schemas.microsoft.com/office/drawing/2014/chartex" xmlns:cx1="http://schemas.microsoft.com/office/drawing/2015/9/8/chartex" xmlns:cx2="http://schemas.microsoft.com/office/drawing/2015/10/21/chartex" xmlns:cx3="http://schemas.microsoft.com/office/drawing/2016/5/9/chartex" xmlns:cx4="http://schemas.microsoft.com/office/drawing/2016/5/10/chartex" xmlns:cx5="http://schemas.microsoft.com/office/drawing/2016/5/11/chartex" xmlns:cx6="http://schemas.microsoft.com/office/drawing/2016/5/12/chartex" xmlns:cx7="http://schemas.microsoft.com/office/drawing/2016/5/13/chartex" xmlns:cx8="http://schemas.microsoft.com/office/drawing/2016/5/14/chartex" xmlns:mc="http://schemas.openxmlformats.org/markup-compatibility/2006" xmlns:aink="http://schemas.microsoft.com/office/drawing/2016/ink" xmlns:am3d="http://schemas.microsoft.com/office/drawing/2017/model3d" xmlns:o="urn:schemas-microsoft-com:office:office" xmlns:oel="http://schemas.microsoft.com/office/2019/extlst" xmlns:r="http://schemas.openxmlformats.org/officeDocument/2006/relationships" xmlns:m="http://schemas.openxmlformats.org/officeDocument/2006/math" xmlns:v="urn:schemas-microsoft-com:vml" xmlns:wp14="http://schemas.microsoft.com/office/word/2010/wordprocessingDrawing" xmlns:wp="http://schemas.openxmlformats.org/drawingml/2006/wordprocessingDrawing" xmlns:w10="urn:schemas-microsoft-com:office:word" xmlns:w="http://schemas.openxmlformats.org/wordprocessingml/2006/main" xmlns:w14="http://schemas.microsoft.com/office/word/2010/wordml" xmlns:w15="http://schemas.microsoft.com/office/word/2012/wordml" xmlns:w16cex="http://schemas.microsoft.com/office/word/2018/wordml/cex" xmlns:w16cid="http://schemas.microsoft.com/office/word/2016/wordml/cid" xmlns:w16="http://schemas.microsoft.com/office/word/2018/wordml" xmlns:w16du="http://schemas.microsoft.com/office/word/2023/wordml/word16du" xmlns:w16sdtdh="http://schemas.microsoft.com/office/word/2020/wordml/sdtdatahash" xmlns:w16sdtfl="http://schemas.microsoft.com/office/word/2024/wordml/sdtformatlock" xmlns:w16se="http://schemas.microsoft.com/office/word/2015/wordml/symex" xmlns:wpg="http://schemas.microsoft.com/office/word/2010/wordprocessingGroup" xmlns:wpi="http://schemas.microsoft.com/office/word/2010/wordprocessingInk" xmlns:wne="http://schemas.microsoft.com/office/word/2006/wordml" xmlns:wps="http://schemas.microsoft.com/office/word/2010/wordprocessingShape" mc:Ignorable="w14 w15 w16se w16cid w16 w16cex w16sdtdh w16sdtfl w16du wp14">
-  <w:p>
-    <w:pPr>
-      <w:pStyle w:val="Encabezado"/>
-    </w:pPr>
-  </w:p>
-</w:hdr>
-</file>
-
-<file path=word/header2.xml><?xml version="1.0" encoding="utf-8"?>
 <w:hdr xmlns:wpc="http://schemas.microsoft.com/office/word/2010/wordprocessingCanvas" xmlns:cx="http://schemas.microsoft.com/office/drawing/2014/chartex" xmlns:cx1="http://schemas.microsoft.com/office/drawing/2015/9/8/chartex" xmlns:cx2="http://schemas.microsoft.com/office/drawing/2015/10/21/chartex" xmlns:cx3="http://schemas.microsoft.com/office/drawing/2016/5/9/chartex" xmlns:cx4="http://schemas.microsoft.com/office/drawing/2016/5/10/chartex" xmlns:cx5="http://schemas.microsoft.com/office/drawing/2016/5/11/chartex" xmlns:cx6="http://schemas.microsoft.com/office/drawing/2016/5/12/chartex" xmlns:cx7="http://schemas.microsoft.com/office/drawing/2016/5/13/chartex" xmlns:cx8="http://schemas.microsoft.com/office/drawing/2016/5/14/chartex" xmlns:mc="http://schemas.openxmlformats.org/markup-compatibility/2006" xmlns:aink="http://schemas.microsoft.com/office/drawing/2016/ink" xmlns:am3d="http://schemas.microsoft.com/office/drawing/2017/model3d" xmlns:o="urn:schemas-microsoft-com:office:office" xmlns:oel="http://schemas.microsoft.com/office/2019/extlst" xmlns:r="http://schemas.openxmlformats.org/officeDocument/2006/relationships" xmlns:m="http://schemas.openxmlformats.org/officeDocument/2006/math" xmlns:v="urn:schemas-microsoft-com:vml" xmlns:wp14="http://schemas.microsoft.com/office/word/2010/wordprocessingDrawing" xmlns:wp="http://schemas.openxmlformats.org/drawingml/2006/wordprocessingDrawing" xmlns:w10="urn:schemas-microsoft-com:office:word" xmlns:w="http://schemas.openxmlformats.org/wordprocessingml/2006/main" xmlns:w14="http://schemas.microsoft.com/office/word/2010/wordml" xmlns:w15="http://schemas.microsoft.com/office/word/2012/wordml" xmlns:w16cex="http://schemas.microsoft.com/office/word/2018/wordml/cex" xmlns:w16cid="http://schemas.microsoft.com/office/word/2016/wordml/cid" xmlns:w16="http://schemas.microsoft.com/office/word/2018/wordml" xmlns:w16du="http://schemas.microsoft.com/office/word/2023/wordml/word16du" xmlns:w16sdtdh="http://schemas.microsoft.com/office/word/2020/wordml/sdtdatahash" xmlns:w16sdtfl="http://schemas.microsoft.com/office/word/2024/wordml/sdtformatlock" xmlns:w16se="http://schemas.microsoft.com/office/word/2015/wordml/symex" xmlns:wpg="http://schemas.microsoft.com/office/word/2010/wordprocessingGroup" xmlns:wpi="http://schemas.microsoft.com/office/word/2010/wordprocessingInk" xmlns:wne="http://schemas.microsoft.com/office/word/2006/wordml" xmlns:wps="http://schemas.microsoft.com/office/word/2010/wordprocessingShape" mc:Ignorable="w14 w15 w16se w16cid w16 w16cex w16sdtdh w16sdtfl w16du wp14">
   <w:p>
     <w:pPr>
@@ -2634,16 +3247,6 @@
     <w:pPr>
       <w:pStyle w:val="Textoindependiente"/>
       <w:spacing w:line="14" w:lineRule="auto"/>
-    </w:pPr>
-  </w:p>
-</w:hdr>
-</file>
-
-<file path=word/header3.xml><?xml version="1.0" encoding="utf-8"?>
-<w:hdr xmlns:wpc="http://schemas.microsoft.com/office/word/2010/wordprocessingCanvas" xmlns:cx="http://schemas.microsoft.com/office/drawing/2014/chartex" xmlns:cx1="http://schemas.microsoft.com/office/drawing/2015/9/8/chartex" xmlns:cx2="http://schemas.microsoft.com/office/drawing/2015/10/21/chartex" xmlns:cx3="http://schemas.microsoft.com/office/drawing/2016/5/9/chartex" xmlns:cx4="http://schemas.microsoft.com/office/drawing/2016/5/10/chartex" xmlns:cx5="http://schemas.microsoft.com/office/drawing/2016/5/11/chartex" xmlns:cx6="http://schemas.microsoft.com/office/drawing/2016/5/12/chartex" xmlns:cx7="http://schemas.microsoft.com/office/drawing/2016/5/13/chartex" xmlns:cx8="http://schemas.microsoft.com/office/drawing/2016/5/14/chartex" xmlns:mc="http://schemas.openxmlformats.org/markup-compatibility/2006" xmlns:aink="http://schemas.microsoft.com/office/drawing/2016/ink" xmlns:am3d="http://schemas.microsoft.com/office/drawing/2017/model3d" xmlns:o="urn:schemas-microsoft-com:office:office" xmlns:oel="http://schemas.microsoft.com/office/2019/extlst" xmlns:r="http://schemas.openxmlformats.org/officeDocument/2006/relationships" xmlns:m="http://schemas.openxmlformats.org/officeDocument/2006/math" xmlns:v="urn:schemas-microsoft-com:vml" xmlns:wp14="http://schemas.microsoft.com/office/word/2010/wordprocessingDrawing" xmlns:wp="http://schemas.openxmlformats.org/drawingml/2006/wordprocessingDrawing" xmlns:w10="urn:schemas-microsoft-com:office:word" xmlns:w="http://schemas.openxmlformats.org/wordprocessingml/2006/main" xmlns:w14="http://schemas.microsoft.com/office/word/2010/wordml" xmlns:w15="http://schemas.microsoft.com/office/word/2012/wordml" xmlns:w16cex="http://schemas.microsoft.com/office/word/2018/wordml/cex" xmlns:w16cid="http://schemas.microsoft.com/office/word/2016/wordml/cid" xmlns:w16="http://schemas.microsoft.com/office/word/2018/wordml" xmlns:w16du="http://schemas.microsoft.com/office/word/2023/wordml/word16du" xmlns:w16sdtdh="http://schemas.microsoft.com/office/word/2020/wordml/sdtdatahash" xmlns:w16sdtfl="http://schemas.microsoft.com/office/word/2024/wordml/sdtformatlock" xmlns:w16se="http://schemas.microsoft.com/office/word/2015/wordml/symex" xmlns:wpg="http://schemas.microsoft.com/office/word/2010/wordprocessingGroup" xmlns:wpi="http://schemas.microsoft.com/office/word/2010/wordprocessingInk" xmlns:wne="http://schemas.microsoft.com/office/word/2006/wordml" xmlns:wps="http://schemas.microsoft.com/office/word/2010/wordprocessingShape" mc:Ignorable="w14 w15 w16se w16cid w16 w16cex w16sdtdh w16sdtfl w16du wp14">
-  <w:p>
-    <w:pPr>
-      <w:pStyle w:val="Encabezado"/>
     </w:pPr>
   </w:p>
 </w:hdr>

</xml_diff>

<commit_message>
fix(finiquitos): corrige logica ISR Art174, ISR mes y deducciones visibles
</commit_message>
<xml_diff>
--- a/docx_templates/FINIQUITO FORMATO.docx
+++ b/docx_templates/FINIQUITO FORMATO.docx
@@ -6,48 +6,11 @@
       <w:pPr>
         <w:pStyle w:val="Textoindependiente"/>
         <w:spacing w:before="12"/>
-        <w:ind w:left="4320"/>
+        <w:ind w:right="340"/>
+        <w:jc w:val="right"/>
       </w:pPr>
       <w:r>
-        <w:t xml:space="preserve">             </w:t>
-      </w:r>
-      <w:r>
-        <w:t>{</w:t>
-      </w:r>
-      <w:proofErr w:type="spellStart"/>
-      <w:r>
-        <w:t>lugar_emision</w:t>
-      </w:r>
-      <w:proofErr w:type="spellEnd"/>
-      <w:r>
-        <w:t>}, {</w:t>
-      </w:r>
-      <w:proofErr w:type="spellStart"/>
-      <w:r>
-        <w:t>estado_emision</w:t>
-      </w:r>
-      <w:proofErr w:type="spellEnd"/>
-      <w:r>
-        <w:t>} a {</w:t>
-      </w:r>
-      <w:proofErr w:type="spellStart"/>
-      <w:r>
-        <w:t>fecha_emision_larga</w:t>
-      </w:r>
-      <w:proofErr w:type="spellEnd"/>
-      <w:r>
-        <w:t>}.</w:t>
-      </w:r>
-    </w:p>
-    <w:p>
-      <w:pPr>
-        <w:pStyle w:val="Textoindependiente"/>
-        <w:spacing w:before="120"/>
-        <w:ind w:left="513" w:right="873"/>
-        <w:jc w:val="both"/>
-      </w:pPr>
-      <w:r>
-        <w:t xml:space="preserve">Las partes acuerdan que dicha cantidad será cubierta a más tardar el día {fecha_limite_pago}.</w:t>
+        <w:t>{lugar_emision}, {estado_emision} a {fecha_emision_larga}.</w:t>
       </w:r>
     </w:p>
     <w:p>
@@ -62,78 +25,11 @@
     <w:p>
       <w:pPr>
         <w:pStyle w:val="Textoindependiente"/>
-        <w:ind w:left="465" w:right="873"/>
+        <w:ind w:left="170" w:right="397"/>
         <w:jc w:val="both"/>
       </w:pPr>
       <w:r>
-        <w:t>Recibí de la</w:t>
-      </w:r>
-      <w:r>
-        <w:rPr>
-          <w:spacing w:val="-2"/>
-        </w:rPr>
-        <w:t xml:space="preserve"> </w:t>
-      </w:r>
-      <w:r>
-        <w:t xml:space="preserve">empresa </w:t>
-      </w:r>
-      <w:r>
-        <w:rPr>
-          <w:b/>
-          <w:bCs/>
-        </w:rPr>
-        <w:t>RAFAEL</w:t>
-      </w:r>
-      <w:r>
-        <w:rPr>
-          <w:b/>
-          <w:bCs/>
-          <w:spacing w:val="-7"/>
-        </w:rPr>
-        <w:t xml:space="preserve"> </w:t>
-      </w:r>
-      <w:r>
-        <w:rPr>
-          <w:b/>
-          <w:bCs/>
-        </w:rPr>
-        <w:t>ALEJANDRO VILLALOBOS GARZA</w:t>
-      </w:r>
-      <w:r>
-        <w:rPr>
-          <w:spacing w:val="-10"/>
-        </w:rPr>
-        <w:t xml:space="preserve"> </w:t>
-      </w:r>
-      <w:r>
-        <w:t>con domicilio en</w:t>
-      </w:r>
-      <w:r>
-        <w:rPr>
-          <w:spacing w:val="40"/>
-        </w:rPr>
-        <w:t xml:space="preserve"> </w:t>
-      </w:r>
-      <w:r>
-        <w:t>CALLE CASSINO 1216 CUMBRES SAN AGUSTIN 2DO SECTOR 2DA</w:t>
-      </w:r>
-      <w:r>
-        <w:rPr>
-          <w:spacing w:val="-1"/>
-        </w:rPr>
-        <w:t xml:space="preserve"> </w:t>
-      </w:r>
-      <w:r>
-        <w:t>ETAPA</w:t>
-      </w:r>
-      <w:r>
-        <w:rPr>
-          <w:spacing w:val="-3"/>
-        </w:rPr>
-        <w:t xml:space="preserve"> </w:t>
-      </w:r>
-      <w:r>
-        <w:t xml:space="preserve">la cantidad de </w:t>
+        <w:t xml:space="preserve">La empresa RAFAEL ALEJANDRO VILLALOBOS GARZA, con domicilio en CALLE CASSINO 1216, CUMBRES SAN AGUSTÍN 2DO SECTOR 2DA ETAPA, reconoce adeudar a la persona trabajadora la cantidad de </w:t>
       </w:r>
       <w:r>
         <w:rPr>
@@ -141,93 +37,41 @@
           <w:bCs/>
           <w:u w:val="single"/>
         </w:rPr>
-        <w:t>$</w:t>
+        <w:t>${neto_p}</w:t>
       </w:r>
       <w:r>
-        <w:rPr>
-          <w:rFonts w:ascii="Arial"/>
-          <w:b/>
-          <w:spacing w:val="-2"/>
-          <w:position w:val="2"/>
-          <w:sz w:val="18"/>
-        </w:rPr>
-        <w:t>{</w:t>
-      </w:r>
-      <w:proofErr w:type="spellStart"/>
-      <w:r>
-        <w:rPr>
-          <w:rFonts w:ascii="Arial"/>
-          <w:b/>
-          <w:spacing w:val="-2"/>
-          <w:position w:val="2"/>
-          <w:sz w:val="18"/>
-        </w:rPr>
-        <w:t>neto_p</w:t>
-      </w:r>
-      <w:proofErr w:type="spellEnd"/>
-      <w:r>
-        <w:rPr>
-          <w:rFonts w:ascii="Arial"/>
-          <w:b/>
-          <w:spacing w:val="-2"/>
-          <w:position w:val="2"/>
-          <w:sz w:val="18"/>
-        </w:rPr>
-        <w:t>}</w:t>
+        <w:t xml:space="preserve"> {neto_pagar_letra} por concepto de finiquito, </w:t>
       </w:r>
       <w:r>
-        <w:rPr>
-          <w:rFonts w:ascii="Arial"/>
-          <w:b/>
-          <w:spacing w:val="-2"/>
-          <w:position w:val="2"/>
-          <w:sz w:val="18"/>
-        </w:rPr>
-        <w:t xml:space="preserve"> </w:t>
+        <w:t>l</w:t>
       </w:r>
       <w:r>
-        <w:t>{</w:t>
+        <w:t xml:space="preserve">as partes acuerdan que dicha cantidad </w:t>
       </w:r>
-      <w:proofErr w:type="spellStart"/>
       <w:r>
-        <w:t>neto_pagar_letra</w:t>
+        <w:t>será cubierta a más tardar el día {fecha_limite_pago}</w:t>
       </w:r>
-      <w:proofErr w:type="spellEnd"/>
       <w:r>
-        <w:t>}</w:t>
+        <w:t>, teniéndose por cumplida la obligación de pago</w:t>
+      </w:r>
+      <w:r>
+        <w:t xml:space="preserve"> por medio de transferencia electrónica</w:t>
+      </w:r>
+      <w:r>
+        <w:t xml:space="preserve"> una vez que el importe quede efectivamente depositado o entregado a la persona trabajadora</w:t>
       </w:r>
       <w:r>
         <w:t xml:space="preserve"> </w:t>
       </w:r>
       <w:r>
-        <w:t>por</w:t>
+        <w:t xml:space="preserve">con motivo de la terminación de la relación laboral con fecha </w:t>
       </w:r>
       <w:r>
-        <w:rPr>
-          <w:spacing w:val="40"/>
-        </w:rPr>
-        <w:t xml:space="preserve"> </w:t>
+        <w:t xml:space="preserve">del día </w:t>
       </w:r>
       <w:r>
-        <w:t xml:space="preserve">concepto de mi finiquito, con motivo de la terminación de mi relación laboral con la empresa con fecha </w:t>
+        <w:t>{fecha_letra}, importe que resulta de los conceptos que se desglosan a continuación.</w:t>
       </w:r>
-      <w:r>
-        <w:t xml:space="preserve">del jueves </w:t>
-      </w:r>
-      <w:r>
-        <w:t xml:space="preserve">26 de </w:t>
-      </w:r>
-      <w:r>
-        <w:t>m</w:t>
-      </w:r>
-      <w:r>
-        <w:t>arzo de 2026, cantidad que resulta de los siguientes conceptos:</w:t>
-      </w:r>
-    </w:p>
-    <w:p>
-      <w:pPr>
-        <w:pStyle w:val="Textoindependiente"/>
-      </w:pPr>
     </w:p>
     <w:p>
       <w:pPr>
@@ -659,23 +503,7 @@
                 <w:color w:val="808080"/>
                 <w:sz w:val="18"/>
               </w:rPr>
-              <w:t>{</w:t>
-            </w:r>
-            <w:proofErr w:type="spellStart"/>
-            <w:r>
-              <w:rPr>
-                <w:color w:val="808080"/>
-                <w:sz w:val="18"/>
-              </w:rPr>
-              <w:t>c_isa</w:t>
-            </w:r>
-            <w:proofErr w:type="spellEnd"/>
-            <w:r>
-              <w:rPr>
-                <w:color w:val="808080"/>
-                <w:sz w:val="18"/>
-              </w:rPr>
-              <w:t>}</w:t>
+              <w:t>{c_isa}</w:t>
             </w:r>
           </w:p>
         </w:tc>
@@ -1055,23 +883,7 @@
                 <w:color w:val="808080"/>
                 <w:sz w:val="18"/>
               </w:rPr>
-              <w:t>{</w:t>
-            </w:r>
-            <w:proofErr w:type="spellStart"/>
-            <w:r>
-              <w:rPr>
-                <w:color w:val="808080"/>
-                <w:sz w:val="18"/>
-              </w:rPr>
-              <w:t>c_imes</w:t>
-            </w:r>
-            <w:proofErr w:type="spellEnd"/>
-            <w:r>
-              <w:rPr>
-                <w:color w:val="808080"/>
-                <w:sz w:val="18"/>
-              </w:rPr>
-              <w:t>}</w:t>
+              <w:t>{c_imes}</w:t>
             </w:r>
           </w:p>
         </w:tc>
@@ -1098,6 +910,232 @@
                 <w:sz w:val="18"/>
               </w:rPr>
               <w:t>{t10}</w:t>
+            </w:r>
+          </w:p>
+        </w:tc>
+      </w:tr>
+      <w:tr>
+        <w:trPr>
+          <w:trHeight w:val="250"/>
+        </w:trPr>
+        <w:tc>
+          <w:tcPr>
+            <w:tcW w:w="981" w:type="dxa"/>
+            <w:tcBorders>
+              <w:left w:val="single" w:sz="4" w:space="0" w:color="000000"/>
+            </w:tcBorders>
+          </w:tcPr>
+          <w:p>
+            <w:pPr>
+              <w:pStyle w:val="TableParagraph"/>
+              <w:ind w:left="596"/>
+              <w:rPr>
+                <w:sz w:val="18"/>
+              </w:rPr>
+            </w:pPr>
+            <w:r>
+              <w:rPr>
+                <w:color w:val="808080"/>
+                <w:spacing w:val="-5"/>
+                <w:sz w:val="18"/>
+              </w:rPr>
+              <w:t>22</w:t>
+            </w:r>
+          </w:p>
+        </w:tc>
+        <w:tc>
+          <w:tcPr>
+            <w:tcW w:w="3042" w:type="dxa"/>
+          </w:tcPr>
+          <w:p>
+            <w:pPr>
+              <w:pStyle w:val="TableParagraph"/>
+              <w:ind w:left="88"/>
+              <w:rPr>
+                <w:sz w:val="18"/>
+              </w:rPr>
+            </w:pPr>
+            <w:r>
+              <w:rPr>
+                <w:color w:val="808080"/>
+                <w:sz w:val="18"/>
+              </w:rPr>
+              <w:t>Prima</w:t>
+            </w:r>
+            <w:r>
+              <w:rPr>
+                <w:color w:val="808080"/>
+                <w:spacing w:val="16"/>
+                <w:sz w:val="18"/>
+              </w:rPr>
+              <w:t xml:space="preserve"> </w:t>
+            </w:r>
+            <w:r>
+              <w:rPr>
+                <w:color w:val="808080"/>
+                <w:sz w:val="18"/>
+              </w:rPr>
+              <w:t>de</w:t>
+            </w:r>
+            <w:r>
+              <w:rPr>
+                <w:color w:val="808080"/>
+                <w:spacing w:val="14"/>
+                <w:sz w:val="18"/>
+              </w:rPr>
+              <w:t xml:space="preserve"> </w:t>
+            </w:r>
+            <w:r>
+              <w:rPr>
+                <w:color w:val="808080"/>
+                <w:sz w:val="18"/>
+              </w:rPr>
+              <w:t>vacaciones</w:t>
+            </w:r>
+            <w:r>
+              <w:rPr>
+                <w:color w:val="808080"/>
+                <w:spacing w:val="2"/>
+                <w:sz w:val="18"/>
+              </w:rPr>
+              <w:t xml:space="preserve"> </w:t>
+            </w:r>
+            <w:r>
+              <w:rPr>
+                <w:color w:val="808080"/>
+                <w:spacing w:val="-5"/>
+                <w:sz w:val="18"/>
+              </w:rPr>
+              <w:t>reportadas $</w:t>
+            </w:r>
+          </w:p>
+        </w:tc>
+        <w:tc>
+          <w:tcPr>
+            <w:tcW w:w="1765" w:type="dxa"/>
+            <w:tcBorders>
+              <w:right w:val="single" w:sz="4" w:space="0" w:color="000000"/>
+            </w:tcBorders>
+          </w:tcPr>
+          <w:p>
+            <w:pPr>
+              <w:pStyle w:val="TableParagraph"/>
+              <w:ind w:right="22"/>
+              <w:jc w:val="right"/>
+              <w:rPr>
+                <w:sz w:val="18"/>
+              </w:rPr>
+            </w:pPr>
+            <w:r>
+              <w:rPr>
+                <w:color w:val="808080"/>
+                <w:spacing w:val="-2"/>
+                <w:sz w:val="18"/>
+              </w:rPr>
+              <w:t>{t5}</w:t>
+            </w:r>
+          </w:p>
+        </w:tc>
+        <w:tc>
+          <w:tcPr>
+            <w:tcW w:w="715" w:type="dxa"/>
+            <w:tcBorders>
+              <w:left w:val="single" w:sz="4" w:space="0" w:color="000000"/>
+            </w:tcBorders>
+          </w:tcPr>
+          <w:p>
+            <w:pPr>
+              <w:pStyle w:val="TableParagraph"/>
+              <w:ind w:right="177"/>
+              <w:jc w:val="right"/>
+              <w:rPr>
+                <w:sz w:val="18"/>
+              </w:rPr>
+            </w:pPr>
+            <w:r>
+              <w:rPr>
+                <w:color w:val="808080"/>
+                <w:spacing w:val="-5"/>
+                <w:sz w:val="18"/>
+              </w:rPr>
+              <w:t>{n</w:t>
+            </w:r>
+            <w:r>
+              <w:rPr>
+                <w:color w:val="808080"/>
+                <w:spacing w:val="-5"/>
+                <w:sz w:val="18"/>
+              </w:rPr>
+              <w:t>d</w:t>
+            </w:r>
+            <w:r>
+              <w:rPr>
+                <w:color w:val="808080"/>
+                <w:spacing w:val="-5"/>
+                <w:sz w:val="18"/>
+              </w:rPr>
+              <w:t>}</w:t>
+            </w:r>
+          </w:p>
+        </w:tc>
+        <w:tc>
+          <w:tcPr>
+            <w:tcW w:w="2801" w:type="dxa"/>
+          </w:tcPr>
+          <w:p>
+            <w:pPr>
+              <w:pStyle w:val="TableParagraph"/>
+              <w:ind w:left="89"/>
+              <w:rPr>
+                <w:sz w:val="18"/>
+              </w:rPr>
+            </w:pPr>
+            <w:r>
+              <w:rPr>
+                <w:color w:val="808080"/>
+                <w:sz w:val="18"/>
+              </w:rPr>
+              <w:t>{c</w:t>
+            </w:r>
+            <w:r>
+              <w:rPr>
+                <w:color w:val="808080"/>
+                <w:sz w:val="18"/>
+              </w:rPr>
+              <w:t>d</w:t>
+            </w:r>
+            <w:r>
+              <w:rPr>
+                <w:color w:val="808080"/>
+                <w:sz w:val="18"/>
+              </w:rPr>
+              <w:t>}</w:t>
+            </w:r>
+          </w:p>
+        </w:tc>
+        <w:tc>
+          <w:tcPr>
+            <w:tcW w:w="1344" w:type="dxa"/>
+            <w:tcBorders>
+              <w:right w:val="single" w:sz="4" w:space="0" w:color="000000"/>
+            </w:tcBorders>
+          </w:tcPr>
+          <w:p>
+            <w:pPr>
+              <w:pStyle w:val="TableParagraph"/>
+              <w:ind w:right="28"/>
+              <w:jc w:val="right"/>
+              <w:rPr>
+                <w:sz w:val="18"/>
+              </w:rPr>
+            </w:pPr>
+            <w:r>
+              <w:rPr>
+                <w:color w:val="808080"/>
+                <w:spacing w:val="-4"/>
+                <w:sz w:val="18"/>
+              </w:rPr>
+              <w:t>{t11d}</w:t>
             </w:r>
           </w:p>
         </w:tc>
@@ -1116,12 +1154,20 @@
           <w:p>
             <w:pPr>
               <w:pStyle w:val="TableParagraph"/>
-              <w:spacing w:before="0" w:line="199" w:lineRule="exact"/>
+              <w:spacing w:before="20"/>
               <w:ind w:left="596"/>
               <w:rPr>
                 <w:sz w:val="18"/>
               </w:rPr>
             </w:pPr>
+            <w:r>
+              <w:rPr>
+                <w:color w:val="808080"/>
+                <w:spacing w:val="-5"/>
+                <w:sz w:val="18"/>
+              </w:rPr>
+              <w:t>24</w:t>
+            </w:r>
           </w:p>
         </w:tc>
         <w:tc>
@@ -1131,12 +1177,20 @@
           <w:p>
             <w:pPr>
               <w:pStyle w:val="TableParagraph"/>
-              <w:spacing w:before="0" w:line="199" w:lineRule="exact"/>
+              <w:spacing w:before="18"/>
               <w:ind w:left="88"/>
               <w:rPr>
                 <w:sz w:val="18"/>
               </w:rPr>
             </w:pPr>
+            <w:r>
+              <w:rPr>
+                <w:color w:val="808080"/>
+                <w:spacing w:val="-2"/>
+                <w:sz w:val="18"/>
+              </w:rPr>
+              <w:t>Aguinaldo</w:t>
+            </w:r>
           </w:p>
         </w:tc>
         <w:tc>
@@ -1149,13 +1203,21 @@
           <w:p>
             <w:pPr>
               <w:pStyle w:val="TableParagraph"/>
-              <w:spacing w:before="0" w:line="199" w:lineRule="exact"/>
-              <w:ind w:right="21"/>
+              <w:spacing w:before="20"/>
+              <w:ind w:right="18"/>
               <w:jc w:val="right"/>
               <w:rPr>
                 <w:sz w:val="18"/>
               </w:rPr>
             </w:pPr>
+            <w:r>
+              <w:rPr>
+                <w:color w:val="808080"/>
+                <w:spacing w:val="-2"/>
+                <w:sz w:val="18"/>
+              </w:rPr>
+              <w:t>{t6}</w:t>
+            </w:r>
           </w:p>
         </w:tc>
         <w:tc>
@@ -1163,75 +1225,57 @@
             <w:tcW w:w="715" w:type="dxa"/>
             <w:tcBorders>
               <w:left w:val="single" w:sz="4" w:space="0" w:color="000000"/>
-            </w:tcBorders>
-          </w:tcPr>
-          <w:p>
-            <w:pPr>
-              <w:pStyle w:val="TableParagraph"/>
-              <w:spacing w:before="0" w:line="199" w:lineRule="exact"/>
-              <w:ind w:right="177"/>
+              <w:bottom w:val="single" w:sz="4" w:space="0" w:color="FFFFFF" w:themeColor="background1"/>
+            </w:tcBorders>
+          </w:tcPr>
+          <w:p>
+            <w:pPr>
+              <w:pStyle w:val="TableParagraph"/>
+              <w:spacing w:before="20"/>
+              <w:ind w:right="77"/>
               <w:jc w:val="right"/>
               <w:rPr>
                 <w:sz w:val="18"/>
               </w:rPr>
             </w:pPr>
-            <w:r>
-              <w:rPr>
-                <w:color w:val="808080"/>
-                <w:spacing w:val="-5"/>
-                <w:sz w:val="18"/>
-              </w:rPr>
-              <w:t>{n_sep}</w:t>
-            </w:r>
           </w:p>
         </w:tc>
         <w:tc>
           <w:tcPr>
             <w:tcW w:w="2801" w:type="dxa"/>
-          </w:tcPr>
-          <w:p>
-            <w:pPr>
-              <w:pStyle w:val="TableParagraph"/>
-              <w:spacing w:before="0" w:line="199" w:lineRule="exact"/>
+            <w:tcBorders>
+              <w:bottom w:val="single" w:sz="4" w:space="0" w:color="FFFFFF" w:themeColor="background1"/>
+            </w:tcBorders>
+          </w:tcPr>
+          <w:p>
+            <w:pPr>
+              <w:pStyle w:val="TableParagraph"/>
+              <w:spacing w:before="18"/>
               <w:ind w:left="89"/>
               <w:rPr>
                 <w:sz w:val="18"/>
               </w:rPr>
             </w:pPr>
-            <w:r>
-              <w:rPr>
-                <w:color w:val="808080"/>
-                <w:sz w:val="18"/>
-              </w:rPr>
-              <w:t>{c_sep}</w:t>
-            </w:r>
           </w:p>
         </w:tc>
         <w:tc>
           <w:tcPr>
             <w:tcW w:w="1344" w:type="dxa"/>
             <w:tcBorders>
+              <w:bottom w:val="single" w:sz="4" w:space="0" w:color="FFFFFF" w:themeColor="background1"/>
               <w:right w:val="single" w:sz="4" w:space="0" w:color="000000"/>
             </w:tcBorders>
           </w:tcPr>
           <w:p>
             <w:pPr>
               <w:pStyle w:val="TableParagraph"/>
-              <w:spacing w:before="0" w:line="199" w:lineRule="exact"/>
-              <w:ind w:right="26"/>
+              <w:spacing w:before="20"/>
+              <w:ind w:right="24"/>
               <w:jc w:val="right"/>
               <w:rPr>
                 <w:sz w:val="18"/>
               </w:rPr>
             </w:pPr>
-            <w:r>
-              <w:rPr>
-                <w:color w:val="808080"/>
-                <w:spacing w:val="-2"/>
-                <w:sz w:val="18"/>
-              </w:rPr>
-              <w:t>{t_sep}</w:t>
-            </w:r>
           </w:p>
         </w:tc>
       </w:tr>
@@ -1249,6 +1293,7 @@
           <w:p>
             <w:pPr>
               <w:pStyle w:val="TableParagraph"/>
+              <w:spacing w:before="18"/>
               <w:ind w:left="596"/>
               <w:rPr>
                 <w:sz w:val="18"/>
@@ -1260,7 +1305,7 @@
                 <w:spacing w:val="-5"/>
                 <w:sz w:val="18"/>
               </w:rPr>
-              <w:t>22</w:t>
+              <w:t>{n7}</w:t>
             </w:r>
           </w:p>
         </w:tc>
@@ -1271,6 +1316,7 @@
           <w:p>
             <w:pPr>
               <w:pStyle w:val="TableParagraph"/>
+              <w:spacing w:before="18"/>
               <w:ind w:left="88"/>
               <w:rPr>
                 <w:sz w:val="18"/>
@@ -1281,53 +1327,7 @@
                 <w:color w:val="808080"/>
                 <w:sz w:val="18"/>
               </w:rPr>
-              <w:t>Prima</w:t>
-            </w:r>
-            <w:r>
-              <w:rPr>
-                <w:color w:val="808080"/>
-                <w:spacing w:val="16"/>
-                <w:sz w:val="18"/>
-              </w:rPr>
-              <w:t xml:space="preserve"> </w:t>
-            </w:r>
-            <w:r>
-              <w:rPr>
-                <w:color w:val="808080"/>
-                <w:sz w:val="18"/>
-              </w:rPr>
-              <w:t>de</w:t>
-            </w:r>
-            <w:r>
-              <w:rPr>
-                <w:color w:val="808080"/>
-                <w:spacing w:val="14"/>
-                <w:sz w:val="18"/>
-              </w:rPr>
-              <w:t xml:space="preserve"> </w:t>
-            </w:r>
-            <w:r>
-              <w:rPr>
-                <w:color w:val="808080"/>
-                <w:sz w:val="18"/>
-              </w:rPr>
-              <w:t>vacaciones</w:t>
-            </w:r>
-            <w:r>
-              <w:rPr>
-                <w:color w:val="808080"/>
-                <w:spacing w:val="2"/>
-                <w:sz w:val="18"/>
-              </w:rPr>
-              <w:t xml:space="preserve"> </w:t>
-            </w:r>
-            <w:r>
-              <w:rPr>
-                <w:color w:val="808080"/>
-                <w:spacing w:val="-5"/>
-                <w:sz w:val="18"/>
-              </w:rPr>
-              <w:t>reportadas $</w:t>
+              <w:t>{c_pant}</w:t>
             </w:r>
           </w:p>
         </w:tc>
@@ -1341,7 +1341,8 @@
           <w:p>
             <w:pPr>
               <w:pStyle w:val="TableParagraph"/>
-              <w:ind w:right="22"/>
+              <w:spacing w:before="18"/>
+              <w:ind w:right="20"/>
               <w:jc w:val="right"/>
               <w:rPr>
                 <w:sz w:val="18"/>
@@ -1353,7 +1354,7 @@
                 <w:spacing w:val="-2"/>
                 <w:sz w:val="18"/>
               </w:rPr>
-              <w:t>{t5}</w:t>
+              <w:t>{t7}</w:t>
             </w:r>
           </w:p>
         </w:tc>
@@ -1361,104 +1362,58 @@
           <w:tcPr>
             <w:tcW w:w="715" w:type="dxa"/>
             <w:tcBorders>
+              <w:top w:val="single" w:sz="4" w:space="0" w:color="FFFFFF" w:themeColor="background1"/>
               <w:left w:val="single" w:sz="4" w:space="0" w:color="000000"/>
             </w:tcBorders>
           </w:tcPr>
           <w:p>
             <w:pPr>
               <w:pStyle w:val="TableParagraph"/>
-              <w:ind w:right="177"/>
+              <w:spacing w:before="18"/>
+              <w:ind w:right="77"/>
               <w:jc w:val="right"/>
               <w:rPr>
                 <w:sz w:val="18"/>
               </w:rPr>
             </w:pPr>
-            <w:r>
-              <w:rPr>
-                <w:color w:val="808080"/>
-                <w:spacing w:val="-5"/>
-                <w:sz w:val="18"/>
-              </w:rPr>
-              <w:t>99</w:t>
-            </w:r>
           </w:p>
         </w:tc>
         <w:tc>
           <w:tcPr>
             <w:tcW w:w="2801" w:type="dxa"/>
-          </w:tcPr>
-          <w:p>
-            <w:pPr>
-              <w:pStyle w:val="TableParagraph"/>
-              <w:ind w:left="89"/>
-              <w:rPr>
-                <w:sz w:val="18"/>
-              </w:rPr>
-            </w:pPr>
-            <w:r>
-              <w:rPr>
-                <w:color w:val="808080"/>
-                <w:sz w:val="18"/>
-              </w:rPr>
-              <w:t>Ajuste</w:t>
-            </w:r>
-            <w:r>
-              <w:rPr>
-                <w:color w:val="808080"/>
-                <w:spacing w:val="-1"/>
-                <w:sz w:val="18"/>
-              </w:rPr>
-              <w:t xml:space="preserve"> </w:t>
-            </w:r>
-            <w:r>
-              <w:rPr>
-                <w:color w:val="808080"/>
-                <w:sz w:val="18"/>
-              </w:rPr>
-              <w:t>al</w:t>
-            </w:r>
-            <w:r>
-              <w:rPr>
-                <w:color w:val="808080"/>
-                <w:spacing w:val="-2"/>
-                <w:sz w:val="18"/>
-              </w:rPr>
-              <w:t xml:space="preserve"> </w:t>
-            </w:r>
-            <w:r>
-              <w:rPr>
-                <w:color w:val="808080"/>
-                <w:spacing w:val="-4"/>
-                <w:sz w:val="18"/>
-              </w:rPr>
-              <w:t>neto</w:t>
-            </w:r>
+            <w:tcBorders>
+              <w:top w:val="single" w:sz="4" w:space="0" w:color="FFFFFF" w:themeColor="background1"/>
+            </w:tcBorders>
+          </w:tcPr>
+          <w:p>
+            <w:pPr>
+              <w:pStyle w:val="TableParagraph"/>
+              <w:spacing w:before="18"/>
+              <w:ind w:left="88"/>
+              <w:rPr>
+                <w:sz w:val="18"/>
+              </w:rPr>
+            </w:pPr>
           </w:p>
         </w:tc>
         <w:tc>
           <w:tcPr>
             <w:tcW w:w="1344" w:type="dxa"/>
             <w:tcBorders>
+              <w:top w:val="single" w:sz="4" w:space="0" w:color="FFFFFF" w:themeColor="background1"/>
               <w:right w:val="single" w:sz="4" w:space="0" w:color="000000"/>
             </w:tcBorders>
           </w:tcPr>
           <w:p>
             <w:pPr>
               <w:pStyle w:val="TableParagraph"/>
-              <w:ind w:right="28"/>
+              <w:spacing w:before="18"/>
+              <w:ind w:right="27"/>
               <w:jc w:val="right"/>
               <w:rPr>
                 <w:sz w:val="18"/>
               </w:rPr>
             </w:pPr>
-            <w:r>
-              <w:rPr>
-                <w:color w:val="808080"/>
-                <w:spacing w:val="-4"/>
-                <w:sz w:val="18"/>
-              </w:rPr>
-              <w:t>{t11}</w:t>
-            </w:r>
           </w:p>
         </w:tc>
       </w:tr>
@@ -1471,12 +1426,12 @@
             <w:tcW w:w="981" w:type="dxa"/>
             <w:tcBorders>
               <w:left w:val="single" w:sz="4" w:space="0" w:color="000000"/>
-            </w:tcBorders>
-          </w:tcPr>
-          <w:p>
-            <w:pPr>
-              <w:pStyle w:val="TableParagraph"/>
-              <w:spacing w:before="20"/>
+              <w:bottom w:val="single" w:sz="4" w:space="0" w:color="FFFFFF"/>
+            </w:tcBorders>
+          </w:tcPr>
+          <w:p>
+            <w:pPr>
+              <w:pStyle w:val="TableParagraph"/>
               <w:ind w:left="596"/>
               <w:rPr>
                 <w:sz w:val="18"/>
@@ -1488,18 +1443,20 @@
                 <w:spacing w:val="-5"/>
                 <w:sz w:val="18"/>
               </w:rPr>
-              <w:t>24</w:t>
+              <w:t>{np}</w:t>
             </w:r>
           </w:p>
         </w:tc>
         <w:tc>
           <w:tcPr>
             <w:tcW w:w="3042" w:type="dxa"/>
-          </w:tcPr>
-          <w:p>
-            <w:pPr>
-              <w:pStyle w:val="TableParagraph"/>
-              <w:spacing w:before="18"/>
+            <w:tcBorders>
+              <w:bottom w:val="single" w:sz="4" w:space="0" w:color="FFFFFF"/>
+            </w:tcBorders>
+          </w:tcPr>
+          <w:p>
+            <w:pPr>
+              <w:pStyle w:val="TableParagraph"/>
               <w:ind w:left="88"/>
               <w:rPr>
                 <w:sz w:val="18"/>
@@ -1508,10 +1465,9 @@
             <w:r>
               <w:rPr>
                 <w:color w:val="808080"/>
-                <w:spacing w:val="-2"/>
-                <w:sz w:val="18"/>
-              </w:rPr>
-              <w:t>Aguinaldo</w:t>
+                <w:sz w:val="18"/>
+              </w:rPr>
+              <w:t>{cp}</w:t>
             </w:r>
           </w:p>
         </w:tc>
@@ -1519,14 +1475,14 @@
           <w:tcPr>
             <w:tcW w:w="1765" w:type="dxa"/>
             <w:tcBorders>
+              <w:bottom w:val="single" w:sz="4" w:space="0" w:color="FFFFFF"/>
               <w:right w:val="single" w:sz="4" w:space="0" w:color="000000"/>
             </w:tcBorders>
           </w:tcPr>
           <w:p>
             <w:pPr>
               <w:pStyle w:val="TableParagraph"/>
-              <w:spacing w:before="20"/>
-              <w:ind w:right="18"/>
+              <w:ind w:right="20"/>
               <w:jc w:val="right"/>
               <w:rPr>
                 <w:sz w:val="18"/>
@@ -1535,10 +1491,10 @@
             <w:r>
               <w:rPr>
                 <w:color w:val="808080"/>
-                <w:spacing w:val="-2"/>
-                <w:sz w:val="18"/>
-              </w:rPr>
-              <w:t>{t6}</w:t>
+                <w:spacing w:val="-4"/>
+                <w:sz w:val="18"/>
+              </w:rPr>
+              <w:t>{t11p}</w:t>
             </w:r>
           </w:p>
         </w:tc>
@@ -1547,13 +1503,11 @@
             <w:tcW w:w="715" w:type="dxa"/>
             <w:tcBorders>
               <w:left w:val="single" w:sz="4" w:space="0" w:color="000000"/>
-              <w:bottom w:val="single" w:sz="4" w:space="0" w:color="FFFFFF" w:themeColor="background1"/>
-            </w:tcBorders>
-          </w:tcPr>
-          <w:p>
-            <w:pPr>
-              <w:pStyle w:val="TableParagraph"/>
-              <w:spacing w:before="20"/>
+            </w:tcBorders>
+          </w:tcPr>
+          <w:p>
+            <w:pPr>
+              <w:pStyle w:val="TableParagraph"/>
               <w:ind w:right="77"/>
               <w:jc w:val="right"/>
               <w:rPr>
@@ -1565,15 +1519,11 @@
         <w:tc>
           <w:tcPr>
             <w:tcW w:w="2801" w:type="dxa"/>
-            <w:tcBorders>
-              <w:bottom w:val="single" w:sz="4" w:space="0" w:color="FFFFFF" w:themeColor="background1"/>
-            </w:tcBorders>
-          </w:tcPr>
-          <w:p>
-            <w:pPr>
-              <w:pStyle w:val="TableParagraph"/>
-              <w:spacing w:before="18"/>
-              <w:ind w:left="89"/>
+          </w:tcPr>
+          <w:p>
+            <w:pPr>
+              <w:pStyle w:val="TableParagraph"/>
+              <w:ind w:left="88"/>
               <w:rPr>
                 <w:sz w:val="18"/>
               </w:rPr>
@@ -1584,15 +1534,13 @@
           <w:tcPr>
             <w:tcW w:w="1344" w:type="dxa"/>
             <w:tcBorders>
-              <w:bottom w:val="single" w:sz="4" w:space="0" w:color="FFFFFF" w:themeColor="background1"/>
               <w:right w:val="single" w:sz="4" w:space="0" w:color="000000"/>
             </w:tcBorders>
           </w:tcPr>
           <w:p>
             <w:pPr>
               <w:pStyle w:val="TableParagraph"/>
-              <w:spacing w:before="20"/>
-              <w:ind w:right="24"/>
+              <w:ind w:right="26"/>
               <w:jc w:val="right"/>
               <w:rPr>
                 <w:sz w:val="18"/>
@@ -1603,270 +1551,7 @@
       </w:tr>
       <w:tr>
         <w:trPr>
-          <w:trHeight w:val="250"/>
-        </w:trPr>
-        <w:tc>
-          <w:tcPr>
-            <w:tcW w:w="981" w:type="dxa"/>
-            <w:tcBorders>
-              <w:left w:val="single" w:sz="4" w:space="0" w:color="000000"/>
-            </w:tcBorders>
-          </w:tcPr>
-          <w:p>
-            <w:pPr>
-              <w:pStyle w:val="TableParagraph"/>
-              <w:spacing w:before="18"/>
-              <w:ind w:left="596"/>
-              <w:rPr>
-                <w:sz w:val="18"/>
-              </w:rPr>
-            </w:pPr>
-            <w:r>
-              <w:rPr>
-                <w:color w:val="808080"/>
-                <w:spacing w:val="-5"/>
-                <w:sz w:val="18"/>
-              </w:rPr>
-              <w:t>{n7}</w:t>
-            </w:r>
-          </w:p>
-        </w:tc>
-        <w:tc>
-          <w:tcPr>
-            <w:tcW w:w="3042" w:type="dxa"/>
-          </w:tcPr>
-          <w:p>
-            <w:pPr>
-              <w:pStyle w:val="TableParagraph"/>
-              <w:spacing w:before="18"/>
-              <w:ind w:left="88"/>
-              <w:rPr>
-                <w:sz w:val="18"/>
-              </w:rPr>
-            </w:pPr>
-            <w:r>
-              <w:rPr>
-                <w:color w:val="808080"/>
-                <w:sz w:val="18"/>
-              </w:rPr>
-              <w:t>{</w:t>
-            </w:r>
-            <w:proofErr w:type="spellStart"/>
-            <w:r>
-              <w:rPr>
-                <w:color w:val="808080"/>
-                <w:sz w:val="18"/>
-              </w:rPr>
-              <w:t>c_pant</w:t>
-            </w:r>
-            <w:proofErr w:type="spellEnd"/>
-            <w:r>
-              <w:rPr>
-                <w:color w:val="808080"/>
-                <w:sz w:val="18"/>
-              </w:rPr>
-              <w:t>}</w:t>
-            </w:r>
-          </w:p>
-        </w:tc>
-        <w:tc>
-          <w:tcPr>
-            <w:tcW w:w="1765" w:type="dxa"/>
-            <w:tcBorders>
-              <w:right w:val="single" w:sz="4" w:space="0" w:color="000000"/>
-            </w:tcBorders>
-          </w:tcPr>
-          <w:p>
-            <w:pPr>
-              <w:pStyle w:val="TableParagraph"/>
-              <w:spacing w:before="18"/>
-              <w:ind w:right="20"/>
-              <w:jc w:val="right"/>
-              <w:rPr>
-                <w:sz w:val="18"/>
-              </w:rPr>
-            </w:pPr>
-            <w:r>
-              <w:rPr>
-                <w:color w:val="808080"/>
-                <w:spacing w:val="-2"/>
-                <w:sz w:val="18"/>
-              </w:rPr>
-              <w:t>{t7}</w:t>
-            </w:r>
-          </w:p>
-        </w:tc>
-        <w:tc>
-          <w:tcPr>
-            <w:tcW w:w="715" w:type="dxa"/>
-            <w:tcBorders>
-              <w:top w:val="single" w:sz="4" w:space="0" w:color="FFFFFF" w:themeColor="background1"/>
-              <w:left w:val="single" w:sz="4" w:space="0" w:color="000000"/>
-            </w:tcBorders>
-          </w:tcPr>
-          <w:p>
-            <w:pPr>
-              <w:pStyle w:val="TableParagraph"/>
-              <w:spacing w:before="18"/>
-              <w:ind w:right="77"/>
-              <w:jc w:val="right"/>
-              <w:rPr>
-                <w:sz w:val="18"/>
-              </w:rPr>
-            </w:pPr>
-          </w:p>
-        </w:tc>
-        <w:tc>
-          <w:tcPr>
-            <w:tcW w:w="2801" w:type="dxa"/>
-            <w:tcBorders>
-              <w:top w:val="single" w:sz="4" w:space="0" w:color="FFFFFF" w:themeColor="background1"/>
-            </w:tcBorders>
-          </w:tcPr>
-          <w:p>
-            <w:pPr>
-              <w:pStyle w:val="TableParagraph"/>
-              <w:spacing w:before="18"/>
-              <w:ind w:left="88"/>
-              <w:rPr>
-                <w:sz w:val="18"/>
-              </w:rPr>
-            </w:pPr>
-          </w:p>
-        </w:tc>
-        <w:tc>
-          <w:tcPr>
-            <w:tcW w:w="1344" w:type="dxa"/>
-            <w:tcBorders>
-              <w:top w:val="single" w:sz="4" w:space="0" w:color="FFFFFF" w:themeColor="background1"/>
-              <w:right w:val="single" w:sz="4" w:space="0" w:color="000000"/>
-            </w:tcBorders>
-          </w:tcPr>
-          <w:p>
-            <w:pPr>
-              <w:pStyle w:val="TableParagraph"/>
-              <w:spacing w:before="18"/>
-              <w:ind w:right="27"/>
-              <w:jc w:val="right"/>
-              <w:rPr>
-                <w:sz w:val="18"/>
-              </w:rPr>
-            </w:pPr>
-          </w:p>
-        </w:tc>
-      </w:tr>
-      <w:tr>
-        <w:trPr>
-          <w:trHeight w:val="252"/>
-        </w:trPr>
-        <w:tc>
-          <w:tcPr>
-            <w:tcW w:w="981" w:type="dxa"/>
-            <w:tcBorders>
-              <w:left w:val="single" w:sz="4" w:space="0" w:color="000000"/>
-              <w:bottom w:val="single" w:sz="4" w:space="0" w:color="FFFFFF"/>
-            </w:tcBorders>
-          </w:tcPr>
-          <w:p>
-            <w:pPr>
-              <w:pStyle w:val="TableParagraph"/>
-              <w:ind w:left="596"/>
-              <w:rPr>
-                <w:sz w:val="18"/>
-              </w:rPr>
-            </w:pPr>
-          </w:p>
-        </w:tc>
-        <w:tc>
-          <w:tcPr>
-            <w:tcW w:w="3042" w:type="dxa"/>
-            <w:tcBorders>
-              <w:bottom w:val="single" w:sz="4" w:space="0" w:color="FFFFFF"/>
-            </w:tcBorders>
-          </w:tcPr>
-          <w:p>
-            <w:pPr>
-              <w:pStyle w:val="TableParagraph"/>
-              <w:ind w:left="88"/>
-              <w:rPr>
-                <w:sz w:val="18"/>
-              </w:rPr>
-            </w:pPr>
-          </w:p>
-        </w:tc>
-        <w:tc>
-          <w:tcPr>
-            <w:tcW w:w="1765" w:type="dxa"/>
-            <w:tcBorders>
-              <w:bottom w:val="single" w:sz="4" w:space="0" w:color="FFFFFF"/>
-              <w:right w:val="single" w:sz="4" w:space="0" w:color="000000"/>
-            </w:tcBorders>
-          </w:tcPr>
-          <w:p>
-            <w:pPr>
-              <w:pStyle w:val="TableParagraph"/>
-              <w:ind w:right="20"/>
-              <w:jc w:val="right"/>
-              <w:rPr>
-                <w:sz w:val="18"/>
-              </w:rPr>
-            </w:pPr>
-          </w:p>
-        </w:tc>
-        <w:tc>
-          <w:tcPr>
-            <w:tcW w:w="715" w:type="dxa"/>
-            <w:tcBorders>
-              <w:left w:val="single" w:sz="4" w:space="0" w:color="000000"/>
-            </w:tcBorders>
-          </w:tcPr>
-          <w:p>
-            <w:pPr>
-              <w:pStyle w:val="TableParagraph"/>
-              <w:ind w:right="77"/>
-              <w:jc w:val="right"/>
-              <w:rPr>
-                <w:sz w:val="18"/>
-              </w:rPr>
-            </w:pPr>
-          </w:p>
-        </w:tc>
-        <w:tc>
-          <w:tcPr>
-            <w:tcW w:w="2801" w:type="dxa"/>
-          </w:tcPr>
-          <w:p>
-            <w:pPr>
-              <w:pStyle w:val="TableParagraph"/>
-              <w:ind w:left="88"/>
-              <w:rPr>
-                <w:sz w:val="18"/>
-              </w:rPr>
-            </w:pPr>
-          </w:p>
-        </w:tc>
-        <w:tc>
-          <w:tcPr>
-            <w:tcW w:w="1344" w:type="dxa"/>
-            <w:tcBorders>
-              <w:right w:val="single" w:sz="4" w:space="0" w:color="000000"/>
-            </w:tcBorders>
-          </w:tcPr>
-          <w:p>
-            <w:pPr>
-              <w:pStyle w:val="TableParagraph"/>
-              <w:ind w:right="26"/>
-              <w:jc w:val="right"/>
-              <w:rPr>
-                <w:sz w:val="18"/>
-              </w:rPr>
-            </w:pPr>
-          </w:p>
-        </w:tc>
-      </w:tr>
-      <w:tr>
-        <w:trPr>
-          <w:trHeight w:val="2600"/>
+          <w:trHeight w:val="3303"/>
         </w:trPr>
         <w:tc>
           <w:tcPr>
@@ -1898,36 +1583,11 @@
           <w:p>
             <w:pPr>
               <w:pStyle w:val="TableParagraph"/>
-              <w:spacing w:before="240"/>
-              <w:ind w:left="0"/>
-              <w:jc w:val="center"/>
-              <w:rPr>
-                <w:sz w:val="18"/>
-              </w:rPr>
-            </w:pPr>
-            <w:r>
-              <w:rPr>
-                <w:sz w:val="18"/>
-              </w:rPr>
-              <w:t xml:space="preserve">________________________________________</w:t>
-            </w:r>
-          </w:p>
-          <w:p>
-            <w:pPr>
-              <w:pStyle w:val="TableParagraph"/>
-              <w:spacing w:before="200" w:after="0" w:line="276" w:lineRule="atLeast"/>
-              <w:ind w:left="0"/>
-              <w:jc w:val="center"/>
-              <w:rPr>
-                <w:sz w:val="17"/>
-              </w:rPr>
-            </w:pPr>
-            <w:r>
-              <w:rPr>
-                <w:sz w:val="17"/>
-              </w:rPr>
-              <w:t>{empleado_nombre_completo}</w:t>
-            </w:r>
+              <w:ind w:left="87"/>
+              <w:rPr>
+                <w:sz w:val="18"/>
+              </w:rPr>
+            </w:pPr>
           </w:p>
         </w:tc>
         <w:tc>
@@ -2139,29 +1799,7 @@
                 <w:position w:val="3"/>
                 <w:sz w:val="18"/>
               </w:rPr>
-              <w:t>{</w:t>
-            </w:r>
-            <w:proofErr w:type="spellStart"/>
-            <w:r>
-              <w:rPr>
-                <w:rFonts w:ascii="Arial"/>
-                <w:b/>
-                <w:spacing w:val="-2"/>
-                <w:position w:val="3"/>
-                <w:sz w:val="18"/>
-              </w:rPr>
-              <w:t>suma_p</w:t>
-            </w:r>
-            <w:proofErr w:type="spellEnd"/>
-            <w:r>
-              <w:rPr>
-                <w:rFonts w:ascii="Arial"/>
-                <w:b/>
-                <w:spacing w:val="-2"/>
-                <w:position w:val="3"/>
-                <w:sz w:val="18"/>
-              </w:rPr>
-              <w:t>}</w:t>
+              <w:t>{suma_p}</w:t>
             </w:r>
           </w:p>
         </w:tc>
@@ -2177,7 +1815,7 @@
             <w:pPr>
               <w:pStyle w:val="TableParagraph"/>
               <w:tabs>
-                <w:tab w:val="left" w:pos="4786"/>
+                <w:tab w:val="left" w:pos="3638"/>
               </w:tabs>
               <w:spacing w:before="45"/>
               <w:ind w:right="120"/>
@@ -2265,29 +1903,7 @@
                 <w:position w:val="2"/>
                 <w:sz w:val="18"/>
               </w:rPr>
-              <w:t>{</w:t>
-            </w:r>
-            <w:proofErr w:type="spellStart"/>
-            <w:r>
-              <w:rPr>
-                <w:rFonts w:ascii="Arial"/>
-                <w:b/>
-                <w:spacing w:val="-2"/>
-                <w:position w:val="2"/>
-                <w:sz w:val="18"/>
-              </w:rPr>
-              <w:t>suma_d</w:t>
-            </w:r>
-            <w:proofErr w:type="spellEnd"/>
-            <w:r>
-              <w:rPr>
-                <w:rFonts w:ascii="Arial"/>
-                <w:b/>
-                <w:spacing w:val="-2"/>
-                <w:position w:val="2"/>
-                <w:sz w:val="18"/>
-              </w:rPr>
-              <w:t>}</w:t>
+              <w:t>{suma_d}</w:t>
             </w:r>
           </w:p>
         </w:tc>
@@ -2326,7 +1942,7 @@
             <w:pPr>
               <w:pStyle w:val="TableParagraph"/>
               <w:tabs>
-                <w:tab w:val="left" w:pos="4786"/>
+                <w:tab w:val="left" w:pos="2611"/>
               </w:tabs>
               <w:spacing w:before="83"/>
               <w:ind w:right="126"/>
@@ -2338,7 +1954,6 @@
                 <w:sz w:val="18"/>
               </w:rPr>
             </w:pPr>
-            <w:proofErr w:type="gramStart"/>
             <w:r>
               <w:rPr>
                 <w:rFonts w:ascii="Arial"/>
@@ -2381,7 +1996,6 @@
               </w:rPr>
               <w:t>Pagar</w:t>
             </w:r>
-            <w:proofErr w:type="gramEnd"/>
             <w:r>
               <w:rPr>
                 <w:rFonts w:ascii="Arial"/>
@@ -2416,29 +2030,7 @@
                 <w:position w:val="2"/>
                 <w:sz w:val="18"/>
               </w:rPr>
-              <w:t>{</w:t>
-            </w:r>
-            <w:proofErr w:type="spellStart"/>
-            <w:r>
-              <w:rPr>
-                <w:rFonts w:ascii="Arial"/>
-                <w:b/>
-                <w:spacing w:val="-2"/>
-                <w:position w:val="2"/>
-                <w:sz w:val="18"/>
-              </w:rPr>
-              <w:t>neto_p</w:t>
-            </w:r>
-            <w:proofErr w:type="spellEnd"/>
-            <w:r>
-              <w:rPr>
-                <w:rFonts w:ascii="Arial"/>
-                <w:b/>
-                <w:spacing w:val="-2"/>
-                <w:position w:val="2"/>
-                <w:sz w:val="18"/>
-              </w:rPr>
-              <w:t>}</w:t>
+              <w:t>{neto_p}</w:t>
             </w:r>
           </w:p>
         </w:tc>
@@ -2447,237 +2039,28 @@
     <w:p>
       <w:pPr>
         <w:pStyle w:val="Textoindependiente"/>
-        <w:ind w:left="513" w:right="873"/>
-        <w:jc w:val="both"/>
-      </w:pPr>
-    </w:p>
-    <w:p>
-      <w:pPr>
-        <w:pStyle w:val="Textoindependiente"/>
-        <w:ind w:left="513" w:right="873"/>
-        <w:jc w:val="both"/>
-      </w:pPr>
-    </w:p>
-    <w:p>
-      <w:pPr>
-        <w:pStyle w:val="Textoindependiente"/>
-        <w:ind w:left="513" w:right="873"/>
+        <w:spacing w:before="180"/>
+        <w:ind w:left="170" w:right="340"/>
         <w:jc w:val="both"/>
       </w:pPr>
       <w:r>
-        <w:t xml:space="preserve">Así mismo manifiesto que hasta el momento en que se da por terminada la relación laboral no se me adeuda ninguna cantidad de dinero por concepto de salarios devengados, diferencia de </w:t>
-      </w:r>
-      <w:proofErr w:type="gramStart"/>
-      <w:r>
-        <w:t>los mismos</w:t>
-      </w:r>
-      <w:proofErr w:type="gramEnd"/>
-      <w:r>
-        <w:t>, participación de utilidades, comisiones, horas extras, vacaciones, séptimos días, días festivos, prima dominical, vacacional y de antigüedad, y</w:t>
+        <w:t>Así mismo, una vez cubierto en su totalidad el importe antes señalado, la persona trabajadora manifiesta que no se le adeuda cantidad alguna por concepto de salarios devengados, diferencias de salario, participación de utilidades, comisiones, horas extras, vacaciones, séptimos días, días festivos, prima dominical, prima vacacional, prima de antigüedad y demás prestaciones que deriven de la relación laboral, al haber quedado comprendidas y liquidadas en los términos del presente finiquito.</w:t>
       </w:r>
       <w:r>
-        <w:rPr>
-          <w:spacing w:val="-4"/>
-        </w:rPr>
         <w:t xml:space="preserve"> </w:t>
       </w:r>
       <w:r>
-        <w:t>demás prestaciones que otorga la Ley</w:t>
-      </w:r>
-      <w:r>
-        <w:rPr>
-          <w:spacing w:val="40"/>
-        </w:rPr>
-        <w:t xml:space="preserve"> </w:t>
-      </w:r>
-      <w:r>
-        <w:t>Federal Del Trabajo, ya que las mismas siempre me fueron</w:t>
-      </w:r>
-      <w:r>
-        <w:rPr>
-          <w:spacing w:val="-1"/>
-        </w:rPr>
-        <w:t xml:space="preserve"> </w:t>
-      </w:r>
-      <w:r>
-        <w:t>íntegramente</w:t>
-      </w:r>
-      <w:r>
-        <w:rPr>
-          <w:spacing w:val="-1"/>
-        </w:rPr>
-        <w:t xml:space="preserve"> </w:t>
-      </w:r>
-      <w:r>
-        <w:t>cubiertas en los términos de</w:t>
-      </w:r>
-      <w:r>
-        <w:rPr>
-          <w:spacing w:val="-1"/>
-        </w:rPr>
-        <w:t xml:space="preserve"> </w:t>
-      </w:r>
-      <w:r>
-        <w:t>la</w:t>
-      </w:r>
-      <w:r>
-        <w:rPr>
-          <w:spacing w:val="-1"/>
-        </w:rPr>
-        <w:t xml:space="preserve"> </w:t>
-      </w:r>
-      <w:r>
-        <w:t>ley. También hago constar para</w:t>
-      </w:r>
-      <w:r>
-        <w:rPr>
-          <w:spacing w:val="-1"/>
-        </w:rPr>
-        <w:t xml:space="preserve"> </w:t>
-      </w:r>
-      <w:r>
-        <w:t>todos los efectos legales conducentes,</w:t>
-      </w:r>
-      <w:r>
-        <w:rPr>
-          <w:spacing w:val="40"/>
-        </w:rPr>
-        <w:t xml:space="preserve"> </w:t>
-      </w:r>
-      <w:r>
-        <w:t>que durante</w:t>
-      </w:r>
-      <w:r>
-        <w:rPr>
-          <w:spacing w:val="40"/>
-        </w:rPr>
-        <w:t xml:space="preserve"> </w:t>
-      </w:r>
-      <w:r>
-        <w:t>la vigencia de</w:t>
-      </w:r>
-      <w:r>
-        <w:rPr>
-          <w:spacing w:val="40"/>
-        </w:rPr>
-        <w:t xml:space="preserve"> </w:t>
-      </w:r>
-      <w:r>
-        <w:t>mi relación</w:t>
-      </w:r>
-      <w:r>
-        <w:rPr>
-          <w:spacing w:val="40"/>
-        </w:rPr>
-        <w:t xml:space="preserve"> </w:t>
-      </w:r>
-      <w:r>
-        <w:t>obrero-patronal</w:t>
-      </w:r>
-      <w:r>
-        <w:rPr>
-          <w:spacing w:val="40"/>
-        </w:rPr>
-        <w:t xml:space="preserve"> </w:t>
-      </w:r>
-      <w:r>
-        <w:t>no</w:t>
-      </w:r>
-      <w:r>
-        <w:rPr>
-          <w:spacing w:val="40"/>
-        </w:rPr>
-        <w:t xml:space="preserve"> </w:t>
-      </w:r>
-      <w:r>
-        <w:t>fui</w:t>
-      </w:r>
-      <w:r>
-        <w:rPr>
-          <w:spacing w:val="40"/>
-        </w:rPr>
-        <w:t xml:space="preserve"> </w:t>
-      </w:r>
-      <w:r>
-        <w:t>objeto de riesgo</w:t>
-      </w:r>
-      <w:r>
-        <w:rPr>
-          <w:spacing w:val="40"/>
-        </w:rPr>
-        <w:t xml:space="preserve"> </w:t>
-      </w:r>
-      <w:r>
-        <w:t>profesional alguno,</w:t>
-      </w:r>
-      <w:r>
-        <w:rPr>
-          <w:spacing w:val="40"/>
-        </w:rPr>
-        <w:t xml:space="preserve"> </w:t>
-      </w:r>
-      <w:r>
-        <w:t>motivo por el</w:t>
-      </w:r>
-      <w:r>
-        <w:rPr>
-          <w:spacing w:val="40"/>
-        </w:rPr>
-        <w:t xml:space="preserve"> </w:t>
-      </w:r>
-      <w:r>
-        <w:t>cual libero a mi</w:t>
-      </w:r>
-      <w:r>
-        <w:rPr>
-          <w:spacing w:val="40"/>
-        </w:rPr>
-        <w:t xml:space="preserve"> </w:t>
-      </w:r>
-      <w:r>
-        <w:t>patrón de</w:t>
-      </w:r>
-      <w:r>
-        <w:rPr>
-          <w:spacing w:val="40"/>
-        </w:rPr>
-        <w:t xml:space="preserve"> </w:t>
-      </w:r>
-      <w:r>
-        <w:t>toda responsabilidad</w:t>
-      </w:r>
-      <w:r>
-        <w:rPr>
-          <w:spacing w:val="40"/>
-        </w:rPr>
-        <w:t xml:space="preserve"> </w:t>
-      </w:r>
-      <w:r>
-        <w:t>laboral</w:t>
-      </w:r>
-      <w:r>
-        <w:rPr>
-          <w:spacing w:val="40"/>
-        </w:rPr>
-        <w:t xml:space="preserve"> </w:t>
-      </w:r>
-      <w:r>
-        <w:t>y de seguridad social o de cualquier</w:t>
-      </w:r>
-      <w:r>
-        <w:rPr>
-          <w:spacing w:val="40"/>
-        </w:rPr>
-        <w:t xml:space="preserve"> </w:t>
-      </w:r>
-      <w:r>
-        <w:t>otro concepto derivado del contrato de trabajo.</w:t>
+        <w:t>De igual forma, para todos los efectos legales conducentes, la persona trabajadora manifiesta que durante la vigencia de la relación laboral no fue objeto de riesgo profesional alguno no reportado, por lo que, una vez realizado el pago total del finiquito, otorga el más amplio recibo y finiquito que en derecho proceda respecto de las obligaciones laborales y de seguridad social derivadas de dicha relación.</w:t>
       </w:r>
     </w:p>
     <w:p>
       <w:pPr>
         <w:pStyle w:val="Textoindependiente"/>
-        <w:spacing w:before="180"/>
+        <w:ind w:right="195"/>
+        <w:jc w:val="center"/>
+        <w:rPr>
+          <w:spacing w:val="-2"/>
+        </w:rPr>
       </w:pPr>
     </w:p>
     <w:p>
@@ -2685,20 +2068,30 @@
         <w:pStyle w:val="Textoindependiente"/>
         <w:ind w:right="195"/>
         <w:jc w:val="center"/>
+        <w:rPr>
+          <w:b/>
+          <w:bCs/>
+        </w:rPr>
       </w:pPr>
       <w:r>
         <w:rPr>
+          <w:b/>
+          <w:bCs/>
           <w:spacing w:val="-2"/>
         </w:rPr>
         <w:t>ATENTAMENTE</w:t>
       </w:r>
     </w:p>
     <w:sectPr>
-      <w:headerReference w:type="default" r:id="rId6"/>
-      <w:footerReference w:type="default" r:id="rId7"/>
+      <w:headerReference w:type="even" r:id="rId6"/>
+      <w:headerReference w:type="default" r:id="rId7"/>
+      <w:footerReference w:type="even" r:id="rId8"/>
+      <w:footerReference w:type="default" r:id="rId9"/>
+      <w:headerReference w:type="first" r:id="rId10"/>
+      <w:footerReference w:type="first" r:id="rId11"/>
       <w:type w:val="continuous"/>
       <w:pgSz w:w="12240" w:h="15840"/>
-      <w:pgMar w:top="1440" w:right="360" w:bottom="1020" w:left="720" w:header="708" w:footer="827" w:gutter="0"/>
+      <w:pgMar w:top="1880" w:right="360" w:bottom="1020" w:left="720" w:header="912" w:footer="827" w:gutter="0"/>
       <w:pgNumType w:start="1"/>
       <w:cols w:space="720"/>
     </w:sectPr>
@@ -2729,6 +2122,16 @@
 <w:ftr xmlns:wpc="http://schemas.microsoft.com/office/word/2010/wordprocessingCanvas" xmlns:cx="http://schemas.microsoft.com/office/drawing/2014/chartex" xmlns:cx1="http://schemas.microsoft.com/office/drawing/2015/9/8/chartex" xmlns:cx2="http://schemas.microsoft.com/office/drawing/2015/10/21/chartex" xmlns:cx3="http://schemas.microsoft.com/office/drawing/2016/5/9/chartex" xmlns:cx4="http://schemas.microsoft.com/office/drawing/2016/5/10/chartex" xmlns:cx5="http://schemas.microsoft.com/office/drawing/2016/5/11/chartex" xmlns:cx6="http://schemas.microsoft.com/office/drawing/2016/5/12/chartex" xmlns:cx7="http://schemas.microsoft.com/office/drawing/2016/5/13/chartex" xmlns:cx8="http://schemas.microsoft.com/office/drawing/2016/5/14/chartex" xmlns:mc="http://schemas.openxmlformats.org/markup-compatibility/2006" xmlns:aink="http://schemas.microsoft.com/office/drawing/2016/ink" xmlns:am3d="http://schemas.microsoft.com/office/drawing/2017/model3d" xmlns:o="urn:schemas-microsoft-com:office:office" xmlns:oel="http://schemas.microsoft.com/office/2019/extlst" xmlns:r="http://schemas.openxmlformats.org/officeDocument/2006/relationships" xmlns:m="http://schemas.openxmlformats.org/officeDocument/2006/math" xmlns:v="urn:schemas-microsoft-com:vml" xmlns:wp14="http://schemas.microsoft.com/office/word/2010/wordprocessingDrawing" xmlns:wp="http://schemas.openxmlformats.org/drawingml/2006/wordprocessingDrawing" xmlns:w10="urn:schemas-microsoft-com:office:word" xmlns:w="http://schemas.openxmlformats.org/wordprocessingml/2006/main" xmlns:w14="http://schemas.microsoft.com/office/word/2010/wordml" xmlns:w15="http://schemas.microsoft.com/office/word/2012/wordml" xmlns:w16cex="http://schemas.microsoft.com/office/word/2018/wordml/cex" xmlns:w16cid="http://schemas.microsoft.com/office/word/2016/wordml/cid" xmlns:w16="http://schemas.microsoft.com/office/word/2018/wordml" xmlns:w16du="http://schemas.microsoft.com/office/word/2023/wordml/word16du" xmlns:w16sdtdh="http://schemas.microsoft.com/office/word/2020/wordml/sdtdatahash" xmlns:w16sdtfl="http://schemas.microsoft.com/office/word/2024/wordml/sdtformatlock" xmlns:w16se="http://schemas.microsoft.com/office/word/2015/wordml/symex" xmlns:wpg="http://schemas.microsoft.com/office/word/2010/wordprocessingGroup" xmlns:wpi="http://schemas.microsoft.com/office/word/2010/wordprocessingInk" xmlns:wne="http://schemas.microsoft.com/office/word/2006/wordml" xmlns:wps="http://schemas.microsoft.com/office/word/2010/wordprocessingShape" mc:Ignorable="w14 w15 w16se w16cid w16 w16cex w16sdtdh w16sdtfl w16du wp14">
   <w:p>
     <w:pPr>
+      <w:pStyle w:val="Piedepgina"/>
+    </w:pPr>
+  </w:p>
+</w:ftr>
+</file>
+
+<file path=word/footer2.xml><?xml version="1.0" encoding="utf-8"?>
+<w:ftr xmlns:wpc="http://schemas.microsoft.com/office/word/2010/wordprocessingCanvas" xmlns:cx="http://schemas.microsoft.com/office/drawing/2014/chartex" xmlns:cx1="http://schemas.microsoft.com/office/drawing/2015/9/8/chartex" xmlns:cx2="http://schemas.microsoft.com/office/drawing/2015/10/21/chartex" xmlns:cx3="http://schemas.microsoft.com/office/drawing/2016/5/9/chartex" xmlns:cx4="http://schemas.microsoft.com/office/drawing/2016/5/10/chartex" xmlns:cx5="http://schemas.microsoft.com/office/drawing/2016/5/11/chartex" xmlns:cx6="http://schemas.microsoft.com/office/drawing/2016/5/12/chartex" xmlns:cx7="http://schemas.microsoft.com/office/drawing/2016/5/13/chartex" xmlns:cx8="http://schemas.microsoft.com/office/drawing/2016/5/14/chartex" xmlns:mc="http://schemas.openxmlformats.org/markup-compatibility/2006" xmlns:aink="http://schemas.microsoft.com/office/drawing/2016/ink" xmlns:am3d="http://schemas.microsoft.com/office/drawing/2017/model3d" xmlns:o="urn:schemas-microsoft-com:office:office" xmlns:oel="http://schemas.microsoft.com/office/2019/extlst" xmlns:r="http://schemas.openxmlformats.org/officeDocument/2006/relationships" xmlns:m="http://schemas.openxmlformats.org/officeDocument/2006/math" xmlns:v="urn:schemas-microsoft-com:vml" xmlns:wp14="http://schemas.microsoft.com/office/word/2010/wordprocessingDrawing" xmlns:wp="http://schemas.openxmlformats.org/drawingml/2006/wordprocessingDrawing" xmlns:w10="urn:schemas-microsoft-com:office:word" xmlns:w="http://schemas.openxmlformats.org/wordprocessingml/2006/main" xmlns:w14="http://schemas.microsoft.com/office/word/2010/wordml" xmlns:w15="http://schemas.microsoft.com/office/word/2012/wordml" xmlns:w16cex="http://schemas.microsoft.com/office/word/2018/wordml/cex" xmlns:w16cid="http://schemas.microsoft.com/office/word/2016/wordml/cid" xmlns:w16="http://schemas.microsoft.com/office/word/2018/wordml" xmlns:w16du="http://schemas.microsoft.com/office/word/2023/wordml/word16du" xmlns:w16sdtdh="http://schemas.microsoft.com/office/word/2020/wordml/sdtdatahash" xmlns:w16sdtfl="http://schemas.microsoft.com/office/word/2024/wordml/sdtformatlock" xmlns:w16se="http://schemas.microsoft.com/office/word/2015/wordml/symex" xmlns:wpg="http://schemas.microsoft.com/office/word/2010/wordprocessingGroup" xmlns:wpi="http://schemas.microsoft.com/office/word/2010/wordprocessingInk" xmlns:wne="http://schemas.microsoft.com/office/word/2006/wordml" xmlns:wps="http://schemas.microsoft.com/office/word/2010/wordprocessingShape" mc:Ignorable="w14 w15 w16se w16cid w16 w16cex w16sdtdh w16sdtfl w16du wp14">
+  <w:p>
+    <w:pPr>
       <w:pStyle w:val="Textoindependiente"/>
       <w:spacing w:line="14" w:lineRule="auto"/>
     </w:pPr>
@@ -2739,15 +2142,15 @@
       <mc:AlternateContent>
         <mc:Choice Requires="wps">
           <w:drawing>
-            <wp:anchor distT="0" distB="0" distL="0" distR="0" simplePos="0" relativeHeight="251658240" behindDoc="1" locked="0" layoutInCell="1" allowOverlap="1" wp14:anchorId="03A76DAF" wp14:editId="786E5A54">
+            <wp:anchor distT="0" distB="0" distL="0" distR="0" simplePos="0" relativeHeight="251658240" behindDoc="1" locked="0" layoutInCell="1" allowOverlap="1" wp14:anchorId="03A76DAF" wp14:editId="0B09F9B8">
               <wp:simplePos x="0" y="0"/>
               <wp:positionH relativeFrom="page">
-                <wp:posOffset>2838450</wp:posOffset>
+                <wp:align>left</wp:align>
               </wp:positionH>
               <wp:positionV relativeFrom="page">
-                <wp:posOffset>9486901</wp:posOffset>
+                <wp:posOffset>9485644</wp:posOffset>
               </wp:positionV>
-              <wp:extent cx="2266950" cy="152400"/>
+              <wp:extent cx="7757327" cy="152400"/>
               <wp:effectExtent l="0" t="0" r="0" b="0"/>
               <wp:wrapNone/>
               <wp:docPr id="3" name="Textbox 3"/>
@@ -2763,7 +2166,7 @@
                     <wps:spPr>
                       <a:xfrm>
                         <a:off x="0" y="0"/>
-                        <a:ext cx="2266950" cy="152400"/>
+                        <a:ext cx="7757327" cy="152400"/>
                       </a:xfrm>
                       <a:prstGeom prst="rect">
                         <a:avLst/>
@@ -2788,25 +2191,7 @@
                               <w:bCs/>
                               <w:spacing w:val="-2"/>
                             </w:rPr>
-                            <w:t>{</w:t>
-                          </w:r>
-                          <w:proofErr w:type="spellStart"/>
-                          <w:r>
-                            <w:rPr>
-                              <w:b/>
-                              <w:bCs/>
-                              <w:spacing w:val="-2"/>
-                            </w:rPr>
-                            <w:t>empleado_nombre_completo</w:t>
-                          </w:r>
-                          <w:proofErr w:type="spellEnd"/>
-                          <w:r>
-                            <w:rPr>
-                              <w:b/>
-                              <w:bCs/>
-                              <w:spacing w:val="-2"/>
-                            </w:rPr>
-                            <w:t>}</w:t>
+                            <w:t>{empleado_nombre_completo}</w:t>
                           </w:r>
                         </w:p>
                       </w:txbxContent>
@@ -2832,7 +2217,7 @@
               <v:stroke joinstyle="miter"/>
               <v:path gradientshapeok="t" o:connecttype="rect"/>
             </v:shapetype>
-            <v:shape id="Textbox 3" o:spid="_x0000_s1027" type="#_x0000_t202" style="position:absolute;margin-left:223.5pt;margin-top:747pt;width:178.5pt;height:12pt;z-index:-251658240;visibility:visible;mso-wrap-style:square;mso-width-percent:0;mso-height-percent:0;mso-wrap-distance-left:0;mso-wrap-distance-top:0;mso-wrap-distance-right:0;mso-wrap-distance-bottom:0;mso-position-horizontal:absolute;mso-position-horizontal-relative:page;mso-position-vertical:absolute;mso-position-vertical-relative:page;mso-width-percent:0;mso-height-percent:0;mso-width-relative:margin;mso-height-relative:margin;v-text-anchor:top" o:gfxdata="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" filled="f" stroked="f">
+            <v:shape id="Textbox 3" o:spid="_x0000_s1027" type="#_x0000_t202" style="position:absolute;margin-left:0;margin-top:746.9pt;width:610.8pt;height:12pt;z-index:-251658240;visibility:visible;mso-wrap-style:square;mso-width-percent:0;mso-height-percent:0;mso-wrap-distance-left:0;mso-wrap-distance-top:0;mso-wrap-distance-right:0;mso-wrap-distance-bottom:0;mso-position-horizontal:left;mso-position-horizontal-relative:page;mso-position-vertical:absolute;mso-position-vertical-relative:page;mso-width-percent:0;mso-height-percent:0;mso-width-relative:margin;mso-height-relative:margin;v-text-anchor:top" o:gfxdata="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" filled="f" stroked="f">
               <v:textbox inset="0,0,0,0">
                 <w:txbxContent>
                   <w:p>
@@ -2852,25 +2237,7 @@
                         <w:bCs/>
                         <w:spacing w:val="-2"/>
                       </w:rPr>
-                      <w:t>{</w:t>
-                    </w:r>
-                    <w:proofErr w:type="spellStart"/>
-                    <w:r>
-                      <w:rPr>
-                        <w:b/>
-                        <w:bCs/>
-                        <w:spacing w:val="-2"/>
-                      </w:rPr>
-                      <w:t>empleado_nombre_completo</w:t>
-                    </w:r>
-                    <w:proofErr w:type="spellEnd"/>
-                    <w:r>
-                      <w:rPr>
-                        <w:b/>
-                        <w:bCs/>
-                        <w:spacing w:val="-2"/>
-                      </w:rPr>
-                      <w:t>}</w:t>
+                      <w:t>{empleado_nombre_completo}</w:t>
                     </w:r>
                   </w:p>
                 </w:txbxContent>
@@ -2971,6 +2338,16 @@
 </w:ftr>
 </file>
 
+<file path=word/footer3.xml><?xml version="1.0" encoding="utf-8"?>
+<w:ftr xmlns:wpc="http://schemas.microsoft.com/office/word/2010/wordprocessingCanvas" xmlns:cx="http://schemas.microsoft.com/office/drawing/2014/chartex" xmlns:cx1="http://schemas.microsoft.com/office/drawing/2015/9/8/chartex" xmlns:cx2="http://schemas.microsoft.com/office/drawing/2015/10/21/chartex" xmlns:cx3="http://schemas.microsoft.com/office/drawing/2016/5/9/chartex" xmlns:cx4="http://schemas.microsoft.com/office/drawing/2016/5/10/chartex" xmlns:cx5="http://schemas.microsoft.com/office/drawing/2016/5/11/chartex" xmlns:cx6="http://schemas.microsoft.com/office/drawing/2016/5/12/chartex" xmlns:cx7="http://schemas.microsoft.com/office/drawing/2016/5/13/chartex" xmlns:cx8="http://schemas.microsoft.com/office/drawing/2016/5/14/chartex" xmlns:mc="http://schemas.openxmlformats.org/markup-compatibility/2006" xmlns:aink="http://schemas.microsoft.com/office/drawing/2016/ink" xmlns:am3d="http://schemas.microsoft.com/office/drawing/2017/model3d" xmlns:o="urn:schemas-microsoft-com:office:office" xmlns:oel="http://schemas.microsoft.com/office/2019/extlst" xmlns:r="http://schemas.openxmlformats.org/officeDocument/2006/relationships" xmlns:m="http://schemas.openxmlformats.org/officeDocument/2006/math" xmlns:v="urn:schemas-microsoft-com:vml" xmlns:wp14="http://schemas.microsoft.com/office/word/2010/wordprocessingDrawing" xmlns:wp="http://schemas.openxmlformats.org/drawingml/2006/wordprocessingDrawing" xmlns:w10="urn:schemas-microsoft-com:office:word" xmlns:w="http://schemas.openxmlformats.org/wordprocessingml/2006/main" xmlns:w14="http://schemas.microsoft.com/office/word/2010/wordml" xmlns:w15="http://schemas.microsoft.com/office/word/2012/wordml" xmlns:w16cex="http://schemas.microsoft.com/office/word/2018/wordml/cex" xmlns:w16cid="http://schemas.microsoft.com/office/word/2016/wordml/cid" xmlns:w16="http://schemas.microsoft.com/office/word/2018/wordml" xmlns:w16du="http://schemas.microsoft.com/office/word/2023/wordml/word16du" xmlns:w16sdtdh="http://schemas.microsoft.com/office/word/2020/wordml/sdtdatahash" xmlns:w16sdtfl="http://schemas.microsoft.com/office/word/2024/wordml/sdtformatlock" xmlns:w16se="http://schemas.microsoft.com/office/word/2015/wordml/symex" xmlns:wpg="http://schemas.microsoft.com/office/word/2010/wordprocessingGroup" xmlns:wpi="http://schemas.microsoft.com/office/word/2010/wordprocessingInk" xmlns:wne="http://schemas.microsoft.com/office/word/2006/wordml" xmlns:wps="http://schemas.microsoft.com/office/word/2010/wordprocessingShape" mc:Ignorable="w14 w15 w16se w16cid w16 w16cex w16sdtdh w16sdtfl w16du wp14">
+  <w:p>
+    <w:pPr>
+      <w:pStyle w:val="Piedepgina"/>
+    </w:pPr>
+  </w:p>
+</w:ftr>
+</file>
+
 <file path=word/footnotes.xml><?xml version="1.0" encoding="utf-8"?>
 <w:footnotes xmlns:wpc="http://schemas.microsoft.com/office/word/2010/wordprocessingCanvas" xmlns:cx="http://schemas.microsoft.com/office/drawing/2014/chartex" xmlns:cx1="http://schemas.microsoft.com/office/drawing/2015/9/8/chartex" xmlns:cx2="http://schemas.microsoft.com/office/drawing/2015/10/21/chartex" xmlns:cx3="http://schemas.microsoft.com/office/drawing/2016/5/9/chartex" xmlns:cx4="http://schemas.microsoft.com/office/drawing/2016/5/10/chartex" xmlns:cx5="http://schemas.microsoft.com/office/drawing/2016/5/11/chartex" xmlns:cx6="http://schemas.microsoft.com/office/drawing/2016/5/12/chartex" xmlns:cx7="http://schemas.microsoft.com/office/drawing/2016/5/13/chartex" xmlns:cx8="http://schemas.microsoft.com/office/drawing/2016/5/14/chartex" xmlns:mc="http://schemas.openxmlformats.org/markup-compatibility/2006" xmlns:aink="http://schemas.microsoft.com/office/drawing/2016/ink" xmlns:am3d="http://schemas.microsoft.com/office/drawing/2017/model3d" xmlns:o="urn:schemas-microsoft-com:office:office" xmlns:oel="http://schemas.microsoft.com/office/2019/extlst" xmlns:r="http://schemas.openxmlformats.org/officeDocument/2006/relationships" xmlns:m="http://schemas.openxmlformats.org/officeDocument/2006/math" xmlns:v="urn:schemas-microsoft-com:vml" xmlns:wp14="http://schemas.microsoft.com/office/word/2010/wordprocessingDrawing" xmlns:wp="http://schemas.openxmlformats.org/drawingml/2006/wordprocessingDrawing" xmlns:w10="urn:schemas-microsoft-com:office:word" xmlns:w="http://schemas.openxmlformats.org/wordprocessingml/2006/main" xmlns:w14="http://schemas.microsoft.com/office/word/2010/wordml" xmlns:w15="http://schemas.microsoft.com/office/word/2012/wordml" xmlns:w16cex="http://schemas.microsoft.com/office/word/2018/wordml/cex" xmlns:w16cid="http://schemas.microsoft.com/office/word/2016/wordml/cid" xmlns:w16="http://schemas.microsoft.com/office/word/2018/wordml" xmlns:w16du="http://schemas.microsoft.com/office/word/2023/wordml/word16du" xmlns:w16sdtdh="http://schemas.microsoft.com/office/word/2020/wordml/sdtdatahash" xmlns:w16sdtfl="http://schemas.microsoft.com/office/word/2024/wordml/sdtformatlock" xmlns:w16se="http://schemas.microsoft.com/office/word/2015/wordml/symex" xmlns:wpg="http://schemas.microsoft.com/office/word/2010/wordprocessingGroup" xmlns:wpi="http://schemas.microsoft.com/office/word/2010/wordprocessingInk" xmlns:wne="http://schemas.microsoft.com/office/word/2006/wordml" xmlns:wps="http://schemas.microsoft.com/office/word/2010/wordprocessingShape" mc:Ignorable="w14 w15 w16se w16cid w16 w16cex w16sdtdh w16sdtfl w16du wp14">
   <w:footnote w:type="separator" w:id="-1">
@@ -2991,6 +2368,16 @@
 </file>
 
 <file path=word/header1.xml><?xml version="1.0" encoding="utf-8"?>
+<w:hdr xmlns:wpc="http://schemas.microsoft.com/office/word/2010/wordprocessingCanvas" xmlns:cx="http://schemas.microsoft.com/office/drawing/2014/chartex" xmlns:cx1="http://schemas.microsoft.com/office/drawing/2015/9/8/chartex" xmlns:cx2="http://schemas.microsoft.com/office/drawing/2015/10/21/chartex" xmlns:cx3="http://schemas.microsoft.com/office/drawing/2016/5/9/chartex" xmlns:cx4="http://schemas.microsoft.com/office/drawing/2016/5/10/chartex" xmlns:cx5="http://schemas.microsoft.com/office/drawing/2016/5/11/chartex" xmlns:cx6="http://schemas.microsoft.com/office/drawing/2016/5/12/chartex" xmlns:cx7="http://schemas.microsoft.com/office/drawing/2016/5/13/chartex" xmlns:cx8="http://schemas.microsoft.com/office/drawing/2016/5/14/chartex" xmlns:mc="http://schemas.openxmlformats.org/markup-compatibility/2006" xmlns:aink="http://schemas.microsoft.com/office/drawing/2016/ink" xmlns:am3d="http://schemas.microsoft.com/office/drawing/2017/model3d" xmlns:o="urn:schemas-microsoft-com:office:office" xmlns:oel="http://schemas.microsoft.com/office/2019/extlst" xmlns:r="http://schemas.openxmlformats.org/officeDocument/2006/relationships" xmlns:m="http://schemas.openxmlformats.org/officeDocument/2006/math" xmlns:v="urn:schemas-microsoft-com:vml" xmlns:wp14="http://schemas.microsoft.com/office/word/2010/wordprocessingDrawing" xmlns:wp="http://schemas.openxmlformats.org/drawingml/2006/wordprocessingDrawing" xmlns:w10="urn:schemas-microsoft-com:office:word" xmlns:w="http://schemas.openxmlformats.org/wordprocessingml/2006/main" xmlns:w14="http://schemas.microsoft.com/office/word/2010/wordml" xmlns:w15="http://schemas.microsoft.com/office/word/2012/wordml" xmlns:w16cex="http://schemas.microsoft.com/office/word/2018/wordml/cex" xmlns:w16cid="http://schemas.microsoft.com/office/word/2016/wordml/cid" xmlns:w16="http://schemas.microsoft.com/office/word/2018/wordml" xmlns:w16du="http://schemas.microsoft.com/office/word/2023/wordml/word16du" xmlns:w16sdtdh="http://schemas.microsoft.com/office/word/2020/wordml/sdtdatahash" xmlns:w16sdtfl="http://schemas.microsoft.com/office/word/2024/wordml/sdtformatlock" xmlns:w16se="http://schemas.microsoft.com/office/word/2015/wordml/symex" xmlns:wpg="http://schemas.microsoft.com/office/word/2010/wordprocessingGroup" xmlns:wpi="http://schemas.microsoft.com/office/word/2010/wordprocessingInk" xmlns:wne="http://schemas.microsoft.com/office/word/2006/wordml" xmlns:wps="http://schemas.microsoft.com/office/word/2010/wordprocessingShape" mc:Ignorable="w14 w15 w16se w16cid w16 w16cex w16sdtdh w16sdtfl w16du wp14">
+  <w:p>
+    <w:pPr>
+      <w:pStyle w:val="Encabezado"/>
+    </w:pPr>
+  </w:p>
+</w:hdr>
+</file>
+
+<file path=word/header2.xml><?xml version="1.0" encoding="utf-8"?>
 <w:hdr xmlns:wpc="http://schemas.microsoft.com/office/word/2010/wordprocessingCanvas" xmlns:cx="http://schemas.microsoft.com/office/drawing/2014/chartex" xmlns:cx1="http://schemas.microsoft.com/office/drawing/2015/9/8/chartex" xmlns:cx2="http://schemas.microsoft.com/office/drawing/2015/10/21/chartex" xmlns:cx3="http://schemas.microsoft.com/office/drawing/2016/5/9/chartex" xmlns:cx4="http://schemas.microsoft.com/office/drawing/2016/5/10/chartex" xmlns:cx5="http://schemas.microsoft.com/office/drawing/2016/5/11/chartex" xmlns:cx6="http://schemas.microsoft.com/office/drawing/2016/5/12/chartex" xmlns:cx7="http://schemas.microsoft.com/office/drawing/2016/5/13/chartex" xmlns:cx8="http://schemas.microsoft.com/office/drawing/2016/5/14/chartex" xmlns:mc="http://schemas.openxmlformats.org/markup-compatibility/2006" xmlns:aink="http://schemas.microsoft.com/office/drawing/2016/ink" xmlns:am3d="http://schemas.microsoft.com/office/drawing/2017/model3d" xmlns:o="urn:schemas-microsoft-com:office:office" xmlns:oel="http://schemas.microsoft.com/office/2019/extlst" xmlns:r="http://schemas.openxmlformats.org/officeDocument/2006/relationships" xmlns:m="http://schemas.openxmlformats.org/officeDocument/2006/math" xmlns:v="urn:schemas-microsoft-com:vml" xmlns:wp14="http://schemas.microsoft.com/office/word/2010/wordprocessingDrawing" xmlns:wp="http://schemas.openxmlformats.org/drawingml/2006/wordprocessingDrawing" xmlns:w10="urn:schemas-microsoft-com:office:word" xmlns:w="http://schemas.openxmlformats.org/wordprocessingml/2006/main" xmlns:w14="http://schemas.microsoft.com/office/word/2010/wordml" xmlns:w15="http://schemas.microsoft.com/office/word/2012/wordml" xmlns:w16cex="http://schemas.microsoft.com/office/word/2018/wordml/cex" xmlns:w16cid="http://schemas.microsoft.com/office/word/2016/wordml/cid" xmlns:w16="http://schemas.microsoft.com/office/word/2018/wordml" xmlns:w16du="http://schemas.microsoft.com/office/word/2023/wordml/word16du" xmlns:w16sdtdh="http://schemas.microsoft.com/office/word/2020/wordml/sdtdatahash" xmlns:w16sdtfl="http://schemas.microsoft.com/office/word/2024/wordml/sdtformatlock" xmlns:w16se="http://schemas.microsoft.com/office/word/2015/wordml/symex" xmlns:wpg="http://schemas.microsoft.com/office/word/2010/wordprocessingGroup" xmlns:wpi="http://schemas.microsoft.com/office/word/2010/wordprocessingInk" xmlns:wne="http://schemas.microsoft.com/office/word/2006/wordml" xmlns:wps="http://schemas.microsoft.com/office/word/2010/wordprocessingShape" mc:Ignorable="w14 w15 w16se w16cid w16 w16cex w16sdtdh w16sdtfl w16du wp14">
   <w:p>
     <w:pPr>
@@ -3247,6 +2634,16 @@
     <w:pPr>
       <w:pStyle w:val="Textoindependiente"/>
       <w:spacing w:line="14" w:lineRule="auto"/>
+    </w:pPr>
+  </w:p>
+</w:hdr>
+</file>
+
+<file path=word/header3.xml><?xml version="1.0" encoding="utf-8"?>
+<w:hdr xmlns:wpc="http://schemas.microsoft.com/office/word/2010/wordprocessingCanvas" xmlns:cx="http://schemas.microsoft.com/office/drawing/2014/chartex" xmlns:cx1="http://schemas.microsoft.com/office/drawing/2015/9/8/chartex" xmlns:cx2="http://schemas.microsoft.com/office/drawing/2015/10/21/chartex" xmlns:cx3="http://schemas.microsoft.com/office/drawing/2016/5/9/chartex" xmlns:cx4="http://schemas.microsoft.com/office/drawing/2016/5/10/chartex" xmlns:cx5="http://schemas.microsoft.com/office/drawing/2016/5/11/chartex" xmlns:cx6="http://schemas.microsoft.com/office/drawing/2016/5/12/chartex" xmlns:cx7="http://schemas.microsoft.com/office/drawing/2016/5/13/chartex" xmlns:cx8="http://schemas.microsoft.com/office/drawing/2016/5/14/chartex" xmlns:mc="http://schemas.openxmlformats.org/markup-compatibility/2006" xmlns:aink="http://schemas.microsoft.com/office/drawing/2016/ink" xmlns:am3d="http://schemas.microsoft.com/office/drawing/2017/model3d" xmlns:o="urn:schemas-microsoft-com:office:office" xmlns:oel="http://schemas.microsoft.com/office/2019/extlst" xmlns:r="http://schemas.openxmlformats.org/officeDocument/2006/relationships" xmlns:m="http://schemas.openxmlformats.org/officeDocument/2006/math" xmlns:v="urn:schemas-microsoft-com:vml" xmlns:wp14="http://schemas.microsoft.com/office/word/2010/wordprocessingDrawing" xmlns:wp="http://schemas.openxmlformats.org/drawingml/2006/wordprocessingDrawing" xmlns:w10="urn:schemas-microsoft-com:office:word" xmlns:w="http://schemas.openxmlformats.org/wordprocessingml/2006/main" xmlns:w14="http://schemas.microsoft.com/office/word/2010/wordml" xmlns:w15="http://schemas.microsoft.com/office/word/2012/wordml" xmlns:w16cex="http://schemas.microsoft.com/office/word/2018/wordml/cex" xmlns:w16cid="http://schemas.microsoft.com/office/word/2016/wordml/cid" xmlns:w16="http://schemas.microsoft.com/office/word/2018/wordml" xmlns:w16du="http://schemas.microsoft.com/office/word/2023/wordml/word16du" xmlns:w16sdtdh="http://schemas.microsoft.com/office/word/2020/wordml/sdtdatahash" xmlns:w16sdtfl="http://schemas.microsoft.com/office/word/2024/wordml/sdtformatlock" xmlns:w16se="http://schemas.microsoft.com/office/word/2015/wordml/symex" xmlns:wpg="http://schemas.microsoft.com/office/word/2010/wordprocessingGroup" xmlns:wpi="http://schemas.microsoft.com/office/word/2010/wordprocessingInk" xmlns:wne="http://schemas.microsoft.com/office/word/2006/wordml" xmlns:wps="http://schemas.microsoft.com/office/word/2010/wordprocessingShape" mc:Ignorable="w14 w15 w16se w16cid w16 w16cex w16sdtdh w16sdtfl w16du wp14">
+  <w:p>
+    <w:pPr>
+      <w:pStyle w:val="Encabezado"/>
     </w:pPr>
   </w:p>
 </w:hdr>

</xml_diff>

<commit_message>
fix(finiquitos): test formato finiquito
</commit_message>
<xml_diff>
--- a/docx_templates/FINIQUITO FORMATO.docx
+++ b/docx_templates/FINIQUITO FORMATO.docx
@@ -10,7 +10,31 @@
         <w:jc w:val="right"/>
       </w:pPr>
       <w:r>
-        <w:t>{lugar_emision}, {estado_emision} a {fecha_emision_larga}.</w:t>
+        <w:t>{</w:t>
+      </w:r>
+      <w:proofErr w:type="spellStart"/>
+      <w:r>
+        <w:t>lugar_emision</w:t>
+      </w:r>
+      <w:proofErr w:type="spellEnd"/>
+      <w:r>
+        <w:t>}, {</w:t>
+      </w:r>
+      <w:proofErr w:type="spellStart"/>
+      <w:r>
+        <w:t>estado_emision</w:t>
+      </w:r>
+      <w:proofErr w:type="spellEnd"/>
+      <w:r>
+        <w:t>} a {</w:t>
+      </w:r>
+      <w:proofErr w:type="spellStart"/>
+      <w:r>
+        <w:t>fecha_emision_larga</w:t>
+      </w:r>
+      <w:proofErr w:type="spellEnd"/>
+      <w:r>
+        <w:t>}.</w:t>
       </w:r>
     </w:p>
     <w:p>
@@ -37,10 +61,36 @@
           <w:bCs/>
           <w:u w:val="single"/>
         </w:rPr>
-        <w:t>${neto_p}</w:t>
+        <w:t>${</w:t>
+      </w:r>
+      <w:proofErr w:type="spellStart"/>
+      <w:r>
+        <w:rPr>
+          <w:b/>
+          <w:bCs/>
+          <w:u w:val="single"/>
+        </w:rPr>
+        <w:t>neto_p</w:t>
+      </w:r>
+      <w:proofErr w:type="spellEnd"/>
+      <w:r>
+        <w:rPr>
+          <w:b/>
+          <w:bCs/>
+          <w:u w:val="single"/>
+        </w:rPr>
+        <w:t>}</w:t>
       </w:r>
       <w:r>
-        <w:t xml:space="preserve"> {neto_pagar_letra} por concepto de finiquito, </w:t>
+        <w:t xml:space="preserve"> {</w:t>
+      </w:r>
+      <w:proofErr w:type="spellStart"/>
+      <w:r>
+        <w:t>neto_pagar_letra</w:t>
+      </w:r>
+      <w:proofErr w:type="spellEnd"/>
+      <w:r>
+        <w:t xml:space="preserve">} por concepto de finiquito, </w:t>
       </w:r>
       <w:r>
         <w:t>l</w:t>
@@ -49,7 +99,15 @@
         <w:t xml:space="preserve">as partes acuerdan que dicha cantidad </w:t>
       </w:r>
       <w:r>
-        <w:t>será cubierta a más tardar el día {fecha_limite_pago}</w:t>
+        <w:t>será cubierta a más tardar el día {</w:t>
+      </w:r>
+      <w:proofErr w:type="spellStart"/>
+      <w:r>
+        <w:t>fecha_limite_pago</w:t>
+      </w:r>
+      <w:proofErr w:type="spellEnd"/>
+      <w:r>
+        <w:t>}</w:t>
       </w:r>
       <w:r>
         <w:t>, teniéndose por cumplida la obligación de pago</w:t>
@@ -70,7 +128,15 @@
         <w:t xml:space="preserve">del día </w:t>
       </w:r>
       <w:r>
-        <w:t>{fecha_letra}, importe que resulta de los conceptos que se desglosan a continuación.</w:t>
+        <w:t>{</w:t>
+      </w:r>
+      <w:proofErr w:type="spellStart"/>
+      <w:r>
+        <w:t>fecha_letra</w:t>
+      </w:r>
+      <w:proofErr w:type="spellEnd"/>
+      <w:r>
+        <w:t>}, importe que resulta de los conceptos que se desglosan a continuación.</w:t>
       </w:r>
     </w:p>
     <w:p>
@@ -503,7 +569,23 @@
                 <w:color w:val="808080"/>
                 <w:sz w:val="18"/>
               </w:rPr>
-              <w:t>{c_isa}</w:t>
+              <w:t>{</w:t>
+            </w:r>
+            <w:proofErr w:type="spellStart"/>
+            <w:r>
+              <w:rPr>
+                <w:color w:val="808080"/>
+                <w:sz w:val="18"/>
+              </w:rPr>
+              <w:t>c_isa</w:t>
+            </w:r>
+            <w:proofErr w:type="spellEnd"/>
+            <w:r>
+              <w:rPr>
+                <w:color w:val="808080"/>
+                <w:sz w:val="18"/>
+              </w:rPr>
+              <w:t>}</w:t>
             </w:r>
           </w:p>
         </w:tc>
@@ -883,7 +965,23 @@
                 <w:color w:val="808080"/>
                 <w:sz w:val="18"/>
               </w:rPr>
-              <w:t>{c_imes}</w:t>
+              <w:t>{</w:t>
+            </w:r>
+            <w:proofErr w:type="spellStart"/>
+            <w:r>
+              <w:rPr>
+                <w:color w:val="808080"/>
+                <w:sz w:val="18"/>
+              </w:rPr>
+              <w:t>c_imes</w:t>
+            </w:r>
+            <w:proofErr w:type="spellEnd"/>
+            <w:r>
+              <w:rPr>
+                <w:color w:val="808080"/>
+                <w:sz w:val="18"/>
+              </w:rPr>
+              <w:t>}</w:t>
             </w:r>
           </w:p>
         </w:tc>
@@ -1058,16 +1156,26 @@
                 <w:spacing w:val="-5"/>
                 <w:sz w:val="18"/>
               </w:rPr>
-              <w:t>{n</w:t>
-            </w:r>
+              <w:t>{</w:t>
+            </w:r>
+            <w:proofErr w:type="spellStart"/>
             <w:r>
               <w:rPr>
                 <w:color w:val="808080"/>
                 <w:spacing w:val="-5"/>
                 <w:sz w:val="18"/>
               </w:rPr>
+              <w:t>n</w:t>
+            </w:r>
+            <w:r>
+              <w:rPr>
+                <w:color w:val="808080"/>
+                <w:spacing w:val="-5"/>
+                <w:sz w:val="18"/>
+              </w:rPr>
               <w:t>d</w:t>
             </w:r>
+            <w:proofErr w:type="spellEnd"/>
             <w:r>
               <w:rPr>
                 <w:color w:val="808080"/>
@@ -1327,7 +1435,23 @@
                 <w:color w:val="808080"/>
                 <w:sz w:val="18"/>
               </w:rPr>
-              <w:t>{c_pant}</w:t>
+              <w:t>{</w:t>
+            </w:r>
+            <w:proofErr w:type="spellStart"/>
+            <w:r>
+              <w:rPr>
+                <w:color w:val="808080"/>
+                <w:sz w:val="18"/>
+              </w:rPr>
+              <w:t>c_pant</w:t>
+            </w:r>
+            <w:proofErr w:type="spellEnd"/>
+            <w:r>
+              <w:rPr>
+                <w:color w:val="808080"/>
+                <w:sz w:val="18"/>
+              </w:rPr>
+              <w:t>}</w:t>
             </w:r>
           </w:p>
         </w:tc>
@@ -1443,7 +1567,25 @@
                 <w:spacing w:val="-5"/>
                 <w:sz w:val="18"/>
               </w:rPr>
-              <w:t>{np}</w:t>
+              <w:t>{</w:t>
+            </w:r>
+            <w:proofErr w:type="spellStart"/>
+            <w:r>
+              <w:rPr>
+                <w:color w:val="808080"/>
+                <w:spacing w:val="-5"/>
+                <w:sz w:val="18"/>
+              </w:rPr>
+              <w:t>np</w:t>
+            </w:r>
+            <w:proofErr w:type="spellEnd"/>
+            <w:r>
+              <w:rPr>
+                <w:color w:val="808080"/>
+                <w:spacing w:val="-5"/>
+                <w:sz w:val="18"/>
+              </w:rPr>
+              <w:t>}</w:t>
             </w:r>
           </w:p>
         </w:tc>
@@ -1467,7 +1609,23 @@
                 <w:color w:val="808080"/>
                 <w:sz w:val="18"/>
               </w:rPr>
-              <w:t>{cp}</w:t>
+              <w:t>{</w:t>
+            </w:r>
+            <w:proofErr w:type="spellStart"/>
+            <w:r>
+              <w:rPr>
+                <w:color w:val="808080"/>
+                <w:sz w:val="18"/>
+              </w:rPr>
+              <w:t>cp</w:t>
+            </w:r>
+            <w:proofErr w:type="spellEnd"/>
+            <w:r>
+              <w:rPr>
+                <w:color w:val="808080"/>
+                <w:sz w:val="18"/>
+              </w:rPr>
+              <w:t>}</w:t>
             </w:r>
           </w:p>
         </w:tc>
@@ -1551,7 +1709,7 @@
       </w:tr>
       <w:tr>
         <w:trPr>
-          <w:trHeight w:val="3303"/>
+          <w:trHeight w:val="2702"/>
         </w:trPr>
         <w:tc>
           <w:tcPr>
@@ -1705,8 +1863,9 @@
           <w:tcPr>
             <w:tcW w:w="5758" w:type="dxa"/>
             <w:tcBorders>
-              <w:right w:val="double" w:sz="4" w:space="0" w:color="000000"/>
-            </w:tcBorders>
+              <w:right w:val="single" w:sz="4" w:space="0" w:color="auto"/>
+            </w:tcBorders>
+            <w:vAlign w:val="center"/>
           </w:tcPr>
           <w:p>
             <w:pPr>
@@ -1716,6 +1875,7 @@
               </w:tabs>
               <w:spacing w:before="42"/>
               <w:ind w:left="272"/>
+              <w:jc w:val="right"/>
               <w:rPr>
                 <w:rFonts w:ascii="Arial"/>
                 <w:b/>
@@ -1799,7 +1959,29 @@
                 <w:position w:val="3"/>
                 <w:sz w:val="18"/>
               </w:rPr>
-              <w:t>{suma_p}</w:t>
+              <w:t>{</w:t>
+            </w:r>
+            <w:proofErr w:type="spellStart"/>
+            <w:r>
+              <w:rPr>
+                <w:rFonts w:ascii="Arial"/>
+                <w:b/>
+                <w:spacing w:val="-2"/>
+                <w:position w:val="3"/>
+                <w:sz w:val="18"/>
+              </w:rPr>
+              <w:t>suma_p</w:t>
+            </w:r>
+            <w:proofErr w:type="spellEnd"/>
+            <w:r>
+              <w:rPr>
+                <w:rFonts w:ascii="Arial"/>
+                <w:b/>
+                <w:spacing w:val="-2"/>
+                <w:position w:val="3"/>
+                <w:sz w:val="18"/>
+              </w:rPr>
+              <w:t>}</w:t>
             </w:r>
           </w:p>
         </w:tc>
@@ -1807,9 +1989,10 @@
           <w:tcPr>
             <w:tcW w:w="4862" w:type="dxa"/>
             <w:tcBorders>
-              <w:left w:val="double" w:sz="4" w:space="0" w:color="000000"/>
-              <w:bottom w:val="double" w:sz="4" w:space="0" w:color="000000"/>
-            </w:tcBorders>
+              <w:left w:val="single" w:sz="4" w:space="0" w:color="auto"/>
+              <w:bottom w:val="single" w:sz="4" w:space="0" w:color="auto"/>
+            </w:tcBorders>
+            <w:vAlign w:val="center"/>
           </w:tcPr>
           <w:p>
             <w:pPr>
@@ -1903,7 +2086,29 @@
                 <w:position w:val="2"/>
                 <w:sz w:val="18"/>
               </w:rPr>
-              <w:t>{suma_d}</w:t>
+              <w:t>{</w:t>
+            </w:r>
+            <w:proofErr w:type="spellStart"/>
+            <w:r>
+              <w:rPr>
+                <w:rFonts w:ascii="Arial"/>
+                <w:b/>
+                <w:spacing w:val="-2"/>
+                <w:position w:val="2"/>
+                <w:sz w:val="18"/>
+              </w:rPr>
+              <w:t>suma_d</w:t>
+            </w:r>
+            <w:proofErr w:type="spellEnd"/>
+            <w:r>
+              <w:rPr>
+                <w:rFonts w:ascii="Arial"/>
+                <w:b/>
+                <w:spacing w:val="-2"/>
+                <w:position w:val="2"/>
+                <w:sz w:val="18"/>
+              </w:rPr>
+              <w:t>}</w:t>
             </w:r>
           </w:p>
         </w:tc>
@@ -1918,6 +2123,7 @@
             <w:tcBorders>
               <w:left w:val="nil"/>
               <w:bottom w:val="nil"/>
+              <w:right w:val="single" w:sz="4" w:space="0" w:color="auto"/>
             </w:tcBorders>
           </w:tcPr>
           <w:p>
@@ -1930,13 +2136,25 @@
               </w:rPr>
             </w:pPr>
           </w:p>
+          <w:p>
+            <w:pPr>
+              <w:pStyle w:val="TableParagraph"/>
+              <w:spacing w:before="0"/>
+              <w:rPr>
+                <w:rFonts w:ascii="Times New Roman"/>
+                <w:sz w:val="18"/>
+              </w:rPr>
+            </w:pPr>
+          </w:p>
         </w:tc>
         <w:tc>
           <w:tcPr>
             <w:tcW w:w="4862" w:type="dxa"/>
             <w:tcBorders>
-              <w:top w:val="double" w:sz="4" w:space="0" w:color="000000"/>
-            </w:tcBorders>
+              <w:top w:val="single" w:sz="4" w:space="0" w:color="auto"/>
+              <w:left w:val="single" w:sz="4" w:space="0" w:color="auto"/>
+            </w:tcBorders>
+            <w:vAlign w:val="center"/>
           </w:tcPr>
           <w:p>
             <w:pPr>
@@ -1946,7 +2164,6 @@
               </w:tabs>
               <w:spacing w:before="83"/>
               <w:ind w:right="126"/>
-              <w:jc w:val="right"/>
               <w:rPr>
                 <w:rFonts w:ascii="Arial"/>
                 <w:b/>
@@ -1954,6 +2171,15 @@
                 <w:sz w:val="18"/>
               </w:rPr>
             </w:pPr>
+            <w:r>
+              <w:rPr>
+                <w:rFonts w:ascii="Arial"/>
+                <w:b/>
+                <w:sz w:val="20"/>
+              </w:rPr>
+              <w:t xml:space="preserve">                      </w:t>
+            </w:r>
+            <w:proofErr w:type="gramStart"/>
             <w:r>
               <w:rPr>
                 <w:rFonts w:ascii="Arial"/>
@@ -1996,6 +2222,7 @@
               </w:rPr>
               <w:t>Pagar</w:t>
             </w:r>
+            <w:proofErr w:type="gramEnd"/>
             <w:r>
               <w:rPr>
                 <w:rFonts w:ascii="Arial"/>
@@ -2026,11 +2253,51 @@
               <w:rPr>
                 <w:rFonts w:ascii="Arial"/>
                 <w:b/>
+                <w:sz w:val="20"/>
+              </w:rPr>
+              <w:t xml:space="preserve">                      </w:t>
+            </w:r>
+            <w:proofErr w:type="gramStart"/>
+            <w:r>
+              <w:rPr>
+                <w:rFonts w:ascii="Arial"/>
+                <w:b/>
+                <w:sz w:val="20"/>
+              </w:rPr>
+              <w:t xml:space="preserve">   </w:t>
+            </w:r>
+            <w:r>
+              <w:rPr>
+                <w:rFonts w:ascii="Arial"/>
+                <w:b/>
                 <w:spacing w:val="-2"/>
                 <w:position w:val="2"/>
                 <w:sz w:val="18"/>
               </w:rPr>
-              <w:t>{neto_p}</w:t>
+              <w:t>{</w:t>
+            </w:r>
+            <w:proofErr w:type="spellStart"/>
+            <w:proofErr w:type="gramEnd"/>
+            <w:r>
+              <w:rPr>
+                <w:rFonts w:ascii="Arial"/>
+                <w:b/>
+                <w:spacing w:val="-2"/>
+                <w:position w:val="2"/>
+                <w:sz w:val="18"/>
+              </w:rPr>
+              <w:t>neto_p</w:t>
+            </w:r>
+            <w:proofErr w:type="spellEnd"/>
+            <w:r>
+              <w:rPr>
+                <w:rFonts w:ascii="Arial"/>
+                <w:b/>
+                <w:spacing w:val="-2"/>
+                <w:position w:val="2"/>
+                <w:sz w:val="18"/>
+              </w:rPr>
+              <w:t>}</w:t>
             </w:r>
           </w:p>
         </w:tc>
@@ -2057,7 +2324,6 @@
       <w:pPr>
         <w:pStyle w:val="Textoindependiente"/>
         <w:ind w:right="195"/>
-        <w:jc w:val="center"/>
         <w:rPr>
           <w:spacing w:val="-2"/>
         </w:rPr>
@@ -2083,12 +2349,8 @@
       </w:r>
     </w:p>
     <w:sectPr>
-      <w:headerReference w:type="even" r:id="rId6"/>
-      <w:headerReference w:type="default" r:id="rId7"/>
-      <w:footerReference w:type="even" r:id="rId8"/>
-      <w:footerReference w:type="default" r:id="rId9"/>
-      <w:headerReference w:type="first" r:id="rId10"/>
-      <w:footerReference w:type="first" r:id="rId11"/>
+      <w:headerReference w:type="default" r:id="rId6"/>
+      <w:footerReference w:type="default" r:id="rId7"/>
       <w:type w:val="continuous"/>
       <w:pgSz w:w="12240" w:h="15840"/>
       <w:pgMar w:top="1880" w:right="360" w:bottom="1020" w:left="720" w:header="912" w:footer="827" w:gutter="0"/>
@@ -2122,16 +2384,6 @@
 <w:ftr xmlns:wpc="http://schemas.microsoft.com/office/word/2010/wordprocessingCanvas" xmlns:cx="http://schemas.microsoft.com/office/drawing/2014/chartex" xmlns:cx1="http://schemas.microsoft.com/office/drawing/2015/9/8/chartex" xmlns:cx2="http://schemas.microsoft.com/office/drawing/2015/10/21/chartex" xmlns:cx3="http://schemas.microsoft.com/office/drawing/2016/5/9/chartex" xmlns:cx4="http://schemas.microsoft.com/office/drawing/2016/5/10/chartex" xmlns:cx5="http://schemas.microsoft.com/office/drawing/2016/5/11/chartex" xmlns:cx6="http://schemas.microsoft.com/office/drawing/2016/5/12/chartex" xmlns:cx7="http://schemas.microsoft.com/office/drawing/2016/5/13/chartex" xmlns:cx8="http://schemas.microsoft.com/office/drawing/2016/5/14/chartex" xmlns:mc="http://schemas.openxmlformats.org/markup-compatibility/2006" xmlns:aink="http://schemas.microsoft.com/office/drawing/2016/ink" xmlns:am3d="http://schemas.microsoft.com/office/drawing/2017/model3d" xmlns:o="urn:schemas-microsoft-com:office:office" xmlns:oel="http://schemas.microsoft.com/office/2019/extlst" xmlns:r="http://schemas.openxmlformats.org/officeDocument/2006/relationships" xmlns:m="http://schemas.openxmlformats.org/officeDocument/2006/math" xmlns:v="urn:schemas-microsoft-com:vml" xmlns:wp14="http://schemas.microsoft.com/office/word/2010/wordprocessingDrawing" xmlns:wp="http://schemas.openxmlformats.org/drawingml/2006/wordprocessingDrawing" xmlns:w10="urn:schemas-microsoft-com:office:word" xmlns:w="http://schemas.openxmlformats.org/wordprocessingml/2006/main" xmlns:w14="http://schemas.microsoft.com/office/word/2010/wordml" xmlns:w15="http://schemas.microsoft.com/office/word/2012/wordml" xmlns:w16cex="http://schemas.microsoft.com/office/word/2018/wordml/cex" xmlns:w16cid="http://schemas.microsoft.com/office/word/2016/wordml/cid" xmlns:w16="http://schemas.microsoft.com/office/word/2018/wordml" xmlns:w16du="http://schemas.microsoft.com/office/word/2023/wordml/word16du" xmlns:w16sdtdh="http://schemas.microsoft.com/office/word/2020/wordml/sdtdatahash" xmlns:w16sdtfl="http://schemas.microsoft.com/office/word/2024/wordml/sdtformatlock" xmlns:w16se="http://schemas.microsoft.com/office/word/2015/wordml/symex" xmlns:wpg="http://schemas.microsoft.com/office/word/2010/wordprocessingGroup" xmlns:wpi="http://schemas.microsoft.com/office/word/2010/wordprocessingInk" xmlns:wne="http://schemas.microsoft.com/office/word/2006/wordml" xmlns:wps="http://schemas.microsoft.com/office/word/2010/wordprocessingShape" mc:Ignorable="w14 w15 w16se w16cid w16 w16cex w16sdtdh w16sdtfl w16du wp14">
   <w:p>
     <w:pPr>
-      <w:pStyle w:val="Piedepgina"/>
-    </w:pPr>
-  </w:p>
-</w:ftr>
-</file>
-
-<file path=word/footer2.xml><?xml version="1.0" encoding="utf-8"?>
-<w:ftr xmlns:wpc="http://schemas.microsoft.com/office/word/2010/wordprocessingCanvas" xmlns:cx="http://schemas.microsoft.com/office/drawing/2014/chartex" xmlns:cx1="http://schemas.microsoft.com/office/drawing/2015/9/8/chartex" xmlns:cx2="http://schemas.microsoft.com/office/drawing/2015/10/21/chartex" xmlns:cx3="http://schemas.microsoft.com/office/drawing/2016/5/9/chartex" xmlns:cx4="http://schemas.microsoft.com/office/drawing/2016/5/10/chartex" xmlns:cx5="http://schemas.microsoft.com/office/drawing/2016/5/11/chartex" xmlns:cx6="http://schemas.microsoft.com/office/drawing/2016/5/12/chartex" xmlns:cx7="http://schemas.microsoft.com/office/drawing/2016/5/13/chartex" xmlns:cx8="http://schemas.microsoft.com/office/drawing/2016/5/14/chartex" xmlns:mc="http://schemas.openxmlformats.org/markup-compatibility/2006" xmlns:aink="http://schemas.microsoft.com/office/drawing/2016/ink" xmlns:am3d="http://schemas.microsoft.com/office/drawing/2017/model3d" xmlns:o="urn:schemas-microsoft-com:office:office" xmlns:oel="http://schemas.microsoft.com/office/2019/extlst" xmlns:r="http://schemas.openxmlformats.org/officeDocument/2006/relationships" xmlns:m="http://schemas.openxmlformats.org/officeDocument/2006/math" xmlns:v="urn:schemas-microsoft-com:vml" xmlns:wp14="http://schemas.microsoft.com/office/word/2010/wordprocessingDrawing" xmlns:wp="http://schemas.openxmlformats.org/drawingml/2006/wordprocessingDrawing" xmlns:w10="urn:schemas-microsoft-com:office:word" xmlns:w="http://schemas.openxmlformats.org/wordprocessingml/2006/main" xmlns:w14="http://schemas.microsoft.com/office/word/2010/wordml" xmlns:w15="http://schemas.microsoft.com/office/word/2012/wordml" xmlns:w16cex="http://schemas.microsoft.com/office/word/2018/wordml/cex" xmlns:w16cid="http://schemas.microsoft.com/office/word/2016/wordml/cid" xmlns:w16="http://schemas.microsoft.com/office/word/2018/wordml" xmlns:w16du="http://schemas.microsoft.com/office/word/2023/wordml/word16du" xmlns:w16sdtdh="http://schemas.microsoft.com/office/word/2020/wordml/sdtdatahash" xmlns:w16sdtfl="http://schemas.microsoft.com/office/word/2024/wordml/sdtformatlock" xmlns:w16se="http://schemas.microsoft.com/office/word/2015/wordml/symex" xmlns:wpg="http://schemas.microsoft.com/office/word/2010/wordprocessingGroup" xmlns:wpi="http://schemas.microsoft.com/office/word/2010/wordprocessingInk" xmlns:wne="http://schemas.microsoft.com/office/word/2006/wordml" xmlns:wps="http://schemas.microsoft.com/office/word/2010/wordprocessingShape" mc:Ignorable="w14 w15 w16se w16cid w16 w16cex w16sdtdh w16sdtfl w16du wp14">
-  <w:p>
-    <w:pPr>
       <w:pStyle w:val="Textoindependiente"/>
       <w:spacing w:line="14" w:lineRule="auto"/>
     </w:pPr>
@@ -2142,15 +2394,15 @@
       <mc:AlternateContent>
         <mc:Choice Requires="wps">
           <w:drawing>
-            <wp:anchor distT="0" distB="0" distL="0" distR="0" simplePos="0" relativeHeight="251658240" behindDoc="1" locked="0" layoutInCell="1" allowOverlap="1" wp14:anchorId="03A76DAF" wp14:editId="0B09F9B8">
+            <wp:anchor distT="0" distB="0" distL="0" distR="0" simplePos="0" relativeHeight="251658240" behindDoc="1" locked="0" layoutInCell="1" allowOverlap="1" wp14:anchorId="03A76DAF" wp14:editId="3BDC2444">
               <wp:simplePos x="0" y="0"/>
-              <wp:positionH relativeFrom="page">
+              <wp:positionH relativeFrom="margin">
                 <wp:align>left</wp:align>
               </wp:positionH>
               <wp:positionV relativeFrom="page">
-                <wp:posOffset>9485644</wp:posOffset>
+                <wp:posOffset>9486199</wp:posOffset>
               </wp:positionV>
-              <wp:extent cx="7757327" cy="152400"/>
+              <wp:extent cx="6872024" cy="152400"/>
               <wp:effectExtent l="0" t="0" r="0" b="0"/>
               <wp:wrapNone/>
               <wp:docPr id="3" name="Textbox 3"/>
@@ -2166,7 +2418,7 @@
                     <wps:spPr>
                       <a:xfrm>
                         <a:off x="0" y="0"/>
-                        <a:ext cx="7757327" cy="152400"/>
+                        <a:ext cx="6872024" cy="152400"/>
                       </a:xfrm>
                       <a:prstGeom prst="rect">
                         <a:avLst/>
@@ -2191,7 +2443,25 @@
                               <w:bCs/>
                               <w:spacing w:val="-2"/>
                             </w:rPr>
-                            <w:t>{empleado_nombre_completo}</w:t>
+                            <w:t>{</w:t>
+                          </w:r>
+                          <w:proofErr w:type="spellStart"/>
+                          <w:r>
+                            <w:rPr>
+                              <w:b/>
+                              <w:bCs/>
+                              <w:spacing w:val="-2"/>
+                            </w:rPr>
+                            <w:t>empleado_nombre_completo</w:t>
+                          </w:r>
+                          <w:proofErr w:type="spellEnd"/>
+                          <w:r>
+                            <w:rPr>
+                              <w:b/>
+                              <w:bCs/>
+                              <w:spacing w:val="-2"/>
+                            </w:rPr>
+                            <w:t>}</w:t>
                           </w:r>
                         </w:p>
                       </w:txbxContent>
@@ -2217,7 +2487,7 @@
               <v:stroke joinstyle="miter"/>
               <v:path gradientshapeok="t" o:connecttype="rect"/>
             </v:shapetype>
-            <v:shape id="Textbox 3" o:spid="_x0000_s1027" type="#_x0000_t202" style="position:absolute;margin-left:0;margin-top:746.9pt;width:610.8pt;height:12pt;z-index:-251658240;visibility:visible;mso-wrap-style:square;mso-width-percent:0;mso-height-percent:0;mso-wrap-distance-left:0;mso-wrap-distance-top:0;mso-wrap-distance-right:0;mso-wrap-distance-bottom:0;mso-position-horizontal:left;mso-position-horizontal-relative:page;mso-position-vertical:absolute;mso-position-vertical-relative:page;mso-width-percent:0;mso-height-percent:0;mso-width-relative:margin;mso-height-relative:margin;v-text-anchor:top" o:gfxdata="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" filled="f" stroked="f">
+            <v:shape id="Textbox 3" o:spid="_x0000_s1026" type="#_x0000_t202" style="position:absolute;margin-left:0;margin-top:746.95pt;width:541.1pt;height:12pt;z-index:-251658240;visibility:visible;mso-wrap-style:square;mso-width-percent:0;mso-height-percent:0;mso-wrap-distance-left:0;mso-wrap-distance-top:0;mso-wrap-distance-right:0;mso-wrap-distance-bottom:0;mso-position-horizontal:left;mso-position-horizontal-relative:margin;mso-position-vertical:absolute;mso-position-vertical-relative:page;mso-width-percent:0;mso-height-percent:0;mso-width-relative:margin;mso-height-relative:margin;v-text-anchor:top" o:gfxdata="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" filled="f" stroked="f">
               <v:textbox inset="0,0,0,0">
                 <w:txbxContent>
                   <w:p>
@@ -2237,12 +2507,30 @@
                         <w:bCs/>
                         <w:spacing w:val="-2"/>
                       </w:rPr>
-                      <w:t>{empleado_nombre_completo}</w:t>
+                      <w:t>{</w:t>
+                    </w:r>
+                    <w:proofErr w:type="spellStart"/>
+                    <w:r>
+                      <w:rPr>
+                        <w:b/>
+                        <w:bCs/>
+                        <w:spacing w:val="-2"/>
+                      </w:rPr>
+                      <w:t>empleado_nombre_completo</w:t>
+                    </w:r>
+                    <w:proofErr w:type="spellEnd"/>
+                    <w:r>
+                      <w:rPr>
+                        <w:b/>
+                        <w:bCs/>
+                        <w:spacing w:val="-2"/>
+                      </w:rPr>
+                      <w:t>}</w:t>
                     </w:r>
                   </w:p>
                 </w:txbxContent>
               </v:textbox>
-              <w10:wrap anchorx="page" anchory="page"/>
+              <w10:wrap anchorx="margin" anchory="page"/>
             </v:shape>
           </w:pict>
         </mc:Fallback>
@@ -2338,16 +2626,6 @@
 </w:ftr>
 </file>
 
-<file path=word/footer3.xml><?xml version="1.0" encoding="utf-8"?>
-<w:ftr xmlns:wpc="http://schemas.microsoft.com/office/word/2010/wordprocessingCanvas" xmlns:cx="http://schemas.microsoft.com/office/drawing/2014/chartex" xmlns:cx1="http://schemas.microsoft.com/office/drawing/2015/9/8/chartex" xmlns:cx2="http://schemas.microsoft.com/office/drawing/2015/10/21/chartex" xmlns:cx3="http://schemas.microsoft.com/office/drawing/2016/5/9/chartex" xmlns:cx4="http://schemas.microsoft.com/office/drawing/2016/5/10/chartex" xmlns:cx5="http://schemas.microsoft.com/office/drawing/2016/5/11/chartex" xmlns:cx6="http://schemas.microsoft.com/office/drawing/2016/5/12/chartex" xmlns:cx7="http://schemas.microsoft.com/office/drawing/2016/5/13/chartex" xmlns:cx8="http://schemas.microsoft.com/office/drawing/2016/5/14/chartex" xmlns:mc="http://schemas.openxmlformats.org/markup-compatibility/2006" xmlns:aink="http://schemas.microsoft.com/office/drawing/2016/ink" xmlns:am3d="http://schemas.microsoft.com/office/drawing/2017/model3d" xmlns:o="urn:schemas-microsoft-com:office:office" xmlns:oel="http://schemas.microsoft.com/office/2019/extlst" xmlns:r="http://schemas.openxmlformats.org/officeDocument/2006/relationships" xmlns:m="http://schemas.openxmlformats.org/officeDocument/2006/math" xmlns:v="urn:schemas-microsoft-com:vml" xmlns:wp14="http://schemas.microsoft.com/office/word/2010/wordprocessingDrawing" xmlns:wp="http://schemas.openxmlformats.org/drawingml/2006/wordprocessingDrawing" xmlns:w10="urn:schemas-microsoft-com:office:word" xmlns:w="http://schemas.openxmlformats.org/wordprocessingml/2006/main" xmlns:w14="http://schemas.microsoft.com/office/word/2010/wordml" xmlns:w15="http://schemas.microsoft.com/office/word/2012/wordml" xmlns:w16cex="http://schemas.microsoft.com/office/word/2018/wordml/cex" xmlns:w16cid="http://schemas.microsoft.com/office/word/2016/wordml/cid" xmlns:w16="http://schemas.microsoft.com/office/word/2018/wordml" xmlns:w16du="http://schemas.microsoft.com/office/word/2023/wordml/word16du" xmlns:w16sdtdh="http://schemas.microsoft.com/office/word/2020/wordml/sdtdatahash" xmlns:w16sdtfl="http://schemas.microsoft.com/office/word/2024/wordml/sdtformatlock" xmlns:w16se="http://schemas.microsoft.com/office/word/2015/wordml/symex" xmlns:wpg="http://schemas.microsoft.com/office/word/2010/wordprocessingGroup" xmlns:wpi="http://schemas.microsoft.com/office/word/2010/wordprocessingInk" xmlns:wne="http://schemas.microsoft.com/office/word/2006/wordml" xmlns:wps="http://schemas.microsoft.com/office/word/2010/wordprocessingShape" mc:Ignorable="w14 w15 w16se w16cid w16 w16cex w16sdtdh w16sdtfl w16du wp14">
-  <w:p>
-    <w:pPr>
-      <w:pStyle w:val="Piedepgina"/>
-    </w:pPr>
-  </w:p>
-</w:ftr>
-</file>
-
 <file path=word/footnotes.xml><?xml version="1.0" encoding="utf-8"?>
 <w:footnotes xmlns:wpc="http://schemas.microsoft.com/office/word/2010/wordprocessingCanvas" xmlns:cx="http://schemas.microsoft.com/office/drawing/2014/chartex" xmlns:cx1="http://schemas.microsoft.com/office/drawing/2015/9/8/chartex" xmlns:cx2="http://schemas.microsoft.com/office/drawing/2015/10/21/chartex" xmlns:cx3="http://schemas.microsoft.com/office/drawing/2016/5/9/chartex" xmlns:cx4="http://schemas.microsoft.com/office/drawing/2016/5/10/chartex" xmlns:cx5="http://schemas.microsoft.com/office/drawing/2016/5/11/chartex" xmlns:cx6="http://schemas.microsoft.com/office/drawing/2016/5/12/chartex" xmlns:cx7="http://schemas.microsoft.com/office/drawing/2016/5/13/chartex" xmlns:cx8="http://schemas.microsoft.com/office/drawing/2016/5/14/chartex" xmlns:mc="http://schemas.openxmlformats.org/markup-compatibility/2006" xmlns:aink="http://schemas.microsoft.com/office/drawing/2016/ink" xmlns:am3d="http://schemas.microsoft.com/office/drawing/2017/model3d" xmlns:o="urn:schemas-microsoft-com:office:office" xmlns:oel="http://schemas.microsoft.com/office/2019/extlst" xmlns:r="http://schemas.openxmlformats.org/officeDocument/2006/relationships" xmlns:m="http://schemas.openxmlformats.org/officeDocument/2006/math" xmlns:v="urn:schemas-microsoft-com:vml" xmlns:wp14="http://schemas.microsoft.com/office/word/2010/wordprocessingDrawing" xmlns:wp="http://schemas.openxmlformats.org/drawingml/2006/wordprocessingDrawing" xmlns:w10="urn:schemas-microsoft-com:office:word" xmlns:w="http://schemas.openxmlformats.org/wordprocessingml/2006/main" xmlns:w14="http://schemas.microsoft.com/office/word/2010/wordml" xmlns:w15="http://schemas.microsoft.com/office/word/2012/wordml" xmlns:w16cex="http://schemas.microsoft.com/office/word/2018/wordml/cex" xmlns:w16cid="http://schemas.microsoft.com/office/word/2016/wordml/cid" xmlns:w16="http://schemas.microsoft.com/office/word/2018/wordml" xmlns:w16du="http://schemas.microsoft.com/office/word/2023/wordml/word16du" xmlns:w16sdtdh="http://schemas.microsoft.com/office/word/2020/wordml/sdtdatahash" xmlns:w16sdtfl="http://schemas.microsoft.com/office/word/2024/wordml/sdtformatlock" xmlns:w16se="http://schemas.microsoft.com/office/word/2015/wordml/symex" xmlns:wpg="http://schemas.microsoft.com/office/word/2010/wordprocessingGroup" xmlns:wpi="http://schemas.microsoft.com/office/word/2010/wordprocessingInk" xmlns:wne="http://schemas.microsoft.com/office/word/2006/wordml" xmlns:wps="http://schemas.microsoft.com/office/word/2010/wordprocessingShape" mc:Ignorable="w14 w15 w16se w16cid w16 w16cex w16sdtdh w16sdtfl w16du wp14">
   <w:footnote w:type="separator" w:id="-1">
@@ -2369,114 +2647,15 @@
 
 <file path=word/header1.xml><?xml version="1.0" encoding="utf-8"?>
 <w:hdr xmlns:wpc="http://schemas.microsoft.com/office/word/2010/wordprocessingCanvas" xmlns:cx="http://schemas.microsoft.com/office/drawing/2014/chartex" xmlns:cx1="http://schemas.microsoft.com/office/drawing/2015/9/8/chartex" xmlns:cx2="http://schemas.microsoft.com/office/drawing/2015/10/21/chartex" xmlns:cx3="http://schemas.microsoft.com/office/drawing/2016/5/9/chartex" xmlns:cx4="http://schemas.microsoft.com/office/drawing/2016/5/10/chartex" xmlns:cx5="http://schemas.microsoft.com/office/drawing/2016/5/11/chartex" xmlns:cx6="http://schemas.microsoft.com/office/drawing/2016/5/12/chartex" xmlns:cx7="http://schemas.microsoft.com/office/drawing/2016/5/13/chartex" xmlns:cx8="http://schemas.microsoft.com/office/drawing/2016/5/14/chartex" xmlns:mc="http://schemas.openxmlformats.org/markup-compatibility/2006" xmlns:aink="http://schemas.microsoft.com/office/drawing/2016/ink" xmlns:am3d="http://schemas.microsoft.com/office/drawing/2017/model3d" xmlns:o="urn:schemas-microsoft-com:office:office" xmlns:oel="http://schemas.microsoft.com/office/2019/extlst" xmlns:r="http://schemas.openxmlformats.org/officeDocument/2006/relationships" xmlns:m="http://schemas.openxmlformats.org/officeDocument/2006/math" xmlns:v="urn:schemas-microsoft-com:vml" xmlns:wp14="http://schemas.microsoft.com/office/word/2010/wordprocessingDrawing" xmlns:wp="http://schemas.openxmlformats.org/drawingml/2006/wordprocessingDrawing" xmlns:w10="urn:schemas-microsoft-com:office:word" xmlns:w="http://schemas.openxmlformats.org/wordprocessingml/2006/main" xmlns:w14="http://schemas.microsoft.com/office/word/2010/wordml" xmlns:w15="http://schemas.microsoft.com/office/word/2012/wordml" xmlns:w16cex="http://schemas.microsoft.com/office/word/2018/wordml/cex" xmlns:w16cid="http://schemas.microsoft.com/office/word/2016/wordml/cid" xmlns:w16="http://schemas.microsoft.com/office/word/2018/wordml" xmlns:w16du="http://schemas.microsoft.com/office/word/2023/wordml/word16du" xmlns:w16sdtdh="http://schemas.microsoft.com/office/word/2020/wordml/sdtdatahash" xmlns:w16sdtfl="http://schemas.microsoft.com/office/word/2024/wordml/sdtformatlock" xmlns:w16se="http://schemas.microsoft.com/office/word/2015/wordml/symex" xmlns:wpg="http://schemas.microsoft.com/office/word/2010/wordprocessingGroup" xmlns:wpi="http://schemas.microsoft.com/office/word/2010/wordprocessingInk" xmlns:wne="http://schemas.microsoft.com/office/word/2006/wordml" xmlns:wps="http://schemas.microsoft.com/office/word/2010/wordprocessingShape" mc:Ignorable="w14 w15 w16se w16cid w16 w16cex w16sdtdh w16sdtfl w16du wp14">
-  <w:p>
-    <w:pPr>
-      <w:pStyle w:val="Encabezado"/>
-    </w:pPr>
-  </w:p>
-</w:hdr>
-</file>
-
-<file path=word/header2.xml><?xml version="1.0" encoding="utf-8"?>
-<w:hdr xmlns:wpc="http://schemas.microsoft.com/office/word/2010/wordprocessingCanvas" xmlns:cx="http://schemas.microsoft.com/office/drawing/2014/chartex" xmlns:cx1="http://schemas.microsoft.com/office/drawing/2015/9/8/chartex" xmlns:cx2="http://schemas.microsoft.com/office/drawing/2015/10/21/chartex" xmlns:cx3="http://schemas.microsoft.com/office/drawing/2016/5/9/chartex" xmlns:cx4="http://schemas.microsoft.com/office/drawing/2016/5/10/chartex" xmlns:cx5="http://schemas.microsoft.com/office/drawing/2016/5/11/chartex" xmlns:cx6="http://schemas.microsoft.com/office/drawing/2016/5/12/chartex" xmlns:cx7="http://schemas.microsoft.com/office/drawing/2016/5/13/chartex" xmlns:cx8="http://schemas.microsoft.com/office/drawing/2016/5/14/chartex" xmlns:mc="http://schemas.openxmlformats.org/markup-compatibility/2006" xmlns:aink="http://schemas.microsoft.com/office/drawing/2016/ink" xmlns:am3d="http://schemas.microsoft.com/office/drawing/2017/model3d" xmlns:o="urn:schemas-microsoft-com:office:office" xmlns:oel="http://schemas.microsoft.com/office/2019/extlst" xmlns:r="http://schemas.openxmlformats.org/officeDocument/2006/relationships" xmlns:m="http://schemas.openxmlformats.org/officeDocument/2006/math" xmlns:v="urn:schemas-microsoft-com:vml" xmlns:wp14="http://schemas.microsoft.com/office/word/2010/wordprocessingDrawing" xmlns:wp="http://schemas.openxmlformats.org/drawingml/2006/wordprocessingDrawing" xmlns:w10="urn:schemas-microsoft-com:office:word" xmlns:w="http://schemas.openxmlformats.org/wordprocessingml/2006/main" xmlns:w14="http://schemas.microsoft.com/office/word/2010/wordml" xmlns:w15="http://schemas.microsoft.com/office/word/2012/wordml" xmlns:w16cex="http://schemas.microsoft.com/office/word/2018/wordml/cex" xmlns:w16cid="http://schemas.microsoft.com/office/word/2016/wordml/cid" xmlns:w16="http://schemas.microsoft.com/office/word/2018/wordml" xmlns:w16du="http://schemas.microsoft.com/office/word/2023/wordml/word16du" xmlns:w16sdtdh="http://schemas.microsoft.com/office/word/2020/wordml/sdtdatahash" xmlns:w16sdtfl="http://schemas.microsoft.com/office/word/2024/wordml/sdtformatlock" xmlns:w16se="http://schemas.microsoft.com/office/word/2015/wordml/symex" xmlns:wpg="http://schemas.microsoft.com/office/word/2010/wordprocessingGroup" xmlns:wpi="http://schemas.microsoft.com/office/word/2010/wordprocessingInk" xmlns:wne="http://schemas.microsoft.com/office/word/2006/wordml" xmlns:wps="http://schemas.microsoft.com/office/word/2010/wordprocessingShape" mc:Ignorable="w14 w15 w16se w16cid w16 w16cex w16sdtdh w16sdtfl w16du wp14">
-  <w:p>
-    <w:pPr>
-      <w:pStyle w:val="Textoindependiente"/>
-      <w:spacing w:line="14" w:lineRule="auto"/>
-    </w:pPr>
-    <w:r>
-      <w:rPr>
-        <w:noProof/>
-      </w:rPr>
-      <mc:AlternateContent>
-        <mc:Choice Requires="wps">
-          <w:drawing>
-            <wp:anchor distT="0" distB="0" distL="0" distR="0" simplePos="0" relativeHeight="487469056" behindDoc="1" locked="0" layoutInCell="1" allowOverlap="1" wp14:anchorId="0F9C582D" wp14:editId="7BEF78F5">
-              <wp:simplePos x="0" y="0"/>
-              <wp:positionH relativeFrom="page">
-                <wp:posOffset>4838191</wp:posOffset>
-              </wp:positionH>
-              <wp:positionV relativeFrom="page">
-                <wp:posOffset>566427</wp:posOffset>
-              </wp:positionV>
-              <wp:extent cx="2266315" cy="167005"/>
-              <wp:effectExtent l="0" t="0" r="0" b="0"/>
-              <wp:wrapNone/>
-              <wp:docPr id="1" name="Textbox 1"/>
-              <wp:cNvGraphicFramePr>
-                <a:graphicFrameLocks xmlns:a="http://schemas.openxmlformats.org/drawingml/2006/main"/>
-              </wp:cNvGraphicFramePr>
-              <a:graphic xmlns:a="http://schemas.openxmlformats.org/drawingml/2006/main">
-                <a:graphicData uri="http://schemas.microsoft.com/office/word/2010/wordprocessingShape">
-                  <wps:wsp>
-                    <wps:cNvSpPr txBox="1">
-                      <a:spLocks/>
-                    </wps:cNvSpPr>
-                    <wps:spPr>
-                      <a:xfrm>
-                        <a:off x="0" y="0"/>
-                        <a:ext cx="2266315" cy="167005"/>
-                      </a:xfrm>
-                      <a:prstGeom prst="rect">
-                        <a:avLst/>
-                      </a:prstGeom>
-                    </wps:spPr>
-                    <wps:txbx>
-                      <w:txbxContent>
-                        <w:p>
-                          <w:pPr>
-                            <w:pStyle w:val="Textoindependiente"/>
-                            <w:spacing w:before="12"/>
-                            <w:ind w:left="20"/>
-                          </w:pPr>
-                        </w:p>
-                      </w:txbxContent>
-                    </wps:txbx>
-                    <wps:bodyPr wrap="square" lIns="0" tIns="0" rIns="0" bIns="0" rtlCol="0">
-                      <a:noAutofit/>
-                    </wps:bodyPr>
-                  </wps:wsp>
-                </a:graphicData>
-              </a:graphic>
-            </wp:anchor>
-          </w:drawing>
-        </mc:Choice>
-        <mc:Fallback>
-          <w:pict>
-            <v:shapetype w14:anchorId="0F9C582D" id="_x0000_t202" coordsize="21600,21600" o:spt="202" path="m,l,21600r21600,l21600,xe">
-              <v:stroke joinstyle="miter"/>
-              <v:path gradientshapeok="t" o:connecttype="rect"/>
-            </v:shapetype>
-            <v:shape id="Textbox 1" o:spid="_x0000_s1026" type="#_x0000_t202" style="position:absolute;margin-left:380.95pt;margin-top:44.6pt;width:178.45pt;height:13.15pt;z-index:-15847424;visibility:visible;mso-wrap-style:square;mso-wrap-distance-left:0;mso-wrap-distance-top:0;mso-wrap-distance-right:0;mso-wrap-distance-bottom:0;mso-position-horizontal:absolute;mso-position-horizontal-relative:page;mso-position-vertical:absolute;mso-position-vertical-relative:page;v-text-anchor:top" o:gfxdata="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" filled="f" stroked="f">
-              <v:textbox inset="0,0,0,0">
-                <w:txbxContent>
-                  <w:p>
-                    <w:pPr>
-                      <w:pStyle w:val="Textoindependiente"/>
-                      <w:spacing w:before="12"/>
-                      <w:ind w:left="20"/>
-                    </w:pPr>
-                  </w:p>
-                </w:txbxContent>
-              </v:textbox>
-              <w10:wrap anchorx="page" anchory="page"/>
-            </v:shape>
-          </w:pict>
-        </mc:Fallback>
-      </mc:AlternateContent>
-    </w:r>
-  </w:p>
   <w:tbl>
     <w:tblPr>
-      <w:tblStyle w:val="TableNormal"/>
+      <w:tblStyle w:val="Tablaconcuadrcula"/>
       <w:tblW w:w="0" w:type="auto"/>
-      <w:tblInd w:w="155" w:type="dxa"/>
-      <w:tblLayout w:type="fixed"/>
-      <w:tblLook w:val="01E0" w:firstRow="1" w:lastRow="1" w:firstColumn="1" w:lastColumn="1" w:noHBand="0" w:noVBand="0"/>
+      <w:tblLook w:val="04A0" w:firstRow="1" w:lastRow="0" w:firstColumn="1" w:lastColumn="0" w:noHBand="0" w:noVBand="1"/>
     </w:tblPr>
     <w:tblGrid>
-      <w:gridCol w:w="2827"/>
-      <w:gridCol w:w="7821"/>
+      <w:gridCol w:w="2405"/>
+      <w:gridCol w:w="8363"/>
     </w:tblGrid>
     <w:tr>
       <w:trPr>
@@ -2484,27 +2663,13 @@
       </w:trPr>
       <w:tc>
         <w:tcPr>
-          <w:tcW w:w="2827" w:type="dxa"/>
-          <w:tcBorders>
-            <w:top w:val="single" w:sz="4" w:space="0" w:color="808080"/>
-            <w:left w:val="single" w:sz="4" w:space="0" w:color="808080"/>
-            <w:bottom w:val="double" w:sz="4" w:space="0" w:color="000000"/>
-            <w:right w:val="double" w:sz="4" w:space="0" w:color="808080"/>
-          </w:tcBorders>
-          <w:shd w:val="clear" w:color="auto" w:fill="FFFFFF" w:themeFill="background1"/>
-          <w:vAlign w:val="bottom"/>
+          <w:tcW w:w="2405" w:type="dxa"/>
+          <w:vAlign w:val="center"/>
         </w:tcPr>
         <w:p>
           <w:pPr>
-            <w:pStyle w:val="TableParagraph"/>
-            <w:spacing w:before="0" w:line="219" w:lineRule="exact"/>
-            <w:ind w:right="2"/>
+            <w:pStyle w:val="Encabezado"/>
             <w:jc w:val="center"/>
-            <w:rPr>
-              <w:rFonts w:ascii="Arial"/>
-              <w:b/>
-              <w:sz w:val="20"/>
-            </w:rPr>
           </w:pPr>
           <w:r>
             <w:rPr>
@@ -2514,9 +2679,9 @@
               <w:sz w:val="20"/>
             </w:rPr>
             <w:drawing>
-              <wp:inline distT="0" distB="0" distL="0" distR="0" wp14:anchorId="24617F39" wp14:editId="6C3DA531">
-                <wp:extent cx="1628775" cy="418340"/>
-                <wp:effectExtent l="0" t="0" r="0" b="1270"/>
+              <wp:inline distT="0" distB="0" distL="0" distR="0" wp14:anchorId="030D332F" wp14:editId="44CE1204">
+                <wp:extent cx="1374405" cy="416560"/>
+                <wp:effectExtent l="0" t="0" r="0" b="2540"/>
                 <wp:docPr id="574567687" name="Imagen 1"/>
                 <wp:cNvGraphicFramePr>
                   <a:graphicFrameLocks xmlns:a="http://schemas.openxmlformats.org/drawingml/2006/main" noChangeAspect="1"/>
@@ -2528,20 +2693,29 @@
                         <pic:cNvPr id="574567687" name=""/>
                         <pic:cNvPicPr/>
                       </pic:nvPicPr>
-                      <pic:blipFill>
+                      <pic:blipFill rotWithShape="1">
                         <a:blip r:embed="rId1"/>
+                        <a:srcRect l="5393" r="4439"/>
                         <a:stretch>
                           <a:fillRect/>
                         </a:stretch>
                       </pic:blipFill>
-                      <pic:spPr>
+                      <pic:spPr bwMode="auto">
                         <a:xfrm>
                           <a:off x="0" y="0"/>
-                          <a:ext cx="1685856" cy="433001"/>
+                          <a:ext cx="1407671" cy="426643"/>
                         </a:xfrm>
                         <a:prstGeom prst="rect">
                           <a:avLst/>
                         </a:prstGeom>
+                        <a:ln>
+                          <a:noFill/>
+                        </a:ln>
+                        <a:extLst>
+                          <a:ext uri="{53640926-AAD7-44D8-BBD7-CCE9431645EC}">
+                            <a14:shadowObscured xmlns:a14="http://schemas.microsoft.com/office/drawing/2010/main"/>
+                          </a:ext>
+                        </a:extLst>
                       </pic:spPr>
                     </pic:pic>
                   </a:graphicData>
@@ -2553,28 +2727,14 @@
       </w:tc>
       <w:tc>
         <w:tcPr>
-          <w:tcW w:w="7821" w:type="dxa"/>
-          <w:tcBorders>
-            <w:top w:val="single" w:sz="4" w:space="0" w:color="808080"/>
-            <w:left w:val="double" w:sz="4" w:space="0" w:color="808080"/>
-            <w:bottom w:val="double" w:sz="4" w:space="0" w:color="000000"/>
-            <w:right w:val="single" w:sz="4" w:space="0" w:color="808080"/>
-          </w:tcBorders>
-          <w:shd w:val="clear" w:color="auto" w:fill="BFBFBF"/>
+          <w:tcW w:w="8363" w:type="dxa"/>
+          <w:shd w:val="clear" w:color="auto" w:fill="BFBFBF" w:themeFill="background1" w:themeFillShade="BF"/>
           <w:vAlign w:val="center"/>
         </w:tcPr>
         <w:p>
           <w:pPr>
-            <w:pStyle w:val="TableParagraph"/>
-            <w:spacing w:before="0" w:line="221" w:lineRule="exact"/>
-            <w:ind w:right="4"/>
+            <w:pStyle w:val="Encabezado"/>
             <w:jc w:val="center"/>
-            <w:rPr>
-              <w:rFonts w:ascii="Arial"/>
-              <w:b/>
-              <w:sz w:val="28"/>
-              <w:szCs w:val="28"/>
-            </w:rPr>
           </w:pPr>
           <w:r>
             <w:rPr>
@@ -2630,17 +2790,6 @@
       </w:tc>
     </w:tr>
   </w:tbl>
-  <w:p>
-    <w:pPr>
-      <w:pStyle w:val="Textoindependiente"/>
-      <w:spacing w:line="14" w:lineRule="auto"/>
-    </w:pPr>
-  </w:p>
-</w:hdr>
-</file>
-
-<file path=word/header3.xml><?xml version="1.0" encoding="utf-8"?>
-<w:hdr xmlns:wpc="http://schemas.microsoft.com/office/word/2010/wordprocessingCanvas" xmlns:cx="http://schemas.microsoft.com/office/drawing/2014/chartex" xmlns:cx1="http://schemas.microsoft.com/office/drawing/2015/9/8/chartex" xmlns:cx2="http://schemas.microsoft.com/office/drawing/2015/10/21/chartex" xmlns:cx3="http://schemas.microsoft.com/office/drawing/2016/5/9/chartex" xmlns:cx4="http://schemas.microsoft.com/office/drawing/2016/5/10/chartex" xmlns:cx5="http://schemas.microsoft.com/office/drawing/2016/5/11/chartex" xmlns:cx6="http://schemas.microsoft.com/office/drawing/2016/5/12/chartex" xmlns:cx7="http://schemas.microsoft.com/office/drawing/2016/5/13/chartex" xmlns:cx8="http://schemas.microsoft.com/office/drawing/2016/5/14/chartex" xmlns:mc="http://schemas.openxmlformats.org/markup-compatibility/2006" xmlns:aink="http://schemas.microsoft.com/office/drawing/2016/ink" xmlns:am3d="http://schemas.microsoft.com/office/drawing/2017/model3d" xmlns:o="urn:schemas-microsoft-com:office:office" xmlns:oel="http://schemas.microsoft.com/office/2019/extlst" xmlns:r="http://schemas.openxmlformats.org/officeDocument/2006/relationships" xmlns:m="http://schemas.openxmlformats.org/officeDocument/2006/math" xmlns:v="urn:schemas-microsoft-com:vml" xmlns:wp14="http://schemas.microsoft.com/office/word/2010/wordprocessingDrawing" xmlns:wp="http://schemas.openxmlformats.org/drawingml/2006/wordprocessingDrawing" xmlns:w10="urn:schemas-microsoft-com:office:word" xmlns:w="http://schemas.openxmlformats.org/wordprocessingml/2006/main" xmlns:w14="http://schemas.microsoft.com/office/word/2010/wordml" xmlns:w15="http://schemas.microsoft.com/office/word/2012/wordml" xmlns:w16cex="http://schemas.microsoft.com/office/word/2018/wordml/cex" xmlns:w16cid="http://schemas.microsoft.com/office/word/2016/wordml/cid" xmlns:w16="http://schemas.microsoft.com/office/word/2018/wordml" xmlns:w16du="http://schemas.microsoft.com/office/word/2023/wordml/word16du" xmlns:w16sdtdh="http://schemas.microsoft.com/office/word/2020/wordml/sdtdatahash" xmlns:w16sdtfl="http://schemas.microsoft.com/office/word/2024/wordml/sdtformatlock" xmlns:w16se="http://schemas.microsoft.com/office/word/2015/wordml/symex" xmlns:wpg="http://schemas.microsoft.com/office/word/2010/wordprocessingGroup" xmlns:wpi="http://schemas.microsoft.com/office/word/2010/wordprocessingInk" xmlns:wne="http://schemas.microsoft.com/office/word/2006/wordml" xmlns:wps="http://schemas.microsoft.com/office/word/2010/wordprocessingShape" mc:Ignorable="w14 w15 w16se w16cid w16 w16cex w16sdtdh w16sdtfl w16du wp14">
   <w:p>
     <w:pPr>
       <w:pStyle w:val="Encabezado"/>
@@ -3057,6 +3206,7 @@
   <w:style w:type="character" w:default="1" w:styleId="Fuentedeprrafopredeter">
     <w:name w:val="Default Paragraph Font"/>
     <w:uiPriority w:val="1"/>
+    <w:semiHidden/>
     <w:unhideWhenUsed/>
   </w:style>
   <w:style w:type="table" w:default="1" w:styleId="Tablanormal">
@@ -3184,6 +3334,22 @@
       <w:szCs w:val="20"/>
       <w:lang w:val="es-ES"/>
     </w:rPr>
+  </w:style>
+  <w:style w:type="table" w:styleId="Tablaconcuadrcula">
+    <w:name w:val="Table Grid"/>
+    <w:basedOn w:val="Tablanormal"/>
+    <w:uiPriority w:val="39"/>
+    <w:rsid w:val="00E607E1"/>
+    <w:tblPr>
+      <w:tblBorders>
+        <w:top w:val="single" w:sz="4" w:space="0" w:color="auto"/>
+        <w:left w:val="single" w:sz="4" w:space="0" w:color="auto"/>
+        <w:bottom w:val="single" w:sz="4" w:space="0" w:color="auto"/>
+        <w:right w:val="single" w:sz="4" w:space="0" w:color="auto"/>
+        <w:insideH w:val="single" w:sz="4" w:space="0" w:color="auto"/>
+        <w:insideV w:val="single" w:sz="4" w:space="0" w:color="auto"/>
+      </w:tblBorders>
+    </w:tblPr>
   </w:style>
 </w:styles>
 </file>

</xml_diff>

<commit_message>
fix(finiquitos): respeta template, corrige nombre PDF, elimina liquidacion comparativa e historial
</commit_message>
<xml_diff>
--- a/docx_templates/FINIQUITO FORMATO.docx
+++ b/docx_templates/FINIQUITO FORMATO.docx
@@ -1709,7 +1709,7 @@
       </w:tr>
       <w:tr>
         <w:trPr>
-          <w:trHeight w:val="2702"/>
+          <w:trHeight w:val="2986"/>
         </w:trPr>
         <w:tc>
           <w:tcPr>
@@ -2248,13 +2248,6 @@
                 <w:sz w:val="20"/>
               </w:rPr>
               <w:tab/>
-            </w:r>
-            <w:r>
-              <w:rPr>
-                <w:rFonts w:ascii="Arial"/>
-                <w:b/>
-                <w:sz w:val="20"/>
-              </w:rPr>
               <w:t xml:space="preserve">                      </w:t>
             </w:r>
             <w:proofErr w:type="gramStart"/>

</xml_diff>

<commit_message>
fix(finiquitos): respeta template exacto, corrige nombres, firma y placeholders
</commit_message>
<xml_diff>
--- a/docx_templates/FINIQUITO FORMATO.docx
+++ b/docx_templates/FINIQUITO FORMATO.docx
@@ -2395,7 +2395,7 @@
               <wp:positionV relativeFrom="page">
                 <wp:posOffset>9486199</wp:posOffset>
               </wp:positionV>
-              <wp:extent cx="6872024" cy="152400"/>
+              <wp:extent cx="6872024" cy="360000"/>
               <wp:effectExtent l="0" t="0" r="0" b="0"/>
               <wp:wrapNone/>
               <wp:docPr id="3" name="Textbox 3"/>
@@ -2422,7 +2422,7 @@
                         <w:p>
                           <w:pPr>
                             <w:pStyle w:val="Textoindependiente"/>
-                            <w:spacing w:before="12"/>
+                            <w:spacing w:before="360" w:after="240"/>
                             <w:ind w:left="20"/>
                             <w:jc w:val="center"/>
                             <w:rPr>
@@ -2474,145 +2474,6 @@
             </wp:anchor>
           </w:drawing>
         </mc:Choice>
-        <mc:Fallback>
-          <w:pict>
-            <v:shapetype w14:anchorId="03A76DAF" id="_x0000_t202" coordsize="21600,21600" o:spt="202" path="m,l,21600r21600,l21600,xe">
-              <v:stroke joinstyle="miter"/>
-              <v:path gradientshapeok="t" o:connecttype="rect"/>
-            </v:shapetype>
-            <v:shape id="Textbox 3" o:spid="_x0000_s1026" type="#_x0000_t202" style="position:absolute;margin-left:0;margin-top:746.95pt;width:541.1pt;height:12pt;z-index:-251658240;visibility:visible;mso-wrap-style:square;mso-width-percent:0;mso-height-percent:0;mso-wrap-distance-left:0;mso-wrap-distance-top:0;mso-wrap-distance-right:0;mso-wrap-distance-bottom:0;mso-position-horizontal:left;mso-position-horizontal-relative:margin;mso-position-vertical:absolute;mso-position-vertical-relative:page;mso-width-percent:0;mso-height-percent:0;mso-width-relative:margin;mso-height-relative:margin;v-text-anchor:top" o:gfxdata="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" filled="f" stroked="f">
-              <v:textbox inset="0,0,0,0">
-                <w:txbxContent>
-                  <w:p>
-                    <w:pPr>
-                      <w:pStyle w:val="Textoindependiente"/>
-                      <w:spacing w:before="12"/>
-                      <w:ind w:left="20"/>
-                      <w:jc w:val="center"/>
-                      <w:rPr>
-                        <w:b/>
-                        <w:bCs/>
-                      </w:rPr>
-                    </w:pPr>
-                    <w:r>
-                      <w:rPr>
-                        <w:b/>
-                        <w:bCs/>
-                        <w:spacing w:val="-2"/>
-                      </w:rPr>
-                      <w:t>{</w:t>
-                    </w:r>
-                    <w:proofErr w:type="spellStart"/>
-                    <w:r>
-                      <w:rPr>
-                        <w:b/>
-                        <w:bCs/>
-                        <w:spacing w:val="-2"/>
-                      </w:rPr>
-                      <w:t>empleado_nombre_completo</w:t>
-                    </w:r>
-                    <w:proofErr w:type="spellEnd"/>
-                    <w:r>
-                      <w:rPr>
-                        <w:b/>
-                        <w:bCs/>
-                        <w:spacing w:val="-2"/>
-                      </w:rPr>
-                      <w:t>}</w:t>
-                    </w:r>
-                  </w:p>
-                </w:txbxContent>
-              </v:textbox>
-              <w10:wrap anchorx="margin" anchory="page"/>
-            </v:shape>
-          </w:pict>
-        </mc:Fallback>
-      </mc:AlternateContent>
-    </w:r>
-    <w:r>
-      <w:rPr>
-        <w:noProof/>
-      </w:rPr>
-      <mc:AlternateContent>
-        <mc:Choice Requires="wps">
-          <w:drawing>
-            <wp:anchor distT="0" distB="0" distL="0" distR="0" simplePos="0" relativeHeight="251656192" behindDoc="1" locked="0" layoutInCell="1" allowOverlap="1" wp14:anchorId="2D003B34" wp14:editId="5BECF208">
-              <wp:simplePos x="0" y="0"/>
-              <wp:positionH relativeFrom="page">
-                <wp:posOffset>2909316</wp:posOffset>
-              </wp:positionH>
-              <wp:positionV relativeFrom="page">
-                <wp:posOffset>9406128</wp:posOffset>
-              </wp:positionV>
-              <wp:extent cx="2147570" cy="21590"/>
-              <wp:effectExtent l="0" t="0" r="0" b="0"/>
-              <wp:wrapNone/>
-              <wp:docPr id="2" name="Graphic 2"/>
-              <wp:cNvGraphicFramePr>
-                <a:graphicFrameLocks xmlns:a="http://schemas.openxmlformats.org/drawingml/2006/main"/>
-              </wp:cNvGraphicFramePr>
-              <a:graphic xmlns:a="http://schemas.openxmlformats.org/drawingml/2006/main">
-                <a:graphicData uri="http://schemas.microsoft.com/office/word/2010/wordprocessingShape">
-                  <wps:wsp>
-                    <wps:cNvSpPr>
-                      <a:spLocks/>
-                    </wps:cNvSpPr>
-                    <wps:spPr>
-                      <a:xfrm>
-                        <a:off x="0" y="0"/>
-                        <a:ext cx="2147570" cy="21590"/>
-                      </a:xfrm>
-                      <a:custGeom>
-                        <a:avLst/>
-                        <a:gdLst/>
-                        <a:ahLst/>
-                        <a:cxnLst/>
-                        <a:rect l="l" t="t" r="r" b="b"/>
-                        <a:pathLst>
-                          <a:path w="2147570" h="21590">
-                            <a:moveTo>
-                              <a:pt x="2147316" y="21335"/>
-                            </a:moveTo>
-                            <a:lnTo>
-                              <a:pt x="0" y="21335"/>
-                            </a:lnTo>
-                            <a:lnTo>
-                              <a:pt x="0" y="0"/>
-                            </a:lnTo>
-                            <a:lnTo>
-                              <a:pt x="2147316" y="0"/>
-                            </a:lnTo>
-                            <a:lnTo>
-                              <a:pt x="2147316" y="21335"/>
-                            </a:lnTo>
-                            <a:close/>
-                          </a:path>
-                        </a:pathLst>
-                      </a:custGeom>
-                      <a:solidFill>
-                        <a:srgbClr val="FFDAB8"/>
-                      </a:solidFill>
-                    </wps:spPr>
-                    <wps:bodyPr wrap="square" lIns="0" tIns="0" rIns="0" bIns="0" rtlCol="0">
-                      <a:prstTxWarp prst="textNoShape">
-                        <a:avLst/>
-                      </a:prstTxWarp>
-                      <a:noAutofit/>
-                    </wps:bodyPr>
-                  </wps:wsp>
-                </a:graphicData>
-              </a:graphic>
-            </wp:anchor>
-          </w:drawing>
-        </mc:Choice>
-        <mc:Fallback>
-          <w:pict>
-            <v:shape w14:anchorId="3604BE30" id="Graphic 2" o:spid="_x0000_s1026" style="position:absolute;margin-left:229.1pt;margin-top:740.65pt;width:169.1pt;height:1.7pt;z-index:-251660288;visibility:visible;mso-wrap-style:square;mso-wrap-distance-left:0;mso-wrap-distance-top:0;mso-wrap-distance-right:0;mso-wrap-distance-bottom:0;mso-position-horizontal:absolute;mso-position-horizontal-relative:page;mso-position-vertical:absolute;mso-position-vertical-relative:page;v-text-anchor:top" coordsize="2147570,21590" o:gfxdata="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" path="m2147316,21335l,21335,,,2147316,r,21335xe" fillcolor="#ffdab8" stroked="f">
-              <v:path arrowok="t"/>
-              <w10:wrap anchorx="page" anchory="page"/>
-            </v:shape>
-          </w:pict>
-        </mc:Fallback>
       </mc:AlternateContent>
     </w:r>
   </w:p>

</xml_diff>

<commit_message>
fix(finiquitos): corrige layout DOCX base para logo, tabla y espacio de firma
</commit_message>
<xml_diff>
--- a/docx_templates/FINIQUITO FORMATO.docx
+++ b/docx_templates/FINIQUITO FORMATO.docx
@@ -1709,7 +1709,7 @@
       </w:tr>
       <w:tr>
         <w:trPr>
-          <w:trHeight w:val="2986"/>
+          <w:trHeight w:val="360" w:hRule="atLeast"/>
         </w:trPr>
         <w:tc>
           <w:tcPr>
@@ -2331,7 +2331,7 @@
           <w:b/>
           <w:bCs/>
         </w:rPr>
-        <w:spacing w:before="360" w:after="2160"/>
+        <w:spacing w:before="360" w:after="4320"/>
       </w:pPr>
       <w:r>
         <w:rPr>
@@ -2347,7 +2347,7 @@
       <w:footerReference w:type="default" r:id="rId7"/>
       <w:type w:val="continuous"/>
       <w:pgSz w:w="12240" w:h="15840"/>
-      <w:pgMar w:top="1880" w:right="360" w:bottom="1020" w:left="720" w:header="912" w:footer="827" w:gutter="0"/>
+      <w:pgMar w:top="1880" w:right="360" w:bottom="1020" w:left="720" w:header="912" w:footer="1440" w:gutter="0"/>
       <w:pgNumType w:start="1"/>
       <w:cols w:space="720"/>
     </w:sectPr>
@@ -2412,7 +2412,7 @@
                     <wps:spPr>
                       <a:xfrm>
                         <a:off x="0" y="0"/>
-                        <a:ext cx="6872024" cy="540000"/>
+                        <a:ext cx="6872024" cy="990000"/>
                       </a:xfrm>
                       <a:prstGeom prst="rect">
                         <a:avLst/>
@@ -2550,7 +2550,7 @@
                       </pic:nvPicPr>
                       <pic:blipFill rotWithShape="1">
                         <a:blip r:embed="rId1"/>
-                        <a:srcRect l="5393" r="4439"/>
+                        <a:srcRect l="0" t="0" r="0" b="0"/>
                         <a:stretch>
                           <a:fillRect/>
                         </a:stretch>

</xml_diff>

<commit_message>
fix(finiquitos): unifica pipeline de render entre app y test y ajusta layout final
</commit_message>
<xml_diff>
--- a/docx_templates/FINIQUITO FORMATO.docx
+++ b/docx_templates/FINIQUITO FORMATO.docx
@@ -1709,7 +1709,7 @@
       </w:tr>
       <w:tr>
         <w:trPr>
-          <w:trHeight w:val="360" w:hRule="atLeast"/>
+          <w:trHeight w:val="900" w:hRule="atLeast"/>
         </w:trPr>
         <w:tc>
           <w:tcPr>
@@ -1741,11 +1741,19 @@
           <w:p>
             <w:pPr>
               <w:pStyle w:val="TableParagraph"/>
-              <w:ind w:left="87"/>
-              <w:rPr>
-                <w:sz w:val="18"/>
-              </w:rPr>
-            </w:pPr>
+              <w:spacing w:before="120" w:after="60"/>
+              <w:ind w:left="0"/>
+              <w:jc w:val="center"/>
+              <w:rPr>
+                <w:sz w:val="18"/>
+              </w:rPr>
+            </w:pPr>
+            <w:r>
+              <w:rPr>
+                <w:sz w:val="18"/>
+              </w:rPr>
+              <w:t xml:space="preserve">______________________________________________</w:t>
+            </w:r>
           </w:p>
         </w:tc>
         <w:tc>
@@ -2149,21 +2157,22 @@
         </w:tc>
         <w:tc>
           <w:tcPr>
-            <w:tcW w:w="4862" w:type="dxa"/>
+            <w:tcW w:w="5400" w:type="dxa"/>
             <w:tcBorders>
               <w:top w:val="single" w:sz="4" w:space="0" w:color="auto"/>
               <w:left w:val="single" w:sz="4" w:space="0" w:color="auto"/>
             </w:tcBorders>
             <w:vAlign w:val="center"/>
+            <w:noWrap/>
           </w:tcPr>
           <w:p>
             <w:pPr>
               <w:pStyle w:val="TableParagraph"/>
               <w:tabs>
-                <w:tab w:val="left" w:pos="2611"/>
+                <w:tab w:val="left" w:pos="3200"/>
               </w:tabs>
               <w:spacing w:before="83"/>
-              <w:ind w:right="126"/>
+              <w:ind w:right="72"/>
               <w:rPr>
                 <w:rFonts w:ascii="Arial"/>
                 <w:b/>
@@ -2331,7 +2340,7 @@
           <w:b/>
           <w:bCs/>
         </w:rPr>
-        <w:spacing w:before="360" w:after="4320"/>
+        <w:spacing w:before="360" w:after="1440"/>
       </w:pPr>
       <w:r>
         <w:rPr>
@@ -2347,7 +2356,7 @@
       <w:footerReference w:type="default" r:id="rId7"/>
       <w:type w:val="continuous"/>
       <w:pgSz w:w="12240" w:h="15840"/>
-      <w:pgMar w:top="1880" w:right="360" w:bottom="1020" w:left="720" w:header="912" w:footer="1440" w:gutter="0"/>
+      <w:pgMar w:top="1880" w:right="360" w:bottom="1020" w:left="720" w:header="912" w:footer="1120" w:gutter="0"/>
       <w:pgNumType w:start="1"/>
       <w:cols w:space="720"/>
     </w:sectPr>
@@ -2412,7 +2421,7 @@
                     <wps:spPr>
                       <a:xfrm>
                         <a:off x="0" y="0"/>
-                        <a:ext cx="6872024" cy="990000"/>
+                        <a:ext cx="6872024" cy="720000"/>
                       </a:xfrm>
                       <a:prstGeom prst="rect">
                         <a:avLst/>

</xml_diff>

<commit_message>
fix(finiquitos): corrige ajuste al neto, compacta deducciones y estabiliza totales
</commit_message>
<xml_diff>
--- a/docx_templates/FINIQUITO FORMATO.docx
+++ b/docx_templates/FINIQUITO FORMATO.docx
@@ -1741,19 +1741,11 @@
           <w:p>
             <w:pPr>
               <w:pStyle w:val="TableParagraph"/>
-              <w:spacing w:before="120" w:after="60"/>
-              <w:ind w:left="0"/>
-              <w:jc w:val="center"/>
-              <w:rPr>
-                <w:sz w:val="18"/>
-              </w:rPr>
-            </w:pPr>
-            <w:r>
-              <w:rPr>
-                <w:sz w:val="18"/>
-              </w:rPr>
-              <w:t xml:space="preserve">______________________________________________</w:t>
-            </w:r>
+              <w:ind w:left="87"/>
+              <w:rPr>
+                <w:sz w:val="18"/>
+              </w:rPr>
+            </w:pPr>
           </w:p>
         </w:tc>
         <w:tc>
@@ -2157,22 +2149,21 @@
         </w:tc>
         <w:tc>
           <w:tcPr>
-            <w:tcW w:w="5400" w:type="dxa"/>
+            <w:tcW w:w="6600" w:type="dxa"/>
             <w:tcBorders>
               <w:top w:val="single" w:sz="4" w:space="0" w:color="auto"/>
               <w:left w:val="single" w:sz="4" w:space="0" w:color="auto"/>
             </w:tcBorders>
             <w:vAlign w:val="center"/>
-            <w:noWrap/>
           </w:tcPr>
           <w:p>
             <w:pPr>
               <w:pStyle w:val="TableParagraph"/>
               <w:tabs>
-                <w:tab w:val="left" w:pos="3200"/>
+                <w:tab w:val="left" w:pos="4320"/>
               </w:tabs>
               <w:spacing w:before="83"/>
-              <w:ind w:right="72"/>
+              <w:ind w:right="36"/>
               <w:rPr>
                 <w:rFonts w:ascii="Arial"/>
                 <w:b/>
@@ -2186,7 +2177,7 @@
                 <w:b/>
                 <w:sz w:val="20"/>
               </w:rPr>
-              <w:t xml:space="preserve">                      </w:t>
+              <w:t xml:space="preserve">   </w:t>
             </w:r>
             <w:proofErr w:type="gramStart"/>
             <w:r>

</xml_diff>

<commit_message>
fix(finiquitos): reacomoda placeholders activos, ajusta desglose y corrige firma final
</commit_message>
<xml_diff>
--- a/docx_templates/FINIQUITO FORMATO.docx
+++ b/docx_templates/FINIQUITO FORMATO.docx
@@ -159,7 +159,7 @@
         <w:gridCol w:w="1765"/>
         <w:gridCol w:w="715"/>
         <w:gridCol w:w="2801"/>
-        <w:gridCol w:w="1344"/>
+        <w:gridCol w:w="1309"/>
       </w:tblGrid>
       <w:tr>
         <w:trPr>
@@ -202,7 +202,7 @@
         </w:tc>
         <w:tc>
           <w:tcPr>
-            <w:tcW w:w="4860" w:type="dxa"/>
+            <w:tcW w:w="4825" w:type="dxa"/>
             <w:gridSpan w:val="3"/>
             <w:tcBorders>
               <w:top w:val="single" w:sz="4" w:space="0" w:color="808080"/>
@@ -397,7 +397,7 @@
         </w:tc>
         <w:tc>
           <w:tcPr>
-            <w:tcW w:w="1344" w:type="dxa"/>
+            <w:tcW w:w="1309" w:type="dxa"/>
             <w:tcBorders>
               <w:top w:val="double" w:sz="4" w:space="0" w:color="000000"/>
               <w:right w:val="single" w:sz="4" w:space="0" w:color="000000"/>
@@ -591,7 +591,7 @@
         </w:tc>
         <w:tc>
           <w:tcPr>
-            <w:tcW w:w="1344" w:type="dxa"/>
+            <w:tcW w:w="1309" w:type="dxa"/>
             <w:tcBorders>
               <w:right w:val="single" w:sz="4" w:space="0" w:color="000000"/>
             </w:tcBorders>
@@ -774,7 +774,7 @@
         </w:tc>
         <w:tc>
           <w:tcPr>
-            <w:tcW w:w="1344" w:type="dxa"/>
+            <w:tcW w:w="1309" w:type="dxa"/>
             <w:tcBorders>
               <w:right w:val="single" w:sz="4" w:space="0" w:color="000000"/>
             </w:tcBorders>
@@ -987,7 +987,7 @@
         </w:tc>
         <w:tc>
           <w:tcPr>
-            <w:tcW w:w="1344" w:type="dxa"/>
+            <w:tcW w:w="1309" w:type="dxa"/>
             <w:tcBorders>
               <w:right w:val="single" w:sz="4" w:space="0" w:color="000000"/>
             </w:tcBorders>
@@ -1223,7 +1223,7 @@
         </w:tc>
         <w:tc>
           <w:tcPr>
-            <w:tcW w:w="1344" w:type="dxa"/>
+            <w:tcW w:w="1309" w:type="dxa"/>
             <w:tcBorders>
               <w:right w:val="single" w:sz="4" w:space="0" w:color="000000"/>
             </w:tcBorders>
@@ -1368,7 +1368,7 @@
         </w:tc>
         <w:tc>
           <w:tcPr>
-            <w:tcW w:w="1344" w:type="dxa"/>
+            <w:tcW w:w="1309" w:type="dxa"/>
             <w:tcBorders>
               <w:bottom w:val="single" w:sz="4" w:space="0" w:color="FFFFFF" w:themeColor="background1"/>
               <w:right w:val="single" w:sz="4" w:space="0" w:color="000000"/>
@@ -1522,7 +1522,7 @@
         </w:tc>
         <w:tc>
           <w:tcPr>
-            <w:tcW w:w="1344" w:type="dxa"/>
+            <w:tcW w:w="1309" w:type="dxa"/>
             <w:tcBorders>
               <w:top w:val="single" w:sz="4" w:space="0" w:color="FFFFFF" w:themeColor="background1"/>
               <w:right w:val="single" w:sz="4" w:space="0" w:color="000000"/>
@@ -1690,7 +1690,7 @@
         </w:tc>
         <w:tc>
           <w:tcPr>
-            <w:tcW w:w="1344" w:type="dxa"/>
+            <w:tcW w:w="1309" w:type="dxa"/>
             <w:tcBorders>
               <w:right w:val="single" w:sz="4" w:space="0" w:color="000000"/>
             </w:tcBorders>
@@ -1807,7 +1807,7 @@
         </w:tc>
         <w:tc>
           <w:tcPr>
-            <w:tcW w:w="1344" w:type="dxa"/>
+            <w:tcW w:w="1309" w:type="dxa"/>
             <w:tcBorders>
               <w:bottom w:val="single" w:sz="4" w:space="0" w:color="000000"/>
               <w:right w:val="single" w:sz="4" w:space="0" w:color="000000"/>
@@ -1853,7 +1853,7 @@
       </w:tblPr>
       <w:tblGrid>
         <w:gridCol w:w="5778"/>
-        <w:gridCol w:w="4961"/>
+        <w:gridCol w:w="4819"/>
       </w:tblGrid>
       <w:tr>
         <w:trPr>
@@ -1987,7 +1987,7 @@
         </w:tc>
         <w:tc>
           <w:tcPr>
-            <w:tcW w:w="4961" w:type="dxa"/>
+            <w:tcW w:w="4819" w:type="dxa"/>
             <w:tcBorders>
               <w:left w:val="single" w:sz="4" w:space="0" w:color="auto"/>
               <w:bottom w:val="single" w:sz="4" w:space="0" w:color="auto"/>
@@ -2149,7 +2149,7 @@
         </w:tc>
         <w:tc>
           <w:tcPr>
-            <w:tcW w:w="4961" w:type="dxa"/>
+            <w:tcW w:w="4819" w:type="dxa"/>
             <w:tcBorders>
               <w:top w:val="single" w:sz="4" w:space="0" w:color="auto"/>
               <w:left w:val="single" w:sz="4" w:space="0" w:color="auto"/>

</xml_diff>

<commit_message>
feat(finiquitos): agregar búsqueda de fecha de ingreso desde Excel compartido en OneDrive
</commit_message>
<xml_diff>
--- a/docx_templates/FINIQUITO FORMATO.docx
+++ b/docx_templates/FINIQUITO FORMATO.docx
@@ -1709,7 +1709,7 @@
       </w:tr>
       <w:tr>
         <w:trPr>
-          <w:trHeight w:val="2986"/>
+          <w:trHeight w:val="2080" w:hRule="atLeast"/>
         </w:trPr>
         <w:tc>
           <w:tcPr>
@@ -2395,7 +2395,7 @@
       <mc:AlternateContent>
         <mc:Choice Requires="wps">
           <w:drawing>
-            <wp:anchor distT="0" distB="0" distL="0" distR="0" simplePos="0" relativeHeight="251658240" behindDoc="1" locked="0" layoutInCell="1" allowOverlap="1" wp14:anchorId="03A76DAF" wp14:editId="716C991F">
+            <wp:anchor distT="0" distB="0" distL="0" distR="0" simplePos="0" relativeHeight="251658240" behindDoc="0" locked="0" layoutInCell="1" allowOverlap="1" wp14:anchorId="03A76DAF" wp14:editId="716C991F">
               <wp:simplePos x="0" y="0"/>
               <wp:positionH relativeFrom="margin">
                 <wp:align>left</wp:align>
@@ -2516,93 +2516,6 @@
             </wp:anchor>
           </w:drawing>
         </mc:Choice>
-        <mc:Fallback>
-          <w:pict>
-            <v:shapetype w14:anchorId="03A76DAF" id="_x0000_t202" coordsize="21600,21600" o:spt="202" path="m,l,21600r21600,l21600,xe">
-              <v:stroke joinstyle="miter"/>
-              <v:path gradientshapeok="t" o:connecttype="rect"/>
-            </v:shapetype>
-            <v:shape id="Textbox 3" o:spid="_x0000_s1026" type="#_x0000_t202" style="position:absolute;margin-left:0;margin-top:0;width:541.1pt;height:46.9pt;z-index:-251658240;visibility:visible;mso-wrap-style:square;mso-width-percent:0;mso-height-percent:0;mso-wrap-distance-left:0;mso-wrap-distance-top:0;mso-wrap-distance-right:0;mso-wrap-distance-bottom:0;mso-position-horizontal:left;mso-position-horizontal-relative:margin;mso-position-vertical:top;mso-position-vertical-relative:bottom-margin-area;mso-width-percent:0;mso-height-percent:0;mso-width-relative:margin;mso-height-relative:margin;v-text-anchor:top" o:gfxdata="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" filled="f" stroked="f">
-              <v:textbox inset="0,0,0,0">
-                <w:txbxContent>
-                  <w:p>
-                    <w:pPr>
-                      <w:pStyle w:val="Textoindependiente"/>
-                      <w:spacing w:before="360" w:after="240"/>
-                      <w:ind w:left="20"/>
-                      <w:jc w:val="center"/>
-                      <w:rPr>
-                        <w:b/>
-                        <w:bCs/>
-                      </w:rPr>
-                    </w:pPr>
-                    <w:r>
-                      <w:rPr>
-                        <w:b/>
-                        <w:bCs/>
-                        <w:spacing w:val="-2"/>
-                        <w14:textOutline w14:w="38100" w14:cap="rnd" w14:cmpd="sng" w14:algn="ctr">
-                          <w14:solidFill>
-                            <w14:schemeClr w14:val="accent6">
-                              <w14:lumMod w14:val="40000"/>
-                              <w14:lumOff w14:val="60000"/>
-                            </w14:schemeClr>
-                          </w14:solidFill>
-                          <w14:prstDash w14:val="solid"/>
-                          <w14:bevel/>
-                        </w14:textOutline>
-                      </w:rPr>
-                      <w:t>__________________________________________</w:t>
-                    </w:r>
-                    <w:r>
-                      <w:rPr>
-                        <w:b/>
-                        <w:bCs/>
-                        <w:spacing w:val="-2"/>
-                      </w:rPr>
-                      <w:br/>
-                    </w:r>
-                    <w:r>
-                      <w:rPr>
-                        <w:b/>
-                        <w:bCs/>
-                        <w:spacing w:val="-2"/>
-                      </w:rPr>
-                      <w:t>{</w:t>
-                    </w:r>
-                    <w:proofErr w:type="spellStart"/>
-                    <w:r>
-                      <w:rPr>
-                        <w:b/>
-                        <w:bCs/>
-                        <w:spacing w:val="-2"/>
-                      </w:rPr>
-                      <w:t>empleado_nombre_completo</w:t>
-                    </w:r>
-                    <w:proofErr w:type="spellEnd"/>
-                    <w:r>
-                      <w:rPr>
-                        <w:b/>
-                        <w:bCs/>
-                        <w:spacing w:val="-2"/>
-                      </w:rPr>
-                      <w:t>}</w:t>
-                    </w:r>
-                    <w:r>
-                      <w:rPr>
-                        <w:b/>
-                        <w:bCs/>
-                        <w:spacing w:val="-2"/>
-                      </w:rPr>
-                      <w:br/>
-                    </w:r>
-                  </w:p>
-                </w:txbxContent>
-              </v:textbox>
-              <w10:wrap anchorx="margin" anchory="margin"/>
-            </v:shape>
-          </w:pict>
-        </mc:Fallback>
       </mc:AlternateContent>
     </w:r>
   </w:p>

</xml_diff>

<commit_message>
fix(finiquitos): preservar mapeo base de placeholders y aplicar edición libre solo como override
</commit_message>
<xml_diff>
--- a/docx_templates/FINIQUITO FORMATO.docx
+++ b/docx_templates/FINIQUITO FORMATO.docx
@@ -10,31 +10,7 @@
         <w:jc w:val="right"/>
       </w:pPr>
       <w:r>
-        <w:t>{</w:t>
-      </w:r>
-      <w:proofErr w:type="spellStart"/>
-      <w:r>
-        <w:t>lugar_emision</w:t>
-      </w:r>
-      <w:proofErr w:type="spellEnd"/>
-      <w:r>
-        <w:t>}, {</w:t>
-      </w:r>
-      <w:proofErr w:type="spellStart"/>
-      <w:r>
-        <w:t>estado_emision</w:t>
-      </w:r>
-      <w:proofErr w:type="spellEnd"/>
-      <w:r>
-        <w:t>} a {</w:t>
-      </w:r>
-      <w:proofErr w:type="spellStart"/>
-      <w:r>
-        <w:t>fecha_emision_larga</w:t>
-      </w:r>
-      <w:proofErr w:type="spellEnd"/>
-      <w:r>
-        <w:t>}.</w:t>
+        <w:t>{lugar_emision}, {estado_emision} a {fecha_emision_larga}.</w:t>
       </w:r>
     </w:p>
     <w:p>
@@ -61,36 +37,10 @@
           <w:bCs/>
           <w:u w:val="single"/>
         </w:rPr>
-        <w:t>${</w:t>
-      </w:r>
-      <w:proofErr w:type="spellStart"/>
-      <w:r>
-        <w:rPr>
-          <w:b/>
-          <w:bCs/>
-          <w:u w:val="single"/>
-        </w:rPr>
-        <w:t>neto_p</w:t>
-      </w:r>
-      <w:proofErr w:type="spellEnd"/>
-      <w:r>
-        <w:rPr>
-          <w:b/>
-          <w:bCs/>
-          <w:u w:val="single"/>
-        </w:rPr>
-        <w:t>}</w:t>
+        <w:t>${neto_p}</w:t>
       </w:r>
       <w:r>
-        <w:t xml:space="preserve"> {</w:t>
-      </w:r>
-      <w:proofErr w:type="spellStart"/>
-      <w:r>
-        <w:t>neto_pagar_letra</w:t>
-      </w:r>
-      <w:proofErr w:type="spellEnd"/>
-      <w:r>
-        <w:t xml:space="preserve">} por concepto de finiquito, </w:t>
+        <w:t xml:space="preserve"> {neto_pagar_letra} por concepto de finiquito, </w:t>
       </w:r>
       <w:r>
         <w:t>l</w:t>
@@ -99,15 +49,7 @@
         <w:t xml:space="preserve">as partes acuerdan que dicha cantidad </w:t>
       </w:r>
       <w:r>
-        <w:t>será cubierta a más tardar el día {</w:t>
-      </w:r>
-      <w:proofErr w:type="spellStart"/>
-      <w:r>
-        <w:t>fecha_limite_pago</w:t>
-      </w:r>
-      <w:proofErr w:type="spellEnd"/>
-      <w:r>
-        <w:t>}</w:t>
+        <w:t>será cubierta a más tardar el día {fecha_limite_pago}</w:t>
       </w:r>
       <w:r>
         <w:t>, teniéndose por cumplida la obligación de pago</w:t>
@@ -128,15 +70,7 @@
         <w:t xml:space="preserve">del día </w:t>
       </w:r>
       <w:r>
-        <w:t>{</w:t>
-      </w:r>
-      <w:proofErr w:type="spellStart"/>
-      <w:r>
-        <w:t>fecha_letra</w:t>
-      </w:r>
-      <w:proofErr w:type="spellEnd"/>
-      <w:r>
-        <w:t>}, importe que resulta de los conceptos que se desglosan a continuación.</w:t>
+        <w:t>{fecha_letra}, importe que resulta de los conceptos que se desglosan a continuación.</w:t>
       </w:r>
     </w:p>
     <w:p>
@@ -454,7 +388,7 @@
                 <w:spacing w:val="-10"/>
                 <w:sz w:val="18"/>
               </w:rPr>
-              <w:t>1</w:t>
+              <w:t>{r1n}</w:t>
             </w:r>
           </w:p>
         </w:tc>
@@ -477,7 +411,7 @@
                 <w:spacing w:val="-2"/>
                 <w:sz w:val="18"/>
               </w:rPr>
-              <w:t>Sueldo</w:t>
+              <w:t>{r1c}</w:t>
             </w:r>
           </w:p>
         </w:tc>
@@ -569,23 +503,7 @@
                 <w:color w:val="808080"/>
                 <w:sz w:val="18"/>
               </w:rPr>
-              <w:t>{</w:t>
-            </w:r>
-            <w:proofErr w:type="spellStart"/>
-            <w:r>
-              <w:rPr>
-                <w:color w:val="808080"/>
-                <w:sz w:val="18"/>
-              </w:rPr>
-              <w:t>c_isa</w:t>
-            </w:r>
-            <w:proofErr w:type="spellEnd"/>
-            <w:r>
-              <w:rPr>
-                <w:color w:val="808080"/>
-                <w:sz w:val="18"/>
-              </w:rPr>
-              <w:t>}</w:t>
+              <w:t>{c_isa}</w:t>
             </w:r>
           </w:p>
         </w:tc>
@@ -642,7 +560,7 @@
                 <w:spacing w:val="-10"/>
                 <w:sz w:val="18"/>
               </w:rPr>
-              <w:t>3</w:t>
+              <w:t>{r2n}</w:t>
             </w:r>
           </w:p>
         </w:tc>
@@ -663,23 +581,7 @@
                 <w:color w:val="808080"/>
                 <w:sz w:val="18"/>
               </w:rPr>
-              <w:t>Séptimo</w:t>
-            </w:r>
-            <w:r>
-              <w:rPr>
-                <w:color w:val="808080"/>
-                <w:spacing w:val="-4"/>
-                <w:sz w:val="18"/>
-              </w:rPr>
-              <w:t xml:space="preserve"> </w:t>
-            </w:r>
-            <w:r>
-              <w:rPr>
-                <w:color w:val="808080"/>
-                <w:spacing w:val="-5"/>
-                <w:sz w:val="18"/>
-              </w:rPr>
-              <w:t>día</w:t>
+              <w:t>{r2c}</w:t>
             </w:r>
           </w:p>
         </w:tc>
@@ -824,7 +726,7 @@
                 <w:spacing w:val="-5"/>
                 <w:sz w:val="18"/>
               </w:rPr>
-              <w:t>19</w:t>
+              <w:t>{r3n}</w:t>
             </w:r>
           </w:p>
         </w:tc>
@@ -845,38 +747,7 @@
                 <w:color w:val="808080"/>
                 <w:sz w:val="18"/>
               </w:rPr>
-              <w:t>Vacaciones</w:t>
-            </w:r>
-            <w:r>
-              <w:rPr>
-                <w:color w:val="808080"/>
-                <w:spacing w:val="-4"/>
-                <w:sz w:val="18"/>
-              </w:rPr>
-              <w:t xml:space="preserve"> </w:t>
-            </w:r>
-            <w:r>
-              <w:rPr>
-                <w:color w:val="808080"/>
-                <w:sz w:val="18"/>
-              </w:rPr>
-              <w:t>a</w:t>
-            </w:r>
-            <w:r>
-              <w:rPr>
-                <w:color w:val="808080"/>
-                <w:spacing w:val="-1"/>
-                <w:sz w:val="18"/>
-              </w:rPr>
-              <w:t xml:space="preserve"> </w:t>
-            </w:r>
-            <w:r>
-              <w:rPr>
-                <w:color w:val="808080"/>
-                <w:spacing w:val="-2"/>
-                <w:sz w:val="18"/>
-              </w:rPr>
-              <w:t>tiempo</w:t>
+              <w:t>{r3c}</w:t>
             </w:r>
           </w:p>
         </w:tc>
@@ -965,23 +836,7 @@
                 <w:color w:val="808080"/>
                 <w:sz w:val="18"/>
               </w:rPr>
-              <w:t>{</w:t>
-            </w:r>
-            <w:proofErr w:type="spellStart"/>
-            <w:r>
-              <w:rPr>
-                <w:color w:val="808080"/>
-                <w:sz w:val="18"/>
-              </w:rPr>
-              <w:t>c_imes</w:t>
-            </w:r>
-            <w:proofErr w:type="spellEnd"/>
-            <w:r>
-              <w:rPr>
-                <w:color w:val="808080"/>
-                <w:sz w:val="18"/>
-              </w:rPr>
-              <w:t>}</w:t>
+              <w:t>{c_imes}</w:t>
             </w:r>
           </w:p>
         </w:tc>
@@ -1037,7 +892,7 @@
                 <w:spacing w:val="-5"/>
                 <w:sz w:val="18"/>
               </w:rPr>
-              <w:t>22</w:t>
+              <w:t>{r4n}</w:t>
             </w:r>
           </w:p>
         </w:tc>
@@ -1058,53 +913,7 @@
                 <w:color w:val="808080"/>
                 <w:sz w:val="18"/>
               </w:rPr>
-              <w:t>Prima</w:t>
-            </w:r>
-            <w:r>
-              <w:rPr>
-                <w:color w:val="808080"/>
-                <w:spacing w:val="16"/>
-                <w:sz w:val="18"/>
-              </w:rPr>
-              <w:t xml:space="preserve"> </w:t>
-            </w:r>
-            <w:r>
-              <w:rPr>
-                <w:color w:val="808080"/>
-                <w:sz w:val="18"/>
-              </w:rPr>
-              <w:t>de</w:t>
-            </w:r>
-            <w:r>
-              <w:rPr>
-                <w:color w:val="808080"/>
-                <w:spacing w:val="14"/>
-                <w:sz w:val="18"/>
-              </w:rPr>
-              <w:t xml:space="preserve"> </w:t>
-            </w:r>
-            <w:r>
-              <w:rPr>
-                <w:color w:val="808080"/>
-                <w:sz w:val="18"/>
-              </w:rPr>
-              <w:t>vacaciones</w:t>
-            </w:r>
-            <w:r>
-              <w:rPr>
-                <w:color w:val="808080"/>
-                <w:spacing w:val="2"/>
-                <w:sz w:val="18"/>
-              </w:rPr>
-              <w:t xml:space="preserve"> </w:t>
-            </w:r>
-            <w:r>
-              <w:rPr>
-                <w:color w:val="808080"/>
-                <w:spacing w:val="-5"/>
-                <w:sz w:val="18"/>
-              </w:rPr>
-              <w:t>reportadas $</w:t>
+              <w:t>{r4c}</w:t>
             </w:r>
           </w:p>
         </w:tc>
@@ -1156,26 +965,16 @@
                 <w:spacing w:val="-5"/>
                 <w:sz w:val="18"/>
               </w:rPr>
-              <w:t>{</w:t>
-            </w:r>
-            <w:proofErr w:type="spellStart"/>
+              <w:t>{n</w:t>
+            </w:r>
             <w:r>
               <w:rPr>
                 <w:color w:val="808080"/>
                 <w:spacing w:val="-5"/>
                 <w:sz w:val="18"/>
               </w:rPr>
-              <w:t>n</w:t>
-            </w:r>
-            <w:r>
-              <w:rPr>
-                <w:color w:val="808080"/>
-                <w:spacing w:val="-5"/>
-                <w:sz w:val="18"/>
-              </w:rPr>
               <w:t>d</w:t>
             </w:r>
-            <w:proofErr w:type="spellEnd"/>
             <w:r>
               <w:rPr>
                 <w:color w:val="808080"/>
@@ -1274,7 +1073,7 @@
                 <w:spacing w:val="-5"/>
                 <w:sz w:val="18"/>
               </w:rPr>
-              <w:t>24</w:t>
+              <w:t>{r5n}</w:t>
             </w:r>
           </w:p>
         </w:tc>
@@ -1297,7 +1096,7 @@
                 <w:spacing w:val="-2"/>
                 <w:sz w:val="18"/>
               </w:rPr>
-              <w:t>Aguinaldo</w:t>
+              <w:t>{r5c}</w:t>
             </w:r>
           </w:p>
         </w:tc>
@@ -1341,11 +1140,43 @@
               <w:pStyle w:val="TableParagraph"/>
               <w:spacing w:before="20"/>
               <w:ind w:right="77"/>
-              <w:jc w:val="right"/>
-              <w:rPr>
-                <w:sz w:val="18"/>
-              </w:rPr>
-            </w:pPr>
+              <w:jc w:val="center"/>
+              <w:rPr>
+                <w:sz w:val="18"/>
+              </w:rPr>
+            </w:pPr>
+            <w:r>
+              <w:rPr>
+                <w:color w:val="808080"/>
+                <w:spacing w:val="-5"/>
+                <w:sz w:val="18"/>
+              </w:rPr>
+              <w:t xml:space="preserve">   </w:t>
+            </w:r>
+            <w:r>
+              <w:rPr>
+                <w:color w:val="808080"/>
+                <w:spacing w:val="-5"/>
+                <w:sz w:val="18"/>
+              </w:rPr>
+              <w:t>{</w:t>
+            </w:r>
+            <w:r>
+              <w:rPr>
+                <w:color w:val="808080"/>
+                <w:spacing w:val="-5"/>
+                <w:sz w:val="18"/>
+              </w:rPr>
+              <w:t>d1</w:t>
+            </w:r>
+            <w:r>
+              <w:rPr>
+                <w:color w:val="808080"/>
+                <w:spacing w:val="-5"/>
+                <w:sz w:val="18"/>
+              </w:rPr>
+              <w:t>}</w:t>
+            </w:r>
           </w:p>
         </w:tc>
         <w:tc>
@@ -1364,6 +1195,27 @@
                 <w:sz w:val="18"/>
               </w:rPr>
             </w:pPr>
+            <w:r>
+              <w:rPr>
+                <w:color w:val="808080"/>
+                <w:sz w:val="18"/>
+              </w:rPr>
+              <w:t>{</w:t>
+            </w:r>
+            <w:r>
+              <w:rPr>
+                <w:color w:val="808080"/>
+                <w:sz w:val="18"/>
+              </w:rPr>
+              <w:t>d_nuevo</w:t>
+            </w:r>
+            <w:r>
+              <w:rPr>
+                <w:color w:val="808080"/>
+                <w:sz w:val="18"/>
+              </w:rPr>
+              <w:t>}</w:t>
+            </w:r>
           </w:p>
         </w:tc>
         <w:tc>
@@ -1384,6 +1236,30 @@
                 <w:sz w:val="18"/>
               </w:rPr>
             </w:pPr>
+            <w:r>
+              <w:rPr>
+                <w:color w:val="808080"/>
+                <w:spacing w:val="-4"/>
+                <w:sz w:val="18"/>
+              </w:rPr>
+              <w:t>{</w:t>
+            </w:r>
+            <w:r>
+              <w:rPr>
+                <w:color w:val="808080"/>
+                <w:spacing w:val="-4"/>
+                <w:sz w:val="18"/>
+              </w:rPr>
+              <w:t>t13</w:t>
+            </w:r>
+            <w:r>
+              <w:rPr>
+                <w:color w:val="808080"/>
+                <w:spacing w:val="-4"/>
+                <w:sz w:val="18"/>
+              </w:rPr>
+              <w:t>}</w:t>
+            </w:r>
           </w:p>
         </w:tc>
       </w:tr>
@@ -1435,23 +1311,7 @@
                 <w:color w:val="808080"/>
                 <w:sz w:val="18"/>
               </w:rPr>
-              <w:t>{</w:t>
-            </w:r>
-            <w:proofErr w:type="spellStart"/>
-            <w:r>
-              <w:rPr>
-                <w:color w:val="808080"/>
-                <w:sz w:val="18"/>
-              </w:rPr>
-              <w:t>c_pant</w:t>
-            </w:r>
-            <w:proofErr w:type="spellEnd"/>
-            <w:r>
-              <w:rPr>
-                <w:color w:val="808080"/>
-                <w:sz w:val="18"/>
-              </w:rPr>
-              <w:t>}</w:t>
+              <w:t>{c_pant}</w:t>
             </w:r>
           </w:p>
         </w:tc>
@@ -1495,11 +1355,43 @@
               <w:pStyle w:val="TableParagraph"/>
               <w:spacing w:before="18"/>
               <w:ind w:right="77"/>
-              <w:jc w:val="right"/>
-              <w:rPr>
-                <w:sz w:val="18"/>
-              </w:rPr>
-            </w:pPr>
+              <w:jc w:val="center"/>
+              <w:rPr>
+                <w:sz w:val="18"/>
+              </w:rPr>
+            </w:pPr>
+            <w:r>
+              <w:rPr>
+                <w:color w:val="808080"/>
+                <w:spacing w:val="-5"/>
+                <w:sz w:val="18"/>
+              </w:rPr>
+              <w:t xml:space="preserve">   </w:t>
+            </w:r>
+            <w:r>
+              <w:rPr>
+                <w:color w:val="808080"/>
+                <w:spacing w:val="-5"/>
+                <w:sz w:val="18"/>
+              </w:rPr>
+              <w:t>{</w:t>
+            </w:r>
+            <w:r>
+              <w:rPr>
+                <w:color w:val="808080"/>
+                <w:spacing w:val="-5"/>
+                <w:sz w:val="18"/>
+              </w:rPr>
+              <w:t>d2</w:t>
+            </w:r>
+            <w:r>
+              <w:rPr>
+                <w:color w:val="808080"/>
+                <w:spacing w:val="-5"/>
+                <w:sz w:val="18"/>
+              </w:rPr>
+              <w:t>}</w:t>
+            </w:r>
           </w:p>
         </w:tc>
         <w:tc>
@@ -1518,6 +1410,27 @@
                 <w:sz w:val="18"/>
               </w:rPr>
             </w:pPr>
+            <w:r>
+              <w:rPr>
+                <w:color w:val="808080"/>
+                <w:sz w:val="18"/>
+              </w:rPr>
+              <w:t>{</w:t>
+            </w:r>
+            <w:r>
+              <w:rPr>
+                <w:color w:val="808080"/>
+                <w:sz w:val="18"/>
+              </w:rPr>
+              <w:t>d_nuevo2</w:t>
+            </w:r>
+            <w:r>
+              <w:rPr>
+                <w:color w:val="808080"/>
+                <w:sz w:val="18"/>
+              </w:rPr>
+              <w:t>}</w:t>
+            </w:r>
           </w:p>
         </w:tc>
         <w:tc>
@@ -1538,6 +1451,30 @@
                 <w:sz w:val="18"/>
               </w:rPr>
             </w:pPr>
+            <w:r>
+              <w:rPr>
+                <w:color w:val="808080"/>
+                <w:spacing w:val="-4"/>
+                <w:sz w:val="18"/>
+              </w:rPr>
+              <w:t>{</w:t>
+            </w:r>
+            <w:r>
+              <w:rPr>
+                <w:color w:val="808080"/>
+                <w:spacing w:val="-4"/>
+                <w:sz w:val="18"/>
+              </w:rPr>
+              <w:t>t14</w:t>
+            </w:r>
+            <w:r>
+              <w:rPr>
+                <w:color w:val="808080"/>
+                <w:spacing w:val="-4"/>
+                <w:sz w:val="18"/>
+              </w:rPr>
+              <w:t>}</w:t>
+            </w:r>
           </w:p>
         </w:tc>
       </w:tr>
@@ -1567,25 +1504,7 @@
                 <w:spacing w:val="-5"/>
                 <w:sz w:val="18"/>
               </w:rPr>
-              <w:t>{</w:t>
-            </w:r>
-            <w:proofErr w:type="spellStart"/>
-            <w:r>
-              <w:rPr>
-                <w:color w:val="808080"/>
-                <w:spacing w:val="-5"/>
-                <w:sz w:val="18"/>
-              </w:rPr>
-              <w:t>np</w:t>
-            </w:r>
-            <w:proofErr w:type="spellEnd"/>
-            <w:r>
-              <w:rPr>
-                <w:color w:val="808080"/>
-                <w:spacing w:val="-5"/>
-                <w:sz w:val="18"/>
-              </w:rPr>
-              <w:t>}</w:t>
+              <w:t>{np}</w:t>
             </w:r>
           </w:p>
         </w:tc>
@@ -1609,23 +1528,7 @@
                 <w:color w:val="808080"/>
                 <w:sz w:val="18"/>
               </w:rPr>
-              <w:t>{</w:t>
-            </w:r>
-            <w:proofErr w:type="spellStart"/>
-            <w:r>
-              <w:rPr>
-                <w:color w:val="808080"/>
-                <w:sz w:val="18"/>
-              </w:rPr>
-              <w:t>cp</w:t>
-            </w:r>
-            <w:proofErr w:type="spellEnd"/>
-            <w:r>
-              <w:rPr>
-                <w:color w:val="808080"/>
-                <w:sz w:val="18"/>
-              </w:rPr>
-              <w:t>}</w:t>
+              <w:t>{cp}</w:t>
             </w:r>
           </w:p>
         </w:tc>
@@ -1709,7 +1612,7 @@
       </w:tr>
       <w:tr>
         <w:trPr>
-          <w:trHeight w:val="2080" w:hRule="atLeast"/>
+          <w:trHeight w:val="2986"/>
         </w:trPr>
         <w:tc>
           <w:tcPr>
@@ -1728,6 +1631,30 @@
                 <w:sz w:val="18"/>
               </w:rPr>
             </w:pPr>
+            <w:r>
+              <w:rPr>
+                <w:color w:val="808080"/>
+                <w:spacing w:val="-5"/>
+                <w:sz w:val="18"/>
+              </w:rPr>
+              <w:t>{</w:t>
+            </w:r>
+            <w:r>
+              <w:rPr>
+                <w:color w:val="808080"/>
+                <w:spacing w:val="-5"/>
+                <w:sz w:val="18"/>
+              </w:rPr>
+              <w:t>p1</w:t>
+            </w:r>
+            <w:r>
+              <w:rPr>
+                <w:color w:val="808080"/>
+                <w:spacing w:val="-5"/>
+                <w:sz w:val="18"/>
+              </w:rPr>
+              <w:t>}</w:t>
+            </w:r>
           </w:p>
         </w:tc>
         <w:tc>
@@ -1746,6 +1673,27 @@
                 <w:sz w:val="18"/>
               </w:rPr>
             </w:pPr>
+            <w:r>
+              <w:rPr>
+                <w:color w:val="808080"/>
+                <w:sz w:val="18"/>
+              </w:rPr>
+              <w:t>{p</w:t>
+            </w:r>
+            <w:r>
+              <w:rPr>
+                <w:color w:val="808080"/>
+                <w:sz w:val="18"/>
+              </w:rPr>
+              <w:t>_nuevo</w:t>
+            </w:r>
+            <w:r>
+              <w:rPr>
+                <w:color w:val="808080"/>
+                <w:sz w:val="18"/>
+              </w:rPr>
+              <w:t>}</w:t>
+            </w:r>
           </w:p>
         </w:tc>
         <w:tc>
@@ -1766,6 +1714,30 @@
                 <w:sz w:val="18"/>
               </w:rPr>
             </w:pPr>
+            <w:r>
+              <w:rPr>
+                <w:color w:val="808080"/>
+                <w:spacing w:val="-4"/>
+                <w:sz w:val="18"/>
+              </w:rPr>
+              <w:t>{t</w:t>
+            </w:r>
+            <w:r>
+              <w:rPr>
+                <w:color w:val="808080"/>
+                <w:spacing w:val="-4"/>
+                <w:sz w:val="18"/>
+              </w:rPr>
+              <w:t>12</w:t>
+            </w:r>
+            <w:r>
+              <w:rPr>
+                <w:color w:val="808080"/>
+                <w:spacing w:val="-4"/>
+                <w:sz w:val="18"/>
+              </w:rPr>
+              <w:t>}</w:t>
+            </w:r>
           </w:p>
         </w:tc>
         <w:tc>
@@ -1959,29 +1931,7 @@
                 <w:position w:val="3"/>
                 <w:sz w:val="18"/>
               </w:rPr>
-              <w:t>{</w:t>
-            </w:r>
-            <w:proofErr w:type="spellStart"/>
-            <w:r>
-              <w:rPr>
-                <w:rFonts w:ascii="Arial"/>
-                <w:b/>
-                <w:spacing w:val="-2"/>
-                <w:position w:val="3"/>
-                <w:sz w:val="18"/>
-              </w:rPr>
-              <w:t>suma_p</w:t>
-            </w:r>
-            <w:proofErr w:type="spellEnd"/>
-            <w:r>
-              <w:rPr>
-                <w:rFonts w:ascii="Arial"/>
-                <w:b/>
-                <w:spacing w:val="-2"/>
-                <w:position w:val="3"/>
-                <w:sz w:val="18"/>
-              </w:rPr>
-              <w:t>}</w:t>
+              <w:t>{suma_p}</w:t>
             </w:r>
           </w:p>
         </w:tc>
@@ -2086,29 +2036,7 @@
                 <w:position w:val="2"/>
                 <w:sz w:val="18"/>
               </w:rPr>
-              <w:t>{</w:t>
-            </w:r>
-            <w:proofErr w:type="spellStart"/>
-            <w:r>
-              <w:rPr>
-                <w:rFonts w:ascii="Arial"/>
-                <w:b/>
-                <w:spacing w:val="-2"/>
-                <w:position w:val="2"/>
-                <w:sz w:val="18"/>
-              </w:rPr>
-              <w:t>suma_d</w:t>
-            </w:r>
-            <w:proofErr w:type="spellEnd"/>
-            <w:r>
-              <w:rPr>
-                <w:rFonts w:ascii="Arial"/>
-                <w:b/>
-                <w:spacing w:val="-2"/>
-                <w:position w:val="2"/>
-                <w:sz w:val="18"/>
-              </w:rPr>
-              <w:t>}</w:t>
+              <w:t>{suma_d}</w:t>
             </w:r>
           </w:p>
         </w:tc>
@@ -2185,9 +2113,8 @@
                 <w:b/>
                 <w:sz w:val="20"/>
               </w:rPr>
-              <w:t xml:space="preserve">                    </w:t>
-            </w:r>
-            <w:proofErr w:type="gramStart"/>
+              <w:t xml:space="preserve">                  </w:t>
+            </w:r>
             <w:r>
               <w:rPr>
                 <w:rFonts w:ascii="Arial"/>
@@ -2230,7 +2157,6 @@
               </w:rPr>
               <w:t>Pagar</w:t>
             </w:r>
-            <w:proofErr w:type="gramEnd"/>
             <w:r>
               <w:rPr>
                 <w:rFonts w:ascii="Arial"/>
@@ -2255,16 +2181,7 @@
                 <w:b/>
                 <w:sz w:val="20"/>
               </w:rPr>
-              <w:t xml:space="preserve">                      </w:t>
-            </w:r>
-            <w:proofErr w:type="gramStart"/>
-            <w:r>
-              <w:rPr>
-                <w:rFonts w:ascii="Arial"/>
-                <w:b/>
-                <w:sz w:val="20"/>
-              </w:rPr>
-              <w:t xml:space="preserve">   </w:t>
+              <w:t xml:space="preserve">                         </w:t>
             </w:r>
             <w:r>
               <w:rPr>
@@ -2274,35 +2191,20 @@
                 <w:position w:val="2"/>
                 <w:sz w:val="18"/>
               </w:rPr>
-              <w:t>{</w:t>
-            </w:r>
-            <w:proofErr w:type="spellStart"/>
-            <w:proofErr w:type="gramEnd"/>
-            <w:r>
-              <w:rPr>
-                <w:rFonts w:ascii="Arial"/>
-                <w:b/>
-                <w:spacing w:val="-2"/>
-                <w:position w:val="2"/>
-                <w:sz w:val="18"/>
-              </w:rPr>
-              <w:t>neto_p</w:t>
-            </w:r>
-            <w:proofErr w:type="spellEnd"/>
-            <w:r>
-              <w:rPr>
-                <w:rFonts w:ascii="Arial"/>
-                <w:b/>
-                <w:spacing w:val="-2"/>
-                <w:position w:val="2"/>
-                <w:sz w:val="18"/>
-              </w:rPr>
-              <w:t>}</w:t>
+              <w:t>{neto_p}</w:t>
             </w:r>
           </w:p>
         </w:tc>
       </w:tr>
     </w:tbl>
+    <w:p>
+      <w:pPr>
+        <w:pStyle w:val="Textoindependiente"/>
+        <w:spacing w:before="180"/>
+        <w:ind w:left="170" w:right="340"/>
+        <w:jc w:val="both"/>
+      </w:pPr>
+    </w:p>
     <w:p>
       <w:pPr>
         <w:pStyle w:val="Textoindependiente"/>
@@ -2470,25 +2372,7 @@
                               <w:bCs/>
                               <w:spacing w:val="-2"/>
                             </w:rPr>
-                            <w:t>{</w:t>
-                          </w:r>
-                          <w:proofErr w:type="spellStart"/>
-                          <w:r>
-                            <w:rPr>
-                              <w:b/>
-                              <w:bCs/>
-                              <w:spacing w:val="-2"/>
-                            </w:rPr>
-                            <w:t>empleado_nombre_completo</w:t>
-                          </w:r>
-                          <w:proofErr w:type="spellEnd"/>
-                          <w:r>
-                            <w:rPr>
-                              <w:b/>
-                              <w:bCs/>
-                              <w:spacing w:val="-2"/>
-                            </w:rPr>
-                            <w:t>}</w:t>
+                            <w:t>{empleado_nombre_completo}</w:t>
                           </w:r>
                           <w:r>
                             <w:rPr>
@@ -2516,6 +2400,75 @@
             </wp:anchor>
           </w:drawing>
         </mc:Choice>
+        <mc:Fallback>
+          <w:pict>
+            <v:shapetype w14:anchorId="03A76DAF" id="_x0000_t202" coordsize="21600,21600" o:spt="202" path="m,l,21600r21600,l21600,xe">
+              <v:stroke joinstyle="miter"/>
+              <v:path gradientshapeok="t" o:connecttype="rect"/>
+            </v:shapetype>
+            <v:shape id="Textbox 3" o:spid="_x0000_s1026" type="#_x0000_t202" style="position:absolute;margin-left:0;margin-top:0;width:541.1pt;height:46.9pt;z-index:251658240;visibility:visible;mso-wrap-style:square;mso-width-percent:0;mso-height-percent:0;mso-wrap-distance-left:0;mso-wrap-distance-top:0;mso-wrap-distance-right:0;mso-wrap-distance-bottom:0;mso-position-horizontal:left;mso-position-horizontal-relative:margin;mso-position-vertical:top;mso-position-vertical-relative:bottom-margin-area;mso-width-percent:0;mso-height-percent:0;mso-width-relative:margin;mso-height-relative:margin;v-text-anchor:top" o:gfxdata="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" filled="f" stroked="f">
+              <v:textbox inset="0,0,0,0">
+                <w:txbxContent>
+                  <w:p>
+                    <w:pPr>
+                      <w:pStyle w:val="Textoindependiente"/>
+                      <w:spacing w:before="360" w:after="240"/>
+                      <w:ind w:left="20"/>
+                      <w:jc w:val="center"/>
+                      <w:rPr>
+                        <w:b/>
+                        <w:bCs/>
+                      </w:rPr>
+                    </w:pPr>
+                    <w:r>
+                      <w:rPr>
+                        <w:b/>
+                        <w:bCs/>
+                        <w:spacing w:val="-2"/>
+                        <w14:textOutline w14:w="38100" w14:cap="rnd" w14:cmpd="sng" w14:algn="ctr">
+                          <w14:solidFill>
+                            <w14:schemeClr w14:val="accent6">
+                              <w14:lumMod w14:val="40000"/>
+                              <w14:lumOff w14:val="60000"/>
+                            </w14:schemeClr>
+                          </w14:solidFill>
+                          <w14:prstDash w14:val="solid"/>
+                          <w14:bevel/>
+                        </w14:textOutline>
+                      </w:rPr>
+                      <w:t>__________________________________________</w:t>
+                    </w:r>
+                    <w:r>
+                      <w:rPr>
+                        <w:b/>
+                        <w:bCs/>
+                        <w:spacing w:val="-2"/>
+                      </w:rPr>
+                      <w:br/>
+                    </w:r>
+                    <w:r>
+                      <w:rPr>
+                        <w:b/>
+                        <w:bCs/>
+                        <w:spacing w:val="-2"/>
+                      </w:rPr>
+                      <w:t>{empleado_nombre_completo}</w:t>
+                    </w:r>
+                    <w:r>
+                      <w:rPr>
+                        <w:b/>
+                        <w:bCs/>
+                        <w:spacing w:val="-2"/>
+                      </w:rPr>
+                      <w:br/>
+                    </w:r>
+                  </w:p>
+                </w:txbxContent>
+              </v:textbox>
+              <w10:wrap anchorx="margin" anchory="margin"/>
+            </v:shape>
+          </w:pict>
+        </mc:Fallback>
       </mc:AlternateContent>
     </w:r>
   </w:p>
@@ -3102,7 +3055,6 @@
   <w:style w:type="character" w:default="1" w:styleId="Fuentedeprrafopredeter">
     <w:name w:val="Default Paragraph Font"/>
     <w:uiPriority w:val="1"/>
-    <w:semiHidden/>
     <w:unhideWhenUsed/>
   </w:style>
   <w:style w:type="table" w:default="1" w:styleId="Tablanormal">

</xml_diff>

<commit_message>
feat(carrier): add Cursos module with monthly IMSS docs workflow and alta linkage
</commit_message>
<xml_diff>
--- a/docx_templates/FINIQUITO FORMATO.docx
+++ b/docx_templates/FINIQUITO FORMATO.docx
@@ -1612,7 +1612,7 @@
       </w:tr>
       <w:tr>
         <w:trPr>
-          <w:trHeight w:val="2986"/>
+          <w:trHeight w:val="2080" w:hRule="atLeast"/>
         </w:trPr>
         <w:tc>
           <w:tcPr>
@@ -2400,75 +2400,6 @@
             </wp:anchor>
           </w:drawing>
         </mc:Choice>
-        <mc:Fallback>
-          <w:pict>
-            <v:shapetype w14:anchorId="03A76DAF" id="_x0000_t202" coordsize="21600,21600" o:spt="202" path="m,l,21600r21600,l21600,xe">
-              <v:stroke joinstyle="miter"/>
-              <v:path gradientshapeok="t" o:connecttype="rect"/>
-            </v:shapetype>
-            <v:shape id="Textbox 3" o:spid="_x0000_s1026" type="#_x0000_t202" style="position:absolute;margin-left:0;margin-top:0;width:541.1pt;height:46.9pt;z-index:251658240;visibility:visible;mso-wrap-style:square;mso-width-percent:0;mso-height-percent:0;mso-wrap-distance-left:0;mso-wrap-distance-top:0;mso-wrap-distance-right:0;mso-wrap-distance-bottom:0;mso-position-horizontal:left;mso-position-horizontal-relative:margin;mso-position-vertical:top;mso-position-vertical-relative:bottom-margin-area;mso-width-percent:0;mso-height-percent:0;mso-width-relative:margin;mso-height-relative:margin;v-text-anchor:top" o:gfxdata="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" filled="f" stroked="f">
-              <v:textbox inset="0,0,0,0">
-                <w:txbxContent>
-                  <w:p>
-                    <w:pPr>
-                      <w:pStyle w:val="Textoindependiente"/>
-                      <w:spacing w:before="360" w:after="240"/>
-                      <w:ind w:left="20"/>
-                      <w:jc w:val="center"/>
-                      <w:rPr>
-                        <w:b/>
-                        <w:bCs/>
-                      </w:rPr>
-                    </w:pPr>
-                    <w:r>
-                      <w:rPr>
-                        <w:b/>
-                        <w:bCs/>
-                        <w:spacing w:val="-2"/>
-                        <w14:textOutline w14:w="38100" w14:cap="rnd" w14:cmpd="sng" w14:algn="ctr">
-                          <w14:solidFill>
-                            <w14:schemeClr w14:val="accent6">
-                              <w14:lumMod w14:val="40000"/>
-                              <w14:lumOff w14:val="60000"/>
-                            </w14:schemeClr>
-                          </w14:solidFill>
-                          <w14:prstDash w14:val="solid"/>
-                          <w14:bevel/>
-                        </w14:textOutline>
-                      </w:rPr>
-                      <w:t>__________________________________________</w:t>
-                    </w:r>
-                    <w:r>
-                      <w:rPr>
-                        <w:b/>
-                        <w:bCs/>
-                        <w:spacing w:val="-2"/>
-                      </w:rPr>
-                      <w:br/>
-                    </w:r>
-                    <w:r>
-                      <w:rPr>
-                        <w:b/>
-                        <w:bCs/>
-                        <w:spacing w:val="-2"/>
-                      </w:rPr>
-                      <w:t>{empleado_nombre_completo}</w:t>
-                    </w:r>
-                    <w:r>
-                      <w:rPr>
-                        <w:b/>
-                        <w:bCs/>
-                        <w:spacing w:val="-2"/>
-                      </w:rPr>
-                      <w:br/>
-                    </w:r>
-                  </w:p>
-                </w:txbxContent>
-              </v:textbox>
-              <w10:wrap anchorx="margin" anchory="margin"/>
-            </v:shape>
-          </w:pict>
-        </mc:Fallback>
       </mc:AlternateContent>
     </w:r>
   </w:p>

</xml_diff>